<commit_message>
Add editor playtesting with pause and resume and explicit failure item costs
</commit_message>
<xml_diff>
--- a/docs/Maze-Craze-Map-Editor-User-Guide.docx
+++ b/docs/Maze-Craze-Map-Editor-User-Guide.docx
@@ -114,7 +114,7 @@
         <w:pStyle w:val="GuideSmall"/>
       </w:pPr>
       <w:r>
-        <w:t>First editor edition • October 2026</w:t>
+        <w:t>Playtesting edition • October 2026</w:t>
       </w:r>
     </w:p>
     <w:p>
@@ -122,7 +122,7 @@
         <w:pStyle w:val="GuideSmall"/>
       </w:pPr>
       <w:r>
-        <w:t>Reference build: d6eefcc • The editor works offline; the game uses HTTP(S).</w:t>
+        <w:t>Offline editing and export • Integrated playtests use the same HTTP(S) game website.</w:t>
       </w:r>
     </w:p>
     <w:p>
@@ -247,7 +247,7 @@
             <w:rFonts w:ascii="Calibri" w:hAnsi="Calibri"/>
             <w:sz w:val="22"/>
           </w:rPr>
-          <w:t>10</w:t>
+          <w:t>11</w:t>
         </w:r>
       </w:fldSimple>
     </w:p>
@@ -273,7 +273,7 @@
             <w:rFonts w:ascii="Calibri" w:hAnsi="Calibri"/>
             <w:sz w:val="22"/>
           </w:rPr>
-          <w:t>12</w:t>
+          <w:t>13</w:t>
         </w:r>
       </w:fldSimple>
     </w:p>
@@ -299,7 +299,7 @@
             <w:rFonts w:ascii="Calibri" w:hAnsi="Calibri"/>
             <w:sz w:val="22"/>
           </w:rPr>
-          <w:t>16</w:t>
+          <w:t>17</w:t>
         </w:r>
       </w:fldSimple>
     </w:p>
@@ -325,7 +325,7 @@
             <w:rFonts w:ascii="Calibri" w:hAnsi="Calibri"/>
             <w:sz w:val="22"/>
           </w:rPr>
-          <w:t>19</w:t>
+          <w:t>20</w:t>
         </w:r>
       </w:fldSimple>
     </w:p>
@@ -351,7 +351,7 @@
             <w:rFonts w:ascii="Calibri" w:hAnsi="Calibri"/>
             <w:sz w:val="22"/>
           </w:rPr>
-          <w:t>23</w:t>
+          <w:t>24</w:t>
         </w:r>
       </w:fldSimple>
     </w:p>
@@ -377,7 +377,7 @@
             <w:rFonts w:ascii="Calibri" w:hAnsi="Calibri"/>
             <w:sz w:val="22"/>
           </w:rPr>
-          <w:t>25</w:t>
+          <w:t>26</w:t>
         </w:r>
       </w:fldSimple>
     </w:p>
@@ -403,7 +403,7 @@
             <w:rFonts w:ascii="Calibri" w:hAnsi="Calibri"/>
             <w:sz w:val="22"/>
           </w:rPr>
-          <w:t>29</w:t>
+          <w:t>30</w:t>
         </w:r>
       </w:fldSimple>
     </w:p>
@@ -429,7 +429,7 @@
             <w:rFonts w:ascii="Calibri" w:hAnsi="Calibri"/>
             <w:sz w:val="22"/>
           </w:rPr>
-          <w:t>33</w:t>
+          <w:t>36</w:t>
         </w:r>
       </w:fldSimple>
     </w:p>
@@ -455,7 +455,7 @@
             <w:rFonts w:ascii="Calibri" w:hAnsi="Calibri"/>
             <w:sz w:val="22"/>
           </w:rPr>
-          <w:t>35</w:t>
+          <w:t>38</w:t>
         </w:r>
       </w:fldSimple>
     </w:p>
@@ -481,7 +481,7 @@
             <w:rFonts w:ascii="Calibri" w:hAnsi="Calibri"/>
             <w:sz w:val="22"/>
           </w:rPr>
-          <w:t>39</w:t>
+          <w:t>42</w:t>
         </w:r>
       </w:fldSimple>
     </w:p>
@@ -507,7 +507,7 @@
             <w:rFonts w:ascii="Calibri" w:hAnsi="Calibri"/>
             <w:sz w:val="22"/>
           </w:rPr>
-          <w:t>41</w:t>
+          <w:t>44</w:t>
         </w:r>
       </w:fldSimple>
     </w:p>
@@ -533,7 +533,7 @@
             <w:rFonts w:ascii="Calibri" w:hAnsi="Calibri"/>
             <w:sz w:val="22"/>
           </w:rPr>
-          <w:t>43</w:t>
+          <w:t>46</w:t>
         </w:r>
       </w:fldSimple>
     </w:p>
@@ -559,7 +559,7 @@
             <w:rFonts w:ascii="Calibri" w:hAnsi="Calibri"/>
             <w:sz w:val="22"/>
           </w:rPr>
-          <w:t>45</w:t>
+          <w:t>48</w:t>
         </w:r>
       </w:fldSimple>
     </w:p>
@@ -585,7 +585,7 @@
             <w:rFonts w:ascii="Calibri" w:hAnsi="Calibri"/>
             <w:sz w:val="22"/>
           </w:rPr>
-          <w:t>48</w:t>
+          <w:t>51</w:t>
         </w:r>
       </w:fldSimple>
     </w:p>
@@ -611,7 +611,7 @@
             <w:rFonts w:ascii="Calibri" w:hAnsi="Calibri"/>
             <w:sz w:val="22"/>
           </w:rPr>
-          <w:t>51</w:t>
+          <w:t>57</w:t>
         </w:r>
       </w:fldSimple>
     </w:p>
@@ -721,7 +721,7 @@
     </w:p>
     <w:p>
       <w:r>
-        <w:t>The editor does not run a full game simulation. A map can be written correctly but still have an impossible puzzle. You must play the exported map to find design problems, such as putting a key behind the door that needs it.</w:t>
+        <w:t>When editor.html is on the same HTTP(S) website as the full game, Test from Start runs the existing game right inside the editor. No export is needed for that test. Offline editing still works; offline playtesting does not. A map can be written correctly but still have an impossible puzzle, such as a key behind the door that needs it. Chapter 17 explains how to test, pause, edit, resume, and restart.</w:t>
       </w:r>
     </w:p>
     <w:p>
@@ -729,7 +729,7 @@
         <w:pStyle w:val="Heading2"/>
       </w:pPr>
       <w:r>
-        <w:t>The most important habit: apply, export, then test</w:t>
+        <w:t>The most important habit: apply, back up, and test</w:t>
       </w:r>
     </w:p>
     <w:p>
@@ -2727,7 +2727,7 @@
       <w:r>
         <w:drawing>
           <wp:inline xmlns:a="http://schemas.openxmlformats.org/drawingml/2006/main" xmlns:pic="http://schemas.openxmlformats.org/drawingml/2006/picture">
-            <wp:extent cx="6080760" cy="4003167"/>
+            <wp:extent cx="4852835" cy="5486400"/>
             <wp:docPr id="2" name="Picture 2" descr="The block library and editable map"/>
             <wp:cNvGraphicFramePr>
               <a:graphicFrameLocks noChangeAspect="1"/>
@@ -2748,7 +2748,7 @@
                   <pic:spPr>
                     <a:xfrm>
                       <a:off x="0" y="0"/>
-                      <a:ext cx="6080760" cy="4003167"/>
+                      <a:ext cx="4852835" cy="5486400"/>
                     </a:xfrm>
                     <a:prstGeom prst="rect"/>
                   </pic:spPr>
@@ -2904,7 +2904,7 @@
       <w:r>
         <w:drawing>
           <wp:inline xmlns:a="http://schemas.openxmlformats.org/drawingml/2006/main" xmlns:pic="http://schemas.openxmlformats.org/drawingml/2006/picture">
-            <wp:extent cx="6080760" cy="650304"/>
+            <wp:extent cx="6080760" cy="678578"/>
             <wp:docPr id="3" name="Picture 3" descr="New, open, and export buttons"/>
             <wp:cNvGraphicFramePr>
               <a:graphicFrameLocks noChangeAspect="1"/>
@@ -2925,7 +2925,7 @@
                   <pic:spPr>
                     <a:xfrm>
                       <a:off x="0" y="0"/>
-                      <a:ext cx="6080760" cy="650304"/>
+                      <a:ext cx="6080760" cy="678578"/>
                     </a:xfrm>
                     <a:prstGeom prst="rect"/>
                   </pic:spPr>
@@ -4300,6 +4300,11 @@
     </w:p>
     <w:p>
       <w:r>
+        <w:t>If editor.html and the full game are on the same HTTP(S) website, you can preview this new map immediately with Test from Start, even before adding Map.3 to the master directory. See Chapter 17 for pause/resume. Export and connect the map when you are ready to publish it.</w:t>
+      </w:r>
+    </w:p>
+    <w:p>
+      <w:r>
         <w:t xml:space="preserve">Read Map checks and fix errors. Export downloads </w:t>
       </w:r>
       <w:r>
@@ -4378,7 +4383,7 @@
     </w:p>
     <w:p>
       <w:r>
-        <w:t>If you need a wrong-item test, add a regular bomb item with a different NID and choose it at the door. A FAIL must preserve that bomb and the player’s position. Make a note of the expected result before you test.</w:t>
+        <w:t>If you need a wrong-item test, add a regular bomb item with a different NID and choose it at the door. With Take additional items blank on FAIL, the attempt must preserve that bomb and the player’s position. Make a note of the expected result before you test.</w:t>
       </w:r>
     </w:p>
     <w:p>
@@ -9449,6 +9454,54 @@
       <w:bookmarkEnd w:id="10"/>
     </w:p>
     <w:p>
+      <w:pPr>
+        <w:keepNext/>
+        <w:jc w:val="center"/>
+      </w:pPr>
+      <w:r>
+        <w:drawing>
+          <wp:inline xmlns:a="http://schemas.openxmlformats.org/drawingml/2006/main" xmlns:pic="http://schemas.openxmlformats.org/drawingml/2006/picture">
+            <wp:extent cx="5641033" cy="5486399"/>
+            <wp:docPr id="8" name="Picture 8" descr="Both outcome forms include explicit item costs"/>
+            <wp:cNvGraphicFramePr>
+              <a:graphicFrameLocks noChangeAspect="1"/>
+            </wp:cNvGraphicFramePr>
+            <a:graphic>
+              <a:graphicData uri="http://schemas.openxmlformats.org/drawingml/2006/picture">
+                <pic:pic>
+                  <pic:nvPicPr>
+                    <pic:cNvPr id="0" name="outcome-fields.png"/>
+                    <pic:cNvPicPr/>
+                  </pic:nvPicPr>
+                  <pic:blipFill>
+                    <a:blip r:embed="rId18"/>
+                    <a:stretch>
+                      <a:fillRect/>
+                    </a:stretch>
+                  </pic:blipFill>
+                  <pic:spPr>
+                    <a:xfrm>
+                      <a:off x="0" y="0"/>
+                      <a:ext cx="5641033" cy="5486399"/>
+                    </a:xfrm>
+                    <a:prstGeom prst="rect"/>
+                  </pic:spPr>
+                </pic:pic>
+              </a:graphicData>
+            </a:graphic>
+          </wp:inline>
+        </w:drawing>
+      </w:r>
+    </w:p>
+    <w:p>
+      <w:pPr>
+        <w:pStyle w:val="GuideCaption"/>
+      </w:pPr>
+      <w:r>
+        <w:t>Both outcome forms include explicit item costs</w:t>
+      </w:r>
+    </w:p>
+    <w:p>
       <w:r>
         <w:t>An outcome is a set of effects. A PASS means the chosen tests matched. A FAIL means they did not. Neither is a random dice roll. Cancel is separate and applies neither outcome.</w:t>
       </w:r>
@@ -10458,7 +10511,7 @@
         <w:pStyle w:val="Heading2"/>
       </w:pPr>
       <w:r>
-        <w:t>Take additional items — Pass.TakeItems</w:t>
+        <w:t>Take additional items — Pass.TakeItems and Fail.TakeItems</w:t>
       </w:r>
     </w:p>
     <w:p>
@@ -10469,7 +10522,7 @@
         <w:t>Valid setting:</w:t>
       </w:r>
       <w:r>
-        <w:t xml:space="preserve"> PASS-only list of full regular Item NIDs, separated by </w:t>
+        <w:t xml:space="preserve"> A list of full regular Item NIDs, separated by </w:t>
       </w:r>
       <w:r>
         <w:rPr>
@@ -10480,7 +10533,7 @@
         <w:t xml:space="preserve"> | </w:t>
       </w:r>
       <w:r>
-        <w:t>. Clothing and weapons cannot be consumed this way. Repeated entries require repeated owned copies. Blank removes no additional objects.</w:t>
+        <w:t>, on either PASS or FAIL. Clothing and weapons cannot be consumed this way. Repeated entries require repeated owned copies. Blank removes no additional objects. A failed selected item is never removed automatically.</w:t>
       </w:r>
     </w:p>
     <w:p>
@@ -10502,7 +10555,7 @@
         <w:t>Creative idea:</w:t>
       </w:r>
       <w:r>
-        <w:t xml:space="preserve"> Trade several collectibles for passage or a reward. Tell the player the cost in the message before they choose, rather than hiding it as a surprise.</w:t>
+        <w:t xml:space="preserve"> Trade several collectibles for passage or a reward. An enemy can pocket a gold coin after a failed riddle or a weak attack. Tell the player the cost before they choose, and put a spare-coin chest nearby so a failed puzzle can be tried again.</w:t>
       </w:r>
     </w:p>
     <w:p>
@@ -10513,7 +10566,452 @@
         <w:t>Connections:</w:t>
       </w:r>
       <w:r>
-        <w:t xml:space="preserve"> A successful UseInventory selection consumes one regular Item automatically. Listing the same NID in Take additional items is an extra cost, not a reminder. Test enough quantity first. If a needed extra item is absent, the outcome cannot complete. FAIL has no TakeItems field and must preserve inventory removals; hand-written Fail.TakeItems is forbidden.</w:t>
+        <w:t xml:space="preserve"> A successful UseInventory selection consumes one regular Item automatically. Listing the same NID in PASS Take additional items is an extra cost, not a reminder. FAIL takes only the explicitly listed copies: if you list the selected item’s NID there, one copy is removed, with no automatic extra charge. Every required copy must be owned before applying the outcome. Items awarded in Give items during this same outcome cannot pay the cost. A missing copy or equipment NID causes an authoring error and applies no effects: no reward, replacement, state change, variable update, transport, or partial removal. Cancel never takes anything.</w:t>
+      </w:r>
+    </w:p>
+    <w:tbl>
+      <w:tblPr>
+        <w:tblW w:type="auto" w:w="0"/>
+        <w:jc w:val="center"/>
+        <w:tblLayout w:type="fixed"/>
+        <w:tblLook w:firstColumn="1" w:firstRow="1" w:lastColumn="0" w:lastRow="0" w:noHBand="0" w:noVBand="1" w:val="04A0"/>
+      </w:tblPr>
+      <w:tblGrid>
+        <w:gridCol w:w="2160"/>
+        <w:gridCol w:w="4320"/>
+        <w:gridCol w:w="3456"/>
+      </w:tblGrid>
+      <w:tr>
+        <w:trPr>
+          <w:cantSplit/>
+          <w:tblHeader/>
+        </w:trPr>
+        <w:tc>
+          <w:tcPr>
+            <w:tcW w:type="dxa" w:w="2160"/>
+            <w:vAlign w:val="top"/>
+            <w:shd w:fill="214C3D"/>
+            <w:tcMar>
+              <w:top w:w="90" w:type="dxa"/>
+              <w:left w:w="90" w:type="dxa"/>
+              <w:bottom w:w="90" w:type="dxa"/>
+              <w:right w:w="90" w:type="dxa"/>
+            </w:tcMar>
+          </w:tcPr>
+          <w:p>
+            <w:pPr>
+              <w:keepNext/>
+              <w:spacing w:before="80" w:after="100" w:line="259" w:lineRule="auto"/>
+            </w:pPr>
+            <w:r>
+              <w:rPr>
+                <w:b/>
+                <w:color w:val="FFFFFF"/>
+                <w:sz w:val="19"/>
+              </w:rPr>
+              <w:t>Outcome</w:t>
+            </w:r>
+          </w:p>
+        </w:tc>
+        <w:tc>
+          <w:tcPr>
+            <w:tcW w:type="dxa" w:w="4320"/>
+            <w:vAlign w:val="top"/>
+            <w:shd w:fill="214C3D"/>
+            <w:tcMar>
+              <w:top w:w="90" w:type="dxa"/>
+              <w:left w:w="90" w:type="dxa"/>
+              <w:bottom w:w="90" w:type="dxa"/>
+              <w:right w:w="90" w:type="dxa"/>
+            </w:tcMar>
+          </w:tcPr>
+          <w:p>
+            <w:pPr>
+              <w:keepNext/>
+              <w:spacing w:before="80" w:after="100" w:line="259" w:lineRule="auto"/>
+            </w:pPr>
+            <w:r>
+              <w:rPr>
+                <w:b/>
+                <w:color w:val="FFFFFF"/>
+                <w:sz w:val="19"/>
+              </w:rPr>
+              <w:t>Automatic selected Item cost</w:t>
+            </w:r>
+          </w:p>
+        </w:tc>
+        <w:tc>
+          <w:tcPr>
+            <w:tcW w:type="dxa" w:w="3456"/>
+            <w:vAlign w:val="top"/>
+            <w:shd w:fill="214C3D"/>
+            <w:tcMar>
+              <w:top w:w="90" w:type="dxa"/>
+              <w:left w:w="90" w:type="dxa"/>
+              <w:bottom w:w="90" w:type="dxa"/>
+              <w:right w:w="90" w:type="dxa"/>
+            </w:tcMar>
+          </w:tcPr>
+          <w:p>
+            <w:pPr>
+              <w:keepNext/>
+              <w:spacing w:before="80" w:after="100" w:line="259" w:lineRule="auto"/>
+            </w:pPr>
+            <w:r>
+              <w:rPr>
+                <w:b/>
+                <w:color w:val="FFFFFF"/>
+                <w:sz w:val="19"/>
+              </w:rPr>
+              <w:t>Allowed examples</w:t>
+            </w:r>
+          </w:p>
+        </w:tc>
+      </w:tr>
+      <w:tr>
+        <w:trPr>
+          <w:cantSplit/>
+        </w:trPr>
+        <w:tc>
+          <w:tcPr>
+            <w:tcW w:type="dxa" w:w="2160"/>
+            <w:vAlign w:val="top"/>
+            <w:shd w:fill="EEF4E9"/>
+            <w:tcMar>
+              <w:top w:w="90" w:type="dxa"/>
+              <w:left w:w="90" w:type="dxa"/>
+              <w:bottom w:w="90" w:type="dxa"/>
+              <w:right w:w="90" w:type="dxa"/>
+            </w:tcMar>
+          </w:tcPr>
+          <w:p>
+            <w:pPr>
+              <w:spacing w:before="80" w:after="100" w:line="259" w:lineRule="auto"/>
+            </w:pPr>
+            <w:r>
+              <w:rPr>
+                <w:sz w:val="19"/>
+              </w:rPr>
+              <w:t>PASS with UseInventory</w:t>
+            </w:r>
+          </w:p>
+        </w:tc>
+        <w:tc>
+          <w:tcPr>
+            <w:tcW w:type="dxa" w:w="4320"/>
+            <w:vAlign w:val="top"/>
+            <w:shd w:fill="EEF4E9"/>
+            <w:tcMar>
+              <w:top w:w="90" w:type="dxa"/>
+              <w:left w:w="90" w:type="dxa"/>
+              <w:bottom w:w="90" w:type="dxa"/>
+              <w:right w:w="90" w:type="dxa"/>
+            </w:tcMar>
+          </w:tcPr>
+          <w:p>
+            <w:pPr>
+              <w:spacing w:before="80" w:after="100" w:line="259" w:lineRule="auto"/>
+            </w:pPr>
+            <w:r>
+              <w:rPr>
+                <w:sz w:val="19"/>
+              </w:rPr>
+              <w:t>One selected regular Item, plus every listed cost</w:t>
+            </w:r>
+          </w:p>
+        </w:tc>
+        <w:tc>
+          <w:tcPr>
+            <w:tcW w:type="dxa" w:w="3456"/>
+            <w:vAlign w:val="top"/>
+            <w:shd w:fill="EEF4E9"/>
+            <w:tcMar>
+              <w:top w:w="90" w:type="dxa"/>
+              <w:left w:w="90" w:type="dxa"/>
+              <w:bottom w:w="90" w:type="dxa"/>
+              <w:right w:w="90" w:type="dxa"/>
+            </w:tcMar>
+          </w:tcPr>
+          <w:p>
+            <w:pPr>
+              <w:spacing w:before="80" w:after="100" w:line="259" w:lineRule="auto"/>
+            </w:pPr>
+            <w:r>
+              <w:rPr>
+                <w:sz w:val="19"/>
+              </w:rPr>
+              <w:t>Selected key plus Pass.TakeItems: 1/4.3 spends a key and a bomb</w:t>
+            </w:r>
+          </w:p>
+        </w:tc>
+      </w:tr>
+      <w:tr>
+        <w:trPr>
+          <w:cantSplit/>
+        </w:trPr>
+        <w:tc>
+          <w:tcPr>
+            <w:tcW w:type="dxa" w:w="2160"/>
+            <w:vAlign w:val="top"/>
+            <w:shd w:fill="F8FAF5"/>
+            <w:tcMar>
+              <w:top w:w="90" w:type="dxa"/>
+              <w:left w:w="90" w:type="dxa"/>
+              <w:bottom w:w="90" w:type="dxa"/>
+              <w:right w:w="90" w:type="dxa"/>
+            </w:tcMar>
+          </w:tcPr>
+          <w:p>
+            <w:pPr>
+              <w:spacing w:before="80" w:after="100" w:line="259" w:lineRule="auto"/>
+            </w:pPr>
+            <w:r>
+              <w:rPr>
+                <w:sz w:val="19"/>
+              </w:rPr>
+              <w:t>FAIL</w:t>
+            </w:r>
+          </w:p>
+        </w:tc>
+        <w:tc>
+          <w:tcPr>
+            <w:tcW w:type="dxa" w:w="4320"/>
+            <w:vAlign w:val="top"/>
+            <w:shd w:fill="F8FAF5"/>
+            <w:tcMar>
+              <w:top w:w="90" w:type="dxa"/>
+              <w:left w:w="90" w:type="dxa"/>
+              <w:bottom w:w="90" w:type="dxa"/>
+              <w:right w:w="90" w:type="dxa"/>
+            </w:tcMar>
+          </w:tcPr>
+          <w:p>
+            <w:pPr>
+              <w:spacing w:before="80" w:after="100" w:line="259" w:lineRule="auto"/>
+            </w:pPr>
+            <w:r>
+              <w:rPr>
+                <w:sz w:val="19"/>
+              </w:rPr>
+              <w:t>None; only the listed regular Items</w:t>
+            </w:r>
+          </w:p>
+        </w:tc>
+        <w:tc>
+          <w:tcPr>
+            <w:tcW w:type="dxa" w:w="3456"/>
+            <w:vAlign w:val="top"/>
+            <w:shd w:fill="F8FAF5"/>
+            <w:tcMar>
+              <w:top w:w="90" w:type="dxa"/>
+              <w:left w:w="90" w:type="dxa"/>
+              <w:bottom w:w="90" w:type="dxa"/>
+              <w:right w:w="90" w:type="dxa"/>
+            </w:tcMar>
+          </w:tcPr>
+          <w:p>
+            <w:pPr>
+              <w:spacing w:before="80" w:after="100" w:line="259" w:lineRule="auto"/>
+            </w:pPr>
+            <w:r>
+              <w:rPr>
+                <w:sz w:val="19"/>
+              </w:rPr>
+              <w:t>Fail.TakeItems: 1/4.7 takes one defined gold coin</w:t>
+            </w:r>
+          </w:p>
+        </w:tc>
+      </w:tr>
+      <w:tr>
+        <w:trPr>
+          <w:cantSplit/>
+        </w:trPr>
+        <w:tc>
+          <w:tcPr>
+            <w:tcW w:type="dxa" w:w="2160"/>
+            <w:vAlign w:val="top"/>
+            <w:shd w:fill="EEF4E9"/>
+            <w:tcMar>
+              <w:top w:w="90" w:type="dxa"/>
+              <w:left w:w="90" w:type="dxa"/>
+              <w:bottom w:w="90" w:type="dxa"/>
+              <w:right w:w="90" w:type="dxa"/>
+            </w:tcMar>
+          </w:tcPr>
+          <w:p>
+            <w:pPr>
+              <w:spacing w:before="80" w:after="100" w:line="259" w:lineRule="auto"/>
+            </w:pPr>
+            <w:r>
+              <w:rPr>
+                <w:sz w:val="19"/>
+              </w:rPr>
+              <w:t>FAIL with repeated NIDs</w:t>
+            </w:r>
+          </w:p>
+        </w:tc>
+        <w:tc>
+          <w:tcPr>
+            <w:tcW w:type="dxa" w:w="4320"/>
+            <w:vAlign w:val="top"/>
+            <w:shd w:fill="EEF4E9"/>
+            <w:tcMar>
+              <w:top w:w="90" w:type="dxa"/>
+              <w:left w:w="90" w:type="dxa"/>
+              <w:bottom w:w="90" w:type="dxa"/>
+              <w:right w:w="90" w:type="dxa"/>
+            </w:tcMar>
+          </w:tcPr>
+          <w:p>
+            <w:pPr>
+              <w:spacing w:before="80" w:after="100" w:line="259" w:lineRule="auto"/>
+            </w:pPr>
+            <w:r>
+              <w:rPr>
+                <w:sz w:val="19"/>
+              </w:rPr>
+              <w:t>One copy for each listed occurrence</w:t>
+            </w:r>
+          </w:p>
+        </w:tc>
+        <w:tc>
+          <w:tcPr>
+            <w:tcW w:type="dxa" w:w="3456"/>
+            <w:vAlign w:val="top"/>
+            <w:shd w:fill="EEF4E9"/>
+            <w:tcMar>
+              <w:top w:w="90" w:type="dxa"/>
+              <w:left w:w="90" w:type="dxa"/>
+              <w:bottom w:w="90" w:type="dxa"/>
+              <w:right w:w="90" w:type="dxa"/>
+            </w:tcMar>
+          </w:tcPr>
+          <w:p>
+            <w:pPr>
+              <w:spacing w:before="80" w:after="100" w:line="259" w:lineRule="auto"/>
+            </w:pPr>
+            <w:r>
+              <w:rPr>
+                <w:sz w:val="19"/>
+              </w:rPr>
+              <w:t>List 1/4.7 twice to take two coins</w:t>
+            </w:r>
+          </w:p>
+        </w:tc>
+      </w:tr>
+      <w:tr>
+        <w:trPr>
+          <w:cantSplit/>
+        </w:trPr>
+        <w:tc>
+          <w:tcPr>
+            <w:tcW w:type="dxa" w:w="2160"/>
+            <w:vAlign w:val="top"/>
+            <w:shd w:fill="F8FAF5"/>
+            <w:tcMar>
+              <w:top w:w="90" w:type="dxa"/>
+              <w:left w:w="90" w:type="dxa"/>
+              <w:bottom w:w="90" w:type="dxa"/>
+              <w:right w:w="90" w:type="dxa"/>
+            </w:tcMar>
+          </w:tcPr>
+          <w:p>
+            <w:pPr>
+              <w:spacing w:before="80" w:after="100" w:line="259" w:lineRule="auto"/>
+            </w:pPr>
+            <w:r>
+              <w:rPr>
+                <w:sz w:val="19"/>
+              </w:rPr>
+              <w:t>Cancel / Leave</w:t>
+            </w:r>
+          </w:p>
+        </w:tc>
+        <w:tc>
+          <w:tcPr>
+            <w:tcW w:type="dxa" w:w="4320"/>
+            <w:vAlign w:val="top"/>
+            <w:shd w:fill="F8FAF5"/>
+            <w:tcMar>
+              <w:top w:w="90" w:type="dxa"/>
+              <w:left w:w="90" w:type="dxa"/>
+              <w:bottom w:w="90" w:type="dxa"/>
+              <w:right w:w="90" w:type="dxa"/>
+            </w:tcMar>
+          </w:tcPr>
+          <w:p>
+            <w:pPr>
+              <w:spacing w:before="80" w:after="100" w:line="259" w:lineRule="auto"/>
+            </w:pPr>
+            <w:r>
+              <w:rPr>
+                <w:sz w:val="19"/>
+              </w:rPr>
+              <w:t>None; outcomes do not run</w:t>
+            </w:r>
+          </w:p>
+        </w:tc>
+        <w:tc>
+          <w:tcPr>
+            <w:tcW w:type="dxa" w:w="3456"/>
+            <w:vAlign w:val="top"/>
+            <w:shd w:fill="F8FAF5"/>
+            <w:tcMar>
+              <w:top w:w="90" w:type="dxa"/>
+              <w:left w:w="90" w:type="dxa"/>
+              <w:bottom w:w="90" w:type="dxa"/>
+              <w:right w:w="90" w:type="dxa"/>
+            </w:tcMar>
+          </w:tcPr>
+          <w:p>
+            <w:pPr>
+              <w:spacing w:before="80" w:after="100" w:line="259" w:lineRule="auto"/>
+            </w:pPr>
+            <w:r>
+              <w:rPr>
+                <w:sz w:val="19"/>
+              </w:rPr>
+              <w:t>Leave a trickster without answering</w:t>
+            </w:r>
+          </w:p>
+        </w:tc>
+      </w:tr>
+    </w:tbl>
+    <w:p>
+      <w:pPr>
+        <w:spacing w:after="20"/>
+      </w:pPr>
+    </w:p>
+    <w:p>
+      <w:r>
+        <w:t xml:space="preserve">To build the coin-stealing enemy, first create an Inventory block with Item kind Item and full NID such as </w:t>
+      </w:r>
+      <w:r>
+        <w:rPr>
+          <w:rFonts w:ascii="Consolas" w:hAnsi="Consolas"/>
+          <w:color w:val="214C3D"/>
+          <w:sz w:val="20"/>
+        </w:rPr>
+        <w:t>1/4.7</w:t>
+      </w:r>
+      <w:r>
+        <w:t xml:space="preserve">. Name it Gold Coin and make sure the player can collect a coin before reaching the enemy. In the enemy’s Attack choice, keep the weapon-power test. Under On FAIL, put </w:t>
+      </w:r>
+      <w:r>
+        <w:rPr>
+          <w:rFonts w:ascii="Consolas" w:hAnsi="Consolas"/>
+          <w:color w:val="214C3D"/>
+          <w:sz w:val="20"/>
+        </w:rPr>
+        <w:t>1/4.7</w:t>
+      </w:r>
+      <w:r>
+        <w:t xml:space="preserve"> in Take additional items and write “Your sword is too weak. The pig pockets one gold coin!” The sword remains reusable. The player stays beside the pig unless a transport is explicitly set. The coin definition must be in the map matching its prefix; a foreign-map prefix needs a master directory entry.</w:t>
+      </w:r>
+    </w:p>
+    <w:p>
+      <w:r>
+        <w:t>Plan for players who run out of coins: provide a clearly labeled alternative choice without a cost, or a reachable repeating supply chest. Repeating a cost-bearing FAIL without its required items reports an authoring error; the game does not invent a coin, allow a negative quantity, or silently skip a listed cost.</w:t>
       </w:r>
     </w:p>
     <w:p>
@@ -11711,7 +12209,7 @@
     </w:p>
     <w:p>
       <w:r>
-        <w:t>Pickup is automatic through the built-in choices. Using a selected regular item on a matching Interaction consumes one on PASS; a wrong match preserves it. The special power of a master key comes from doors testing its NID, not from the word Master in its name.</w:t>
+        <w:t>Pickup is automatic through the built-in choices. Using a selected regular item on a matching Interaction consumes one on PASS; a wrong match preserves it unless Fail.TakeItems explicitly lists a cost. The special power of a master key comes from doors testing its NID, not from the word Master in its name.</w:t>
       </w:r>
     </w:p>
     <w:p>
@@ -12237,7 +12735,7 @@
         <w:drawing>
           <wp:inline xmlns:a="http://schemas.openxmlformats.org/drawingml/2006/main" xmlns:pic="http://schemas.openxmlformats.org/drawingml/2006/picture">
             <wp:extent cx="6080760" cy="1275270"/>
-            <wp:docPr id="8" name="Picture 8" descr="Image preview controls"/>
+            <wp:docPr id="9" name="Picture 9" descr="Image preview controls"/>
             <wp:cNvGraphicFramePr>
               <a:graphicFrameLocks noChangeAspect="1"/>
             </wp:cNvGraphicFramePr>
@@ -12249,7 +12747,7 @@
                     <pic:cNvPicPr/>
                   </pic:nvPicPr>
                   <pic:blipFill>
-                    <a:blip r:embed="rId18"/>
+                    <a:blip r:embed="rId19"/>
                     <a:stretch>
                       <a:fillRect/>
                     </a:stretch>
@@ -14848,7 +15346,7 @@
     </w:p>
     <w:p>
       <w:r>
-        <w:t>The editor itself can be hosted as a single editor.html page. It reads local map files in the visitor’s browser and exports downloads; it does not write back to your website. Publishing a changed map remains a separate upload step. Ask the site administrator for the intended static hosting directory instead of enabling unrestricted upload types.</w:t>
+        <w:t>The editor itself can be hosted as a single editor.html page for editing. Its integrated playtest also needs the full game files on that same HTTP(S) origin. It reads local map files in the visitor’s browser and exports downloads; it does not write back to your website. Publishing a changed map remains a separate upload step. Ask the site administrator for the intended static hosting directory instead of enabling unrestricted upload types.</w:t>
       </w:r>
     </w:p>
     <w:p>
@@ -14866,27 +15364,545 @@
         <w:pStyle w:val="Heading2"/>
       </w:pPr>
       <w:r>
-        <w:t>Test one new idea at a time</w:t>
-      </w:r>
-    </w:p>
-    <w:p>
-      <w:r>
-        <w:t>First confirm the route with simple grass, walls, key and door. Add one equipment puzzle next. Then add a secret route or another map. Export and play between changes. This makes it much easier to find which new idea introduced a problem.</w:t>
-      </w:r>
-    </w:p>
-    <w:p>
-      <w:r>
-        <w:t>For each choice, write an expected PASS and FAIL case. Test with no eligible item, a wrong item, the right item, and repeated attempts. For a weapon, test weaker, equal, and stronger power. For clothing, test owned-but-not-worn, worn-and-Working, and a displaced item.</w:t>
-      </w:r>
-    </w:p>
-    <w:p>
-      <w:r>
-        <w:t>Check inventory before and after success/failure. A failed bomb match preserves it. A successful selected regular item removes one. A reusable weapon should remain. Check the replacement Type, not only the picture, before expecting ordinary entry.</w:t>
-      </w:r>
-    </w:p>
-    <w:p>
-      <w:r>
-        <w:t>Walk away and return. Does a repeating chest grant another reward? Does a one-time chest stay gone? Change maps and return: cells and session memory should persist. Start a fresh adventure when testing initial conditions.</w:t>
+        <w:t>Test from Start, Back to Edit, and Resume Test</w:t>
+      </w:r>
+    </w:p>
+    <w:p>
+      <w:pPr>
+        <w:keepNext/>
+        <w:jc w:val="center"/>
+      </w:pPr>
+      <w:r>
+        <w:drawing>
+          <wp:inline xmlns:a="http://schemas.openxmlformats.org/drawingml/2006/main" xmlns:pic="http://schemas.openxmlformats.org/drawingml/2006/picture">
+            <wp:extent cx="6072571" cy="5486399"/>
+            <wp:docPr id="10" name="Picture 10" descr="A playtest running inside Map Studio"/>
+            <wp:cNvGraphicFramePr>
+              <a:graphicFrameLocks noChangeAspect="1"/>
+            </wp:cNvGraphicFramePr>
+            <a:graphic>
+              <a:graphicData uri="http://schemas.openxmlformats.org/drawingml/2006/picture">
+                <pic:pic>
+                  <pic:nvPicPr>
+                    <pic:cNvPr id="0" name="playtest-running.png"/>
+                    <pic:cNvPicPr/>
+                  </pic:nvPicPr>
+                  <pic:blipFill>
+                    <a:blip r:embed="rId20"/>
+                    <a:stretch>
+                      <a:fillRect/>
+                    </a:stretch>
+                  </pic:blipFill>
+                  <pic:spPr>
+                    <a:xfrm>
+                      <a:off x="0" y="0"/>
+                      <a:ext cx="6072571" cy="5486399"/>
+                    </a:xfrm>
+                    <a:prstGeom prst="rect"/>
+                  </pic:spPr>
+                </pic:pic>
+              </a:graphicData>
+            </a:graphic>
+          </wp:inline>
+        </w:drawing>
+      </w:r>
+    </w:p>
+    <w:p>
+      <w:pPr>
+        <w:pStyle w:val="GuideCaption"/>
+      </w:pPr>
+      <w:r>
+        <w:t>A playtest running inside Map Studio</w:t>
+      </w:r>
+    </w:p>
+    <w:p>
+      <w:r>
+        <w:t>These controls appear above your editing document. Use them on your game website, with editor.html beside index.html and all the game files. The game runs inside a frame, like a small window in the editor. It uses the normal game program and popup choices; there is no second set of puzzle rules to learn.</w:t>
+      </w:r>
+    </w:p>
+    <w:tbl>
+      <w:tblPr>
+        <w:tblW w:type="auto" w:w="0"/>
+        <w:jc w:val="center"/>
+        <w:tblLayout w:type="fixed"/>
+        <w:tblLook w:firstColumn="1" w:firstRow="1" w:lastColumn="0" w:lastRow="0" w:noHBand="0" w:noVBand="1" w:val="04A0"/>
+      </w:tblPr>
+      <w:tblGrid>
+        <w:gridCol w:w="2160"/>
+        <w:gridCol w:w="4320"/>
+        <w:gridCol w:w="3456"/>
+      </w:tblGrid>
+      <w:tr>
+        <w:trPr>
+          <w:cantSplit/>
+          <w:tblHeader/>
+        </w:trPr>
+        <w:tc>
+          <w:tcPr>
+            <w:tcW w:type="dxa" w:w="2160"/>
+            <w:vAlign w:val="top"/>
+            <w:shd w:fill="214C3D"/>
+            <w:tcMar>
+              <w:top w:w="90" w:type="dxa"/>
+              <w:left w:w="90" w:type="dxa"/>
+              <w:bottom w:w="90" w:type="dxa"/>
+              <w:right w:w="90" w:type="dxa"/>
+            </w:tcMar>
+          </w:tcPr>
+          <w:p>
+            <w:pPr>
+              <w:keepNext/>
+              <w:spacing w:before="80" w:after="100" w:line="259" w:lineRule="auto"/>
+            </w:pPr>
+            <w:r>
+              <w:rPr>
+                <w:b/>
+                <w:color w:val="FFFFFF"/>
+                <w:sz w:val="19"/>
+              </w:rPr>
+              <w:t>Control</w:t>
+            </w:r>
+          </w:p>
+        </w:tc>
+        <w:tc>
+          <w:tcPr>
+            <w:tcW w:type="dxa" w:w="4320"/>
+            <w:vAlign w:val="top"/>
+            <w:shd w:fill="214C3D"/>
+            <w:tcMar>
+              <w:top w:w="90" w:type="dxa"/>
+              <w:left w:w="90" w:type="dxa"/>
+              <w:bottom w:w="90" w:type="dxa"/>
+              <w:right w:w="90" w:type="dxa"/>
+            </w:tcMar>
+          </w:tcPr>
+          <w:p>
+            <w:pPr>
+              <w:keepNext/>
+              <w:spacing w:before="80" w:after="100" w:line="259" w:lineRule="auto"/>
+            </w:pPr>
+            <w:r>
+              <w:rPr>
+                <w:b/>
+                <w:color w:val="FFFFFF"/>
+                <w:sz w:val="19"/>
+              </w:rPr>
+              <w:t>What it does</w:t>
+            </w:r>
+          </w:p>
+        </w:tc>
+        <w:tc>
+          <w:tcPr>
+            <w:tcW w:type="dxa" w:w="3456"/>
+            <w:vAlign w:val="top"/>
+            <w:shd w:fill="214C3D"/>
+            <w:tcMar>
+              <w:top w:w="90" w:type="dxa"/>
+              <w:left w:w="90" w:type="dxa"/>
+              <w:bottom w:w="90" w:type="dxa"/>
+              <w:right w:w="90" w:type="dxa"/>
+            </w:tcMar>
+          </w:tcPr>
+          <w:p>
+            <w:pPr>
+              <w:keepNext/>
+              <w:spacing w:before="80" w:after="100" w:line="259" w:lineRule="auto"/>
+            </w:pPr>
+            <w:r>
+              <w:rPr>
+                <w:b/>
+                <w:color w:val="FFFFFF"/>
+                <w:sz w:val="19"/>
+              </w:rPr>
+              <w:t>Allowed examples</w:t>
+            </w:r>
+          </w:p>
+        </w:tc>
+      </w:tr>
+      <w:tr>
+        <w:trPr>
+          <w:cantSplit/>
+        </w:trPr>
+        <w:tc>
+          <w:tcPr>
+            <w:tcW w:type="dxa" w:w="2160"/>
+            <w:vAlign w:val="top"/>
+            <w:shd w:fill="EEF4E9"/>
+            <w:tcMar>
+              <w:top w:w="90" w:type="dxa"/>
+              <w:left w:w="90" w:type="dxa"/>
+              <w:bottom w:w="90" w:type="dxa"/>
+              <w:right w:w="90" w:type="dxa"/>
+            </w:tcMar>
+          </w:tcPr>
+          <w:p>
+            <w:pPr>
+              <w:spacing w:before="80" w:after="100" w:line="259" w:lineRule="auto"/>
+            </w:pPr>
+            <w:r>
+              <w:rPr>
+                <w:sz w:val="19"/>
+              </w:rPr>
+              <w:t>Test from Start</w:t>
+            </w:r>
+          </w:p>
+        </w:tc>
+        <w:tc>
+          <w:tcPr>
+            <w:tcW w:type="dxa" w:w="4320"/>
+            <w:vAlign w:val="top"/>
+            <w:shd w:fill="EEF4E9"/>
+            <w:tcMar>
+              <w:top w:w="90" w:type="dxa"/>
+              <w:left w:w="90" w:type="dxa"/>
+              <w:bottom w:w="90" w:type="dxa"/>
+              <w:right w:w="90" w:type="dxa"/>
+            </w:tcMar>
+          </w:tcPr>
+          <w:p>
+            <w:pPr>
+              <w:spacing w:before="80" w:after="100" w:line="259" w:lineRule="auto"/>
+            </w:pPr>
+            <w:r>
+              <w:rPr>
+                <w:sz w:val="19"/>
+              </w:rPr>
+              <w:t>Starts a fresh run from the latest applied editor document</w:t>
+            </w:r>
+          </w:p>
+        </w:tc>
+        <w:tc>
+          <w:tcPr>
+            <w:tcW w:type="dxa" w:w="3456"/>
+            <w:vAlign w:val="top"/>
+            <w:shd w:fill="EEF4E9"/>
+            <w:tcMar>
+              <w:top w:w="90" w:type="dxa"/>
+              <w:left w:w="90" w:type="dxa"/>
+              <w:bottom w:w="90" w:type="dxa"/>
+              <w:right w:w="90" w:type="dxa"/>
+            </w:tcMar>
+          </w:tcPr>
+          <w:p>
+            <w:pPr>
+              <w:spacing w:before="80" w:after="100" w:line="259" w:lineRule="auto"/>
+            </w:pPr>
+            <w:r>
+              <w:rPr>
+                <w:sz w:val="19"/>
+              </w:rPr>
+              <w:t>Test your new door without exporting</w:t>
+            </w:r>
+          </w:p>
+        </w:tc>
+      </w:tr>
+      <w:tr>
+        <w:trPr>
+          <w:cantSplit/>
+        </w:trPr>
+        <w:tc>
+          <w:tcPr>
+            <w:tcW w:type="dxa" w:w="2160"/>
+            <w:vAlign w:val="top"/>
+            <w:shd w:fill="F8FAF5"/>
+            <w:tcMar>
+              <w:top w:w="90" w:type="dxa"/>
+              <w:left w:w="90" w:type="dxa"/>
+              <w:bottom w:w="90" w:type="dxa"/>
+              <w:right w:w="90" w:type="dxa"/>
+            </w:tcMar>
+          </w:tcPr>
+          <w:p>
+            <w:pPr>
+              <w:spacing w:before="80" w:after="100" w:line="259" w:lineRule="auto"/>
+            </w:pPr>
+            <w:r>
+              <w:rPr>
+                <w:sz w:val="19"/>
+              </w:rPr>
+              <w:t>Back to Edit</w:t>
+            </w:r>
+          </w:p>
+        </w:tc>
+        <w:tc>
+          <w:tcPr>
+            <w:tcW w:type="dxa" w:w="4320"/>
+            <w:vAlign w:val="top"/>
+            <w:shd w:fill="F8FAF5"/>
+            <w:tcMar>
+              <w:top w:w="90" w:type="dxa"/>
+              <w:left w:w="90" w:type="dxa"/>
+              <w:bottom w:w="90" w:type="dxa"/>
+              <w:right w:w="90" w:type="dxa"/>
+            </w:tcMar>
+          </w:tcPr>
+          <w:p>
+            <w:pPr>
+              <w:spacing w:before="80" w:after="100" w:line="259" w:lineRule="auto"/>
+            </w:pPr>
+            <w:r>
+              <w:rPr>
+                <w:sz w:val="19"/>
+              </w:rPr>
+              <w:t>Pauses and hides the current run; keeps its memory and dialogs</w:t>
+            </w:r>
+          </w:p>
+        </w:tc>
+        <w:tc>
+          <w:tcPr>
+            <w:tcW w:type="dxa" w:w="3456"/>
+            <w:vAlign w:val="top"/>
+            <w:shd w:fill="F8FAF5"/>
+            <w:tcMar>
+              <w:top w:w="90" w:type="dxa"/>
+              <w:left w:w="90" w:type="dxa"/>
+              <w:bottom w:w="90" w:type="dxa"/>
+              <w:right w:w="90" w:type="dxa"/>
+            </w:tcMar>
+          </w:tcPr>
+          <w:p>
+            <w:pPr>
+              <w:spacing w:before="80" w:after="100" w:line="259" w:lineRule="auto"/>
+            </w:pPr>
+            <w:r>
+              <w:rPr>
+                <w:sz w:val="19"/>
+              </w:rPr>
+              <w:t>Return to graph paper after a failed guess</w:t>
+            </w:r>
+          </w:p>
+        </w:tc>
+      </w:tr>
+      <w:tr>
+        <w:trPr>
+          <w:cantSplit/>
+        </w:trPr>
+        <w:tc>
+          <w:tcPr>
+            <w:tcW w:type="dxa" w:w="2160"/>
+            <w:vAlign w:val="top"/>
+            <w:shd w:fill="EEF4E9"/>
+            <w:tcMar>
+              <w:top w:w="90" w:type="dxa"/>
+              <w:left w:w="90" w:type="dxa"/>
+              <w:bottom w:w="90" w:type="dxa"/>
+              <w:right w:w="90" w:type="dxa"/>
+            </w:tcMar>
+          </w:tcPr>
+          <w:p>
+            <w:pPr>
+              <w:spacing w:before="80" w:after="100" w:line="259" w:lineRule="auto"/>
+            </w:pPr>
+            <w:r>
+              <w:rPr>
+                <w:sz w:val="19"/>
+              </w:rPr>
+              <w:t>Resume Test</w:t>
+            </w:r>
+          </w:p>
+        </w:tc>
+        <w:tc>
+          <w:tcPr>
+            <w:tcW w:type="dxa" w:w="4320"/>
+            <w:vAlign w:val="top"/>
+            <w:shd w:fill="EEF4E9"/>
+            <w:tcMar>
+              <w:top w:w="90" w:type="dxa"/>
+              <w:left w:w="90" w:type="dxa"/>
+              <w:bottom w:w="90" w:type="dxa"/>
+              <w:right w:w="90" w:type="dxa"/>
+            </w:tcMar>
+          </w:tcPr>
+          <w:p>
+            <w:pPr>
+              <w:spacing w:before="80" w:after="100" w:line="259" w:lineRule="auto"/>
+            </w:pPr>
+            <w:r>
+              <w:rPr>
+                <w:sz w:val="19"/>
+              </w:rPr>
+              <w:t>Continues the paused run using its previous map snapshot</w:t>
+            </w:r>
+          </w:p>
+        </w:tc>
+        <w:tc>
+          <w:tcPr>
+            <w:tcW w:type="dxa" w:w="3456"/>
+            <w:vAlign w:val="top"/>
+            <w:shd w:fill="EEF4E9"/>
+            <w:tcMar>
+              <w:top w:w="90" w:type="dxa"/>
+              <w:left w:w="90" w:type="dxa"/>
+              <w:bottom w:w="90" w:type="dxa"/>
+              <w:right w:w="90" w:type="dxa"/>
+            </w:tcMar>
+          </w:tcPr>
+          <w:p>
+            <w:pPr>
+              <w:spacing w:before="80" w:after="100" w:line="259" w:lineRule="auto"/>
+            </w:pPr>
+            <w:r>
+              <w:rPr>
+                <w:sz w:val="19"/>
+              </w:rPr>
+              <w:t>Keep your collected sword and current position</w:t>
+            </w:r>
+          </w:p>
+        </w:tc>
+      </w:tr>
+      <w:tr>
+        <w:trPr>
+          <w:cantSplit/>
+        </w:trPr>
+        <w:tc>
+          <w:tcPr>
+            <w:tcW w:type="dxa" w:w="2160"/>
+            <w:vAlign w:val="top"/>
+            <w:shd w:fill="F8FAF5"/>
+            <w:tcMar>
+              <w:top w:w="90" w:type="dxa"/>
+              <w:left w:w="90" w:type="dxa"/>
+              <w:bottom w:w="90" w:type="dxa"/>
+              <w:right w:w="90" w:type="dxa"/>
+            </w:tcMar>
+          </w:tcPr>
+          <w:p>
+            <w:pPr>
+              <w:spacing w:before="80" w:after="100" w:line="259" w:lineRule="auto"/>
+            </w:pPr>
+            <w:r>
+              <w:rPr>
+                <w:sz w:val="19"/>
+              </w:rPr>
+              <w:t>Export map.txt</w:t>
+            </w:r>
+          </w:p>
+        </w:tc>
+        <w:tc>
+          <w:tcPr>
+            <w:tcW w:type="dxa" w:w="4320"/>
+            <w:vAlign w:val="top"/>
+            <w:shd w:fill="F8FAF5"/>
+            <w:tcMar>
+              <w:top w:w="90" w:type="dxa"/>
+              <w:left w:w="90" w:type="dxa"/>
+              <w:bottom w:w="90" w:type="dxa"/>
+              <w:right w:w="90" w:type="dxa"/>
+            </w:tcMar>
+          </w:tcPr>
+          <w:p>
+            <w:pPr>
+              <w:spacing w:before="80" w:after="100" w:line="259" w:lineRule="auto"/>
+            </w:pPr>
+            <w:r>
+              <w:rPr>
+                <w:sz w:val="19"/>
+              </w:rPr>
+              <w:t>Downloads your authoring document, independently of test progress</w:t>
+            </w:r>
+          </w:p>
+        </w:tc>
+        <w:tc>
+          <w:tcPr>
+            <w:tcW w:type="dxa" w:w="3456"/>
+            <w:vAlign w:val="top"/>
+            <w:shd w:fill="F8FAF5"/>
+            <w:tcMar>
+              <w:top w:w="90" w:type="dxa"/>
+              <w:left w:w="90" w:type="dxa"/>
+              <w:bottom w:w="90" w:type="dxa"/>
+              <w:right w:w="90" w:type="dxa"/>
+            </w:tcMar>
+          </w:tcPr>
+          <w:p>
+            <w:pPr>
+              <w:spacing w:before="80" w:after="100" w:line="259" w:lineRule="auto"/>
+            </w:pPr>
+            <w:r>
+              <w:rPr>
+                <w:sz w:val="19"/>
+              </w:rPr>
+              <w:t>Save map-3.txt after changing a door rule</w:t>
+            </w:r>
+          </w:p>
+        </w:tc>
+      </w:tr>
+    </w:tbl>
+    <w:p>
+      <w:pPr>
+        <w:spacing w:after="20"/>
+      </w:pPr>
+    </w:p>
+    <w:p>
+      <w:r>
+        <w:t>First save any block form and apply map settings. Read Map checks and fix errors. Click Test from Start. Your gnome is called Map tester and begins at this map’s StartingLocation, even if main-config.txt normally starts somewhere else. Use arrows or numpad 8/2/4/6, open inventory, wear boots, wield weapons, and try choices exactly as in the regular game. Click the game grid if arrow keys do not have focus.</w:t>
+      </w:r>
+    </w:p>
+    <w:p>
+      <w:r>
+        <w:t>Every Test from Start discards the previous test run. Inventory, equipment, player states, player variables, map variables, replacements, and changes on other visited maps all start fresh. The map is copied from the latest applied editor document; the editable design itself is never changed by collecting a key, defeating a monster, or traveling during the test.</w:t>
+      </w:r>
+    </w:p>
+    <w:p>
+      <w:r>
+        <w:t>Back to Edit pauses the current run without copying its variables back into the editor. The frame simply stays in memory. Even an open interaction or result popup stays there. If a choice is still resolving or another map is loading, the button waits until that work finishes so you cannot pause halfway through an outcome. Return to your graph paper and make changes normally. Undo history is preserved.</w:t>
+      </w:r>
+    </w:p>
+    <w:p>
+      <w:r>
+        <w:t>Resume Test continues that old run, including its original map design. Editing a door while paused does not change the door in the paused game. The message “Your map has changed. Resume continues the previous test. Test from Start uses your changes.” reminds you of this rule. To try the new door, use Test from Start. This version has no way to change inventory or variables inside a running test by typing designer commands.</w:t>
+      </w:r>
+    </w:p>
+    <w:p>
+      <w:r>
+        <w:rPr>
+          <w:b/>
+        </w:rPr>
+        <w:t>Try it:</w:t>
+      </w:r>
+      <w:r>
+        <w:t xml:space="preserve"> Test from Start, collect a key, and choose Back to Edit. Rename the map in Map settings. Resume Test: the old name and collected key remain. Back to Edit, then Test from Start: the new name appears and the key is back on the ground. Export still contains the placed key because testing did not collect it from your design.</w:t>
+      </w:r>
+    </w:p>
+    <w:p>
+      <w:pPr>
+        <w:pStyle w:val="Heading3"/>
+      </w:pPr>
+      <w:r>
+        <w:t>Files and artwork used during a test</w:t>
+      </w:r>
+    </w:p>
+    <w:p>
+      <w:r>
+        <w:t>The edited map may have a new number that is not yet listed in main-config.txt. It can still start in Test from Start. Other maps reached by transport and foreign-map item definitions must be listed in the master file; the game loads their published files. An unsaved Map 2 open in another editor tab is not shared with this run. On a fresh test, all visited maps begin fresh again.</w:t>
+      </w:r>
+    </w:p>
+    <w:p>
+      <w:r>
+        <w:t>Master styles, player avatar, princess picture, and starting player variables still come from main-config.txt. If the edited map already has a Map.N directory entry, its URL is the base for relative block image paths. Otherwise the base is maps/map-N.txt beside the game, even though no such file is fetched for the edited map. Thus ../assets/tree.png points to the normal shared artwork folder. Absolute HTTP(S) image URLs use their own addresses. New custom artwork must be on the server to appear in the game. Choosing a local image preview or changing the editor’s preview base does not send that artwork to the game.</w:t>
+      </w:r>
+    </w:p>
+    <w:p>
+      <w:pPr>
+        <w:pStyle w:val="Heading3"/>
+      </w:pPr>
+      <w:r>
+        <w:t>Offline use, publishing, and restarting the browser</w:t>
+      </w:r>
+    </w:p>
+    <w:p>
+      <w:r>
+        <w:t>Double-clicked editor.html still supports drawing, forms, import, and export. Test from Start explains that playtesting needs HTTP(S); it cannot run the module-based game from a file:/// address. The editor-only download does not include the game. Use the full project download for integrated testing, and deploy editor.html, index.html, styles.css, and the complete js/ folder together, including playtest-protocol.js. Keep maps, main-config.txt, and assets in their normal places.</w:t>
+      </w:r>
+    </w:p>
+    <w:p>
+      <w:r>
+        <w:t>The map snapshot is a browser message to the same-origin game frame. It is not an HTTP POST, upload, server save, or replacement of the live map file. The server only serves ordinary game files and artwork. Export the final map and SFTP it to publish, as usual. Exporting does not destroy a paused test. Reloading or closing the editor loses that test and any unexported edits; paused progress is not a save file.</w:t>
+      </w:r>
+    </w:p>
+    <w:p>
+      <w:r>
+        <w:t>If the game cannot become ready, the editor returns to the design and shows a loading error. Check the complete deployment and main-config.txt URL; refresh after replacing old scripts. A test failure never erases the editable map.</w:t>
       </w:r>
     </w:p>
     <w:p>
@@ -14894,6 +15910,34 @@
         <w:pStyle w:val="Heading2"/>
       </w:pPr>
       <w:r>
+        <w:t>Test one new idea at a time</w:t>
+      </w:r>
+    </w:p>
+    <w:p>
+      <w:r>
+        <w:t>First confirm the route with simple grass, walls, key and door. Add one equipment puzzle next. Then add a secret route or another map. Use Test from Start between changes, and export backups regularly. This makes it much easier to find which new idea introduced a problem.</w:t>
+      </w:r>
+    </w:p>
+    <w:p>
+      <w:r>
+        <w:t>For each choice, write an expected PASS and FAIL case. Test with no eligible item, a wrong item, the right item, and repeated attempts. For a weapon, test weaker, equal, and stronger power. For clothing, test owned-but-not-worn, worn-and-Working, and a displaced item.</w:t>
+      </w:r>
+    </w:p>
+    <w:p>
+      <w:r>
+        <w:t>Check inventory before and after success/failure. A failed bomb match preserves it by default; an explicit Fail.TakeItems list is the exception. A successful selected regular item removes one. A reusable weapon should remain. Check the replacement Type, not only the picture, before expecting ordinary entry.</w:t>
+      </w:r>
+    </w:p>
+    <w:p>
+      <w:r>
+        <w:t>Walk away and return. Does a repeating chest grant another reward? Does a one-time chest stay gone? Change maps and return: cells and session memory should persist. Start a fresh adventure when testing initial conditions.</w:t>
+      </w:r>
+    </w:p>
+    <w:p>
+      <w:pPr>
+        <w:pStyle w:val="Heading2"/>
+      </w:pPr>
+      <w:r>
         <w:t>Common problems and precise fixes</w:t>
       </w:r>
     </w:p>
@@ -15011,7 +16055,7 @@
     </w:p>
     <w:p>
       <w:r>
-        <w:t>UseInventory already consumes the selected regular key on PASS. Take additional items is extra. Remove a duplicated cost or provide the intended quantity rule. Never put Fail.TakeItems into text; failures must not remove inventory.</w:t>
+        <w:t>UseInventory already consumes the selected regular key on PASS. Take additional items is extra. Remove a duplicated cost or provide the intended quantity rule. Check both PASS and FAIL Take additional items. FAIL removes only explicitly listed regular Items; leave that field blank when a wrong match should preserve everything.</w:t>
       </w:r>
     </w:p>
     <w:p>

</xml_diff>

<commit_message>
Load editor website map picker from the main configuration
</commit_message>
<xml_diff>
--- a/docs/Maze-Craze-Map-Editor-User-Guide.docx
+++ b/docs/Maze-Craze-Map-Editor-User-Guide.docx
@@ -114,7 +114,7 @@
         <w:pStyle w:val="GuideSmall"/>
       </w:pPr>
       <w:r>
-        <w:t>Playtesting edition • October 2026</w:t>
+        <w:t>Website maps edition • October 2026</w:t>
       </w:r>
     </w:p>
     <w:p>
@@ -2727,7 +2727,7 @@
       <w:r>
         <w:drawing>
           <wp:inline xmlns:a="http://schemas.openxmlformats.org/drawingml/2006/main" xmlns:pic="http://schemas.openxmlformats.org/drawingml/2006/picture">
-            <wp:extent cx="4852835" cy="5486400"/>
+            <wp:extent cx="4773665" cy="5486400"/>
             <wp:docPr id="2" name="Picture 2" descr="The block library and editable map"/>
             <wp:cNvGraphicFramePr>
               <a:graphicFrameLocks noChangeAspect="1"/>
@@ -2748,7 +2748,7 @@
                   <pic:spPr>
                     <a:xfrm>
                       <a:off x="0" y="0"/>
-                      <a:ext cx="4852835" cy="5486400"/>
+                      <a:ext cx="4773665" cy="5486400"/>
                     </a:xfrm>
                     <a:prstGeom prst="rect"/>
                   </pic:spPr>
@@ -2835,65 +2835,10 @@
         <w:rPr>
           <w:b/>
         </w:rPr>
-        <w:t>Open an example…</w:t>
-      </w:r>
-      <w:r>
-        <w:t xml:space="preserve"> loads one of the two built-in samples: Bramblewood, Map 1, or Little Clearing, Map 2. They are useful starting points and references. Editing the example in memory does not overwrite the repository’s sample file.</w:t>
-      </w:r>
-    </w:p>
-    <w:p>
-      <w:r>
-        <w:rPr>
-          <w:b/>
-        </w:rPr>
-        <w:t>Export map.txt</w:t>
-      </w:r>
-      <w:r>
-        <w:t xml:space="preserve"> checks the map and downloads </w:t>
-      </w:r>
-      <w:r>
-        <w:rPr>
-          <w:rFonts w:ascii="Consolas" w:hAnsi="Consolas"/>
-          <w:color w:val="214C3D"/>
-          <w:sz w:val="20"/>
-        </w:rPr>
-        <w:t>map-N.txt</w:t>
-      </w:r>
-      <w:r>
-        <w:t xml:space="preserve">, using the current map number. The button does not publish to WordPress, move the file into the game folder, or save the master configuration. Your browser chooses the download folder and may add </w:t>
-      </w:r>
-      <w:r>
-        <w:rPr>
-          <w:rFonts w:ascii="Consolas" w:hAnsi="Consolas"/>
-          <w:color w:val="214C3D"/>
-          <w:sz w:val="20"/>
-        </w:rPr>
-        <w:t>(1)</w:t>
-      </w:r>
-      <w:r>
-        <w:t xml:space="preserve"> to a repeated filename.</w:t>
-      </w:r>
-    </w:p>
-    <w:p>
-      <w:r>
-        <w:rPr>
-          <w:b/>
-        </w:rPr>
-        <w:t>Text / INI</w:t>
-      </w:r>
-      <w:r>
-        <w:t xml:space="preserve"> shows the complete generated map specification. It is editable. Use Apply text to load those text changes into the forms and canvas. Cancel closes the text window without applying unfinished text changes.</w:t>
-      </w:r>
-    </w:p>
-    <w:p>
-      <w:r>
-        <w:rPr>
-          <w:b/>
-        </w:rPr>
-        <w:t>Map settings</w:t>
-      </w:r>
-      <w:r>
-        <w:t xml:space="preserve"> opens the map-wide fields explained in Chapter 5. The document bar shows the map name, the imported/default filename, and whether the current document has unexported changes. The filename shown there is a document label; exported downloads use the current map number.</w:t>
+        <w:t>Open a map…</w:t>
+      </w:r>
+      <w:r>
+        <w:t xml:space="preserve"> has two groups. On your game website, Website maps lists every map defined in main-config.txt. Select one to open its current server file. Bundled examples contains the two offline samples, Bramblewood, Map 1, and Little Clearing, Map 2. The samples are separate copies and may differ from your published maps. Opening either kind changes only the editor document; it does not save anything back to the website.</w:t>
       </w:r>
     </w:p>
     <w:p>
@@ -2904,8 +2849,484 @@
       <w:r>
         <w:drawing>
           <wp:inline xmlns:a="http://schemas.openxmlformats.org/drawingml/2006/main" xmlns:pic="http://schemas.openxmlformats.org/drawingml/2006/picture">
+            <wp:extent cx="6080760" cy="415152"/>
+            <wp:docPr id="3" name="Picture 3" descr="The website map picker and refresh control"/>
+            <wp:cNvGraphicFramePr>
+              <a:graphicFrameLocks noChangeAspect="1"/>
+            </wp:cNvGraphicFramePr>
+            <a:graphic>
+              <a:graphicData uri="http://schemas.openxmlformats.org/drawingml/2006/picture">
+                <pic:pic>
+                  <pic:nvPicPr>
+                    <pic:cNvPr id="0" name="map-directory.png"/>
+                    <pic:cNvPicPr/>
+                  </pic:nvPicPr>
+                  <pic:blipFill>
+                    <a:blip r:embed="rId13"/>
+                    <a:stretch>
+                      <a:fillRect/>
+                    </a:stretch>
+                  </pic:blipFill>
+                  <pic:spPr>
+                    <a:xfrm>
+                      <a:off x="0" y="0"/>
+                      <a:ext cx="6080760" cy="415152"/>
+                    </a:xfrm>
+                    <a:prstGeom prst="rect"/>
+                  </pic:spPr>
+                </pic:pic>
+              </a:graphicData>
+            </a:graphic>
+          </wp:inline>
+        </w:drawing>
+      </w:r>
+    </w:p>
+    <w:p>
+      <w:pPr>
+        <w:pStyle w:val="GuideCaption"/>
+      </w:pPr>
+      <w:r>
+        <w:t>The website map picker and refresh control</w:t>
+      </w:r>
+    </w:p>
+    <w:p>
+      <w:r>
+        <w:rPr>
+          <w:b/>
+        </w:rPr>
+        <w:t>Refresh map list</w:t>
+      </w:r>
+      <w:r>
+        <w:t xml:space="preserve"> rereads main-config.txt without replacing your editing document. Use it after SFTP adds Map.3 or Map.4 to the master directory. The initial labels show the map number and filename; after opening a website map, its label uses the map name. The editor fetches map text when you choose a map, rather than downloading every map just to fill the list. Reopening a map requests the current server copy again.</w:t>
+      </w:r>
+    </w:p>
+    <w:tbl>
+      <w:tblPr>
+        <w:tblW w:type="auto" w:w="0"/>
+        <w:jc w:val="center"/>
+        <w:tblLayout w:type="fixed"/>
+        <w:tblLook w:firstColumn="1" w:firstRow="1" w:lastColumn="0" w:lastRow="0" w:noHBand="0" w:noVBand="1" w:val="04A0"/>
+      </w:tblPr>
+      <w:tblGrid>
+        <w:gridCol w:w="2160"/>
+        <w:gridCol w:w="4320"/>
+        <w:gridCol w:w="3456"/>
+      </w:tblGrid>
+      <w:tr>
+        <w:trPr>
+          <w:cantSplit/>
+          <w:tblHeader/>
+        </w:trPr>
+        <w:tc>
+          <w:tcPr>
+            <w:tcW w:type="dxa" w:w="2160"/>
+            <w:vAlign w:val="top"/>
+            <w:shd w:fill="214C3D"/>
+            <w:tcMar>
+              <w:top w:w="90" w:type="dxa"/>
+              <w:left w:w="90" w:type="dxa"/>
+              <w:bottom w:w="90" w:type="dxa"/>
+              <w:right w:w="90" w:type="dxa"/>
+            </w:tcMar>
+          </w:tcPr>
+          <w:p>
+            <w:pPr>
+              <w:keepNext/>
+              <w:spacing w:before="80" w:after="100" w:line="259" w:lineRule="auto"/>
+            </w:pPr>
+            <w:r>
+              <w:rPr>
+                <w:b/>
+                <w:color w:val="FFFFFF"/>
+                <w:sz w:val="19"/>
+              </w:rPr>
+              <w:t>Dropdown group or control</w:t>
+            </w:r>
+          </w:p>
+        </w:tc>
+        <w:tc>
+          <w:tcPr>
+            <w:tcW w:type="dxa" w:w="4320"/>
+            <w:vAlign w:val="top"/>
+            <w:shd w:fill="214C3D"/>
+            <w:tcMar>
+              <w:top w:w="90" w:type="dxa"/>
+              <w:left w:w="90" w:type="dxa"/>
+              <w:bottom w:w="90" w:type="dxa"/>
+              <w:right w:w="90" w:type="dxa"/>
+            </w:tcMar>
+          </w:tcPr>
+          <w:p>
+            <w:pPr>
+              <w:keepNext/>
+              <w:spacing w:before="80" w:after="100" w:line="259" w:lineRule="auto"/>
+            </w:pPr>
+            <w:r>
+              <w:rPr>
+                <w:b/>
+                <w:color w:val="FFFFFF"/>
+                <w:sz w:val="19"/>
+              </w:rPr>
+              <w:t>Where its data comes from</w:t>
+            </w:r>
+          </w:p>
+        </w:tc>
+        <w:tc>
+          <w:tcPr>
+            <w:tcW w:type="dxa" w:w="3456"/>
+            <w:vAlign w:val="top"/>
+            <w:shd w:fill="214C3D"/>
+            <w:tcMar>
+              <w:top w:w="90" w:type="dxa"/>
+              <w:left w:w="90" w:type="dxa"/>
+              <w:bottom w:w="90" w:type="dxa"/>
+              <w:right w:w="90" w:type="dxa"/>
+            </w:tcMar>
+          </w:tcPr>
+          <w:p>
+            <w:pPr>
+              <w:keepNext/>
+              <w:spacing w:before="80" w:after="100" w:line="259" w:lineRule="auto"/>
+            </w:pPr>
+            <w:r>
+              <w:rPr>
+                <w:b/>
+                <w:color w:val="FFFFFF"/>
+                <w:sz w:val="19"/>
+              </w:rPr>
+              <w:t>Allowed examples</w:t>
+            </w:r>
+          </w:p>
+        </w:tc>
+      </w:tr>
+      <w:tr>
+        <w:trPr>
+          <w:cantSplit/>
+        </w:trPr>
+        <w:tc>
+          <w:tcPr>
+            <w:tcW w:type="dxa" w:w="2160"/>
+            <w:vAlign w:val="top"/>
+            <w:shd w:fill="EEF4E9"/>
+            <w:tcMar>
+              <w:top w:w="90" w:type="dxa"/>
+              <w:left w:w="90" w:type="dxa"/>
+              <w:bottom w:w="90" w:type="dxa"/>
+              <w:right w:w="90" w:type="dxa"/>
+            </w:tcMar>
+          </w:tcPr>
+          <w:p>
+            <w:pPr>
+              <w:spacing w:before="80" w:after="100" w:line="259" w:lineRule="auto"/>
+            </w:pPr>
+            <w:r>
+              <w:rPr>
+                <w:sz w:val="19"/>
+              </w:rPr>
+              <w:t>Website maps</w:t>
+            </w:r>
+          </w:p>
+        </w:tc>
+        <w:tc>
+          <w:tcPr>
+            <w:tcW w:type="dxa" w:w="4320"/>
+            <w:vAlign w:val="top"/>
+            <w:shd w:fill="EEF4E9"/>
+            <w:tcMar>
+              <w:top w:w="90" w:type="dxa"/>
+              <w:left w:w="90" w:type="dxa"/>
+              <w:bottom w:w="90" w:type="dxa"/>
+              <w:right w:w="90" w:type="dxa"/>
+            </w:tcMar>
+          </w:tcPr>
+          <w:p>
+            <w:pPr>
+              <w:spacing w:before="80" w:after="100" w:line="259" w:lineRule="auto"/>
+            </w:pPr>
+            <w:r>
+              <w:rPr>
+                <w:sz w:val="19"/>
+              </w:rPr>
+              <w:t>Map.N entries in the master file beside the hosted editor</w:t>
+            </w:r>
+          </w:p>
+        </w:tc>
+        <w:tc>
+          <w:tcPr>
+            <w:tcW w:type="dxa" w:w="3456"/>
+            <w:vAlign w:val="top"/>
+            <w:shd w:fill="EEF4E9"/>
+            <w:tcMar>
+              <w:top w:w="90" w:type="dxa"/>
+              <w:left w:w="90" w:type="dxa"/>
+              <w:bottom w:w="90" w:type="dxa"/>
+              <w:right w:w="90" w:type="dxa"/>
+            </w:tcMar>
+          </w:tcPr>
+          <w:p>
+            <w:pPr>
+              <w:spacing w:before="80" w:after="100" w:line="259" w:lineRule="auto"/>
+            </w:pPr>
+            <w:r>
+              <w:rPr>
+                <w:sz w:val="19"/>
+              </w:rPr>
+              <w:t>Map.3: maps/map-3.txt</w:t>
+            </w:r>
+          </w:p>
+        </w:tc>
+      </w:tr>
+      <w:tr>
+        <w:trPr>
+          <w:cantSplit/>
+        </w:trPr>
+        <w:tc>
+          <w:tcPr>
+            <w:tcW w:type="dxa" w:w="2160"/>
+            <w:vAlign w:val="top"/>
+            <w:shd w:fill="F8FAF5"/>
+            <w:tcMar>
+              <w:top w:w="90" w:type="dxa"/>
+              <w:left w:w="90" w:type="dxa"/>
+              <w:bottom w:w="90" w:type="dxa"/>
+              <w:right w:w="90" w:type="dxa"/>
+            </w:tcMar>
+          </w:tcPr>
+          <w:p>
+            <w:pPr>
+              <w:spacing w:before="80" w:after="100" w:line="259" w:lineRule="auto"/>
+            </w:pPr>
+            <w:r>
+              <w:rPr>
+                <w:sz w:val="19"/>
+              </w:rPr>
+              <w:t>Bundled examples</w:t>
+            </w:r>
+          </w:p>
+        </w:tc>
+        <w:tc>
+          <w:tcPr>
+            <w:tcW w:type="dxa" w:w="4320"/>
+            <w:vAlign w:val="top"/>
+            <w:shd w:fill="F8FAF5"/>
+            <w:tcMar>
+              <w:top w:w="90" w:type="dxa"/>
+              <w:left w:w="90" w:type="dxa"/>
+              <w:bottom w:w="90" w:type="dxa"/>
+              <w:right w:w="90" w:type="dxa"/>
+            </w:tcMar>
+          </w:tcPr>
+          <w:p>
+            <w:pPr>
+              <w:spacing w:before="80" w:after="100" w:line="259" w:lineRule="auto"/>
+            </w:pPr>
+            <w:r>
+              <w:rPr>
+                <w:sz w:val="19"/>
+              </w:rPr>
+              <w:t>Samples saved inside editor.html</w:t>
+            </w:r>
+          </w:p>
+        </w:tc>
+        <w:tc>
+          <w:tcPr>
+            <w:tcW w:type="dxa" w:w="3456"/>
+            <w:vAlign w:val="top"/>
+            <w:shd w:fill="F8FAF5"/>
+            <w:tcMar>
+              <w:top w:w="90" w:type="dxa"/>
+              <w:left w:w="90" w:type="dxa"/>
+              <w:bottom w:w="90" w:type="dxa"/>
+              <w:right w:w="90" w:type="dxa"/>
+            </w:tcMar>
+          </w:tcPr>
+          <w:p>
+            <w:pPr>
+              <w:spacing w:before="80" w:after="100" w:line="259" w:lineRule="auto"/>
+            </w:pPr>
+            <w:r>
+              <w:rPr>
+                <w:sz w:val="19"/>
+              </w:rPr>
+              <w:t>Bramblewood, Map 1</w:t>
+            </w:r>
+          </w:p>
+        </w:tc>
+      </w:tr>
+      <w:tr>
+        <w:trPr>
+          <w:cantSplit/>
+        </w:trPr>
+        <w:tc>
+          <w:tcPr>
+            <w:tcW w:type="dxa" w:w="2160"/>
+            <w:vAlign w:val="top"/>
+            <w:shd w:fill="EEF4E9"/>
+            <w:tcMar>
+              <w:top w:w="90" w:type="dxa"/>
+              <w:left w:w="90" w:type="dxa"/>
+              <w:bottom w:w="90" w:type="dxa"/>
+              <w:right w:w="90" w:type="dxa"/>
+            </w:tcMar>
+          </w:tcPr>
+          <w:p>
+            <w:pPr>
+              <w:spacing w:before="80" w:after="100" w:line="259" w:lineRule="auto"/>
+            </w:pPr>
+            <w:r>
+              <w:rPr>
+                <w:sz w:val="19"/>
+              </w:rPr>
+              <w:t>Refresh map list</w:t>
+            </w:r>
+          </w:p>
+        </w:tc>
+        <w:tc>
+          <w:tcPr>
+            <w:tcW w:type="dxa" w:w="4320"/>
+            <w:vAlign w:val="top"/>
+            <w:shd w:fill="EEF4E9"/>
+            <w:tcMar>
+              <w:top w:w="90" w:type="dxa"/>
+              <w:left w:w="90" w:type="dxa"/>
+              <w:bottom w:w="90" w:type="dxa"/>
+              <w:right w:w="90" w:type="dxa"/>
+            </w:tcMar>
+          </w:tcPr>
+          <w:p>
+            <w:pPr>
+              <w:spacing w:before="80" w:after="100" w:line="259" w:lineRule="auto"/>
+            </w:pPr>
+            <w:r>
+              <w:rPr>
+                <w:sz w:val="19"/>
+              </w:rPr>
+              <w:t>Reads the website master directory again</w:t>
+            </w:r>
+          </w:p>
+        </w:tc>
+        <w:tc>
+          <w:tcPr>
+            <w:tcW w:type="dxa" w:w="3456"/>
+            <w:vAlign w:val="top"/>
+            <w:shd w:fill="EEF4E9"/>
+            <w:tcMar>
+              <w:top w:w="90" w:type="dxa"/>
+              <w:left w:w="90" w:type="dxa"/>
+              <w:bottom w:w="90" w:type="dxa"/>
+              <w:right w:w="90" w:type="dxa"/>
+            </w:tcMar>
+          </w:tcPr>
+          <w:p>
+            <w:pPr>
+              <w:spacing w:before="80" w:after="100" w:line="259" w:lineRule="auto"/>
+            </w:pPr>
+            <w:r>
+              <w:rPr>
+                <w:sz w:val="19"/>
+              </w:rPr>
+              <w:t>Discover Map.4 after SFTP upload</w:t>
+            </w:r>
+          </w:p>
+        </w:tc>
+      </w:tr>
+    </w:tbl>
+    <w:p>
+      <w:pPr>
+        <w:spacing w:after="20"/>
+      </w:pPr>
+    </w:p>
+    <w:p>
+      <w:r>
+        <w:rPr>
+          <w:b/>
+        </w:rPr>
+        <w:t>Try the website workflow:</w:t>
+      </w:r>
+      <w:r>
+        <w:t xml:space="preserve"> Put Map.3: maps/map-3.txt and Map.4: maps/map-4.txt under [Maps] in main-config.txt, and upload those map files. Open the hosted editor or click Refresh map list. Select Map 4 under Website maps. Change a block, export map-4.txt, and SFTP that download to the Map.4 URL to publish the new design. You do not need to alter StartMap just to open Map 4 in the editor.</w:t>
+      </w:r>
+    </w:p>
+    <w:p>
+      <w:r>
+        <w:t>The directory number must match the file’s Map.ID. An entry for Map.4 cannot point to a file that defines Map 3. Map URLs are relative to main-config.txt, as in the game. A custom URL such as maps/fourth-maze.txt is allowed, but Export still downloads map-4.txt: rename it or choose the correct destination when uploading so you replace the file the directory actually references.</w:t>
+      </w:r>
+    </w:p>
+    <w:p>
+      <w:r>
+        <w:t>The editor asks before replacing unexported changes. A missing, invalid, or mismatched map leaves your current document intact. If you edit, start a test, or open a form while a download is still loading, the late response does not replace your work; choose that website map again when ready. A failed directory refresh keeps the previous list, and bundled examples and local files remain available. Offline editing makes no directory request.</w:t>
+      </w:r>
+    </w:p>
+    <w:p>
+      <w:r>
+        <w:t>Website text reads require the same HTTP(S) origin as editor.html. They do not send cookies or login credentials, follow redirects, or accept files larger than 2 MB. Use the actual static file URLs. Image previews keep their existing separate controls; loading a map does not automatically enable image requests. If the master file is moved, update EDITOR_MAIN_CONFIG_PATH in js/editor-app.js and rebuild editor.html, and keep the game’s MAIN_CONFIG_URL pointing to that same master file. With the normal folder layout, no code setting needs changing.</w:t>
+      </w:r>
+    </w:p>
+    <w:p>
+      <w:r>
+        <w:rPr>
+          <w:b/>
+        </w:rPr>
+        <w:t>Export map.txt</w:t>
+      </w:r>
+      <w:r>
+        <w:t xml:space="preserve"> checks the map and downloads </w:t>
+      </w:r>
+      <w:r>
+        <w:rPr>
+          <w:rFonts w:ascii="Consolas" w:hAnsi="Consolas"/>
+          <w:color w:val="214C3D"/>
+          <w:sz w:val="20"/>
+        </w:rPr>
+        <w:t>map-N.txt</w:t>
+      </w:r>
+      <w:r>
+        <w:t xml:space="preserve">, using the current map number. The button does not publish to WordPress, move the file into the game folder, or save the master configuration. Your browser chooses the download folder and may add </w:t>
+      </w:r>
+      <w:r>
+        <w:rPr>
+          <w:rFonts w:ascii="Consolas" w:hAnsi="Consolas"/>
+          <w:color w:val="214C3D"/>
+          <w:sz w:val="20"/>
+        </w:rPr>
+        <w:t>(1)</w:t>
+      </w:r>
+      <w:r>
+        <w:t xml:space="preserve"> to a repeated filename.</w:t>
+      </w:r>
+    </w:p>
+    <w:p>
+      <w:r>
+        <w:rPr>
+          <w:b/>
+        </w:rPr>
+        <w:t>Text / INI</w:t>
+      </w:r>
+      <w:r>
+        <w:t xml:space="preserve"> shows the complete generated map specification. It is editable. Use Apply text to load those text changes into the forms and canvas. Cancel closes the text window without applying unfinished text changes.</w:t>
+      </w:r>
+    </w:p>
+    <w:p>
+      <w:r>
+        <w:rPr>
+          <w:b/>
+        </w:rPr>
+        <w:t>Map settings</w:t>
+      </w:r>
+      <w:r>
+        <w:t xml:space="preserve"> opens the map-wide fields explained in Chapter 5. The document bar shows the map name, the imported/default filename, and whether the current document has unexported changes. The filename shown there is a document label; exported downloads use the current map number.</w:t>
+      </w:r>
+    </w:p>
+    <w:p>
+      <w:pPr>
+        <w:keepNext/>
+        <w:jc w:val="center"/>
+      </w:pPr>
+      <w:r>
+        <w:drawing>
+          <wp:inline xmlns:a="http://schemas.openxmlformats.org/drawingml/2006/main" xmlns:pic="http://schemas.openxmlformats.org/drawingml/2006/picture">
             <wp:extent cx="6080760" cy="678578"/>
-            <wp:docPr id="3" name="Picture 3" descr="New, open, and export buttons"/>
+            <wp:docPr id="4" name="Picture 4" descr="New, open, and export buttons"/>
             <wp:cNvGraphicFramePr>
               <a:graphicFrameLocks noChangeAspect="1"/>
             </wp:cNvGraphicFramePr>
@@ -2917,7 +3338,7 @@
                     <pic:cNvPicPr/>
                   </pic:nvPicPr>
                   <pic:blipFill>
-                    <a:blip r:embed="rId13"/>
+                    <a:blip r:embed="rId14"/>
                     <a:stretch>
                       <a:fillRect/>
                     </a:stretch>
@@ -4414,7 +4835,7 @@
         <w:drawing>
           <wp:inline xmlns:a="http://schemas.openxmlformats.org/drawingml/2006/main" xmlns:pic="http://schemas.openxmlformats.org/drawingml/2006/picture">
             <wp:extent cx="4229344" cy="5486399"/>
-            <wp:docPr id="4" name="Picture 4" descr="Map settings in the current editor"/>
+            <wp:docPr id="5" name="Picture 5" descr="Map settings in the current editor"/>
             <wp:cNvGraphicFramePr>
               <a:graphicFrameLocks noChangeAspect="1"/>
             </wp:cNvGraphicFramePr>
@@ -4426,7 +4847,7 @@
                     <pic:cNvPicPr/>
                   </pic:nvPicPr>
                   <pic:blipFill>
-                    <a:blip r:embed="rId14"/>
+                    <a:blip r:embed="rId15"/>
                     <a:stretch>
                       <a:fillRect/>
                     </a:stretch>
@@ -6100,7 +6521,7 @@
         <w:drawing>
           <wp:inline xmlns:a="http://schemas.openxmlformats.org/drawingml/2006/main" xmlns:pic="http://schemas.openxmlformats.org/drawingml/2006/picture">
             <wp:extent cx="6080760" cy="3598424"/>
-            <wp:docPr id="5" name="Picture 5" descr="Wearable inventory fields"/>
+            <wp:docPr id="6" name="Picture 6" descr="Wearable inventory fields"/>
             <wp:cNvGraphicFramePr>
               <a:graphicFrameLocks noChangeAspect="1"/>
             </wp:cNvGraphicFramePr>
@@ -6112,7 +6533,7 @@
                     <pic:cNvPicPr/>
                   </pic:nvPicPr>
                   <pic:blipFill>
-                    <a:blip r:embed="rId15"/>
+                    <a:blip r:embed="rId16"/>
                     <a:stretch>
                       <a:fillRect/>
                     </a:stretch>
@@ -7658,7 +8079,7 @@
         <w:drawing>
           <wp:inline xmlns:a="http://schemas.openxmlformats.org/drawingml/2006/main" xmlns:pic="http://schemas.openxmlformats.org/drawingml/2006/picture">
             <wp:extent cx="6080760" cy="953452"/>
-            <wp:docPr id="6" name="Picture 6" descr="The action and choice fields"/>
+            <wp:docPr id="7" name="Picture 7" descr="The action and choice fields"/>
             <wp:cNvGraphicFramePr>
               <a:graphicFrameLocks noChangeAspect="1"/>
             </wp:cNvGraphicFramePr>
@@ -7670,7 +8091,7 @@
                     <pic:cNvPicPr/>
                   </pic:nvPicPr>
                   <pic:blipFill>
-                    <a:blip r:embed="rId16"/>
+                    <a:blip r:embed="rId17"/>
                     <a:stretch>
                       <a:fillRect/>
                     </a:stretch>
@@ -8024,7 +8445,7 @@
         <w:drawing>
           <wp:inline xmlns:a="http://schemas.openxmlformats.org/drawingml/2006/main" xmlns:pic="http://schemas.openxmlformats.org/drawingml/2006/picture">
             <wp:extent cx="6080760" cy="1066800"/>
-            <wp:docPr id="7" name="Picture 7" descr="Two real sword tests from the pig puzzle"/>
+            <wp:docPr id="8" name="Picture 8" descr="Two real sword tests from the pig puzzle"/>
             <wp:cNvGraphicFramePr>
               <a:graphicFrameLocks noChangeAspect="1"/>
             </wp:cNvGraphicFramePr>
@@ -8036,7 +8457,7 @@
                     <pic:cNvPicPr/>
                   </pic:nvPicPr>
                   <pic:blipFill>
-                    <a:blip r:embed="rId17"/>
+                    <a:blip r:embed="rId18"/>
                     <a:stretch>
                       <a:fillRect/>
                     </a:stretch>
@@ -9462,7 +9883,7 @@
         <w:drawing>
           <wp:inline xmlns:a="http://schemas.openxmlformats.org/drawingml/2006/main" xmlns:pic="http://schemas.openxmlformats.org/drawingml/2006/picture">
             <wp:extent cx="5641033" cy="5486399"/>
-            <wp:docPr id="8" name="Picture 8" descr="Both outcome forms include explicit item costs"/>
+            <wp:docPr id="9" name="Picture 9" descr="Both outcome forms include explicit item costs"/>
             <wp:cNvGraphicFramePr>
               <a:graphicFrameLocks noChangeAspect="1"/>
             </wp:cNvGraphicFramePr>
@@ -9474,7 +9895,7 @@
                     <pic:cNvPicPr/>
                   </pic:nvPicPr>
                   <pic:blipFill>
-                    <a:blip r:embed="rId18"/>
+                    <a:blip r:embed="rId19"/>
                     <a:stretch>
                       <a:fillRect/>
                     </a:stretch>
@@ -12735,7 +13156,7 @@
         <w:drawing>
           <wp:inline xmlns:a="http://schemas.openxmlformats.org/drawingml/2006/main" xmlns:pic="http://schemas.openxmlformats.org/drawingml/2006/picture">
             <wp:extent cx="6080760" cy="1275270"/>
-            <wp:docPr id="9" name="Picture 9" descr="Image preview controls"/>
+            <wp:docPr id="10" name="Picture 10" descr="Image preview controls"/>
             <wp:cNvGraphicFramePr>
               <a:graphicFrameLocks noChangeAspect="1"/>
             </wp:cNvGraphicFramePr>
@@ -12747,7 +13168,7 @@
                     <pic:cNvPicPr/>
                   </pic:nvPicPr>
                   <pic:blipFill>
-                    <a:blip r:embed="rId19"/>
+                    <a:blip r:embed="rId20"/>
                     <a:stretch>
                       <a:fillRect/>
                     </a:stretch>
@@ -15376,7 +15797,7 @@
         <w:drawing>
           <wp:inline xmlns:a="http://schemas.openxmlformats.org/drawingml/2006/main" xmlns:pic="http://schemas.openxmlformats.org/drawingml/2006/picture">
             <wp:extent cx="6072571" cy="5486399"/>
-            <wp:docPr id="10" name="Picture 10" descr="A playtest running inside Map Studio"/>
+            <wp:docPr id="11" name="Picture 11" descr="A playtest running inside Map Studio"/>
             <wp:cNvGraphicFramePr>
               <a:graphicFrameLocks noChangeAspect="1"/>
             </wp:cNvGraphicFramePr>
@@ -15388,7 +15809,7 @@
                     <pic:cNvPicPr/>
                   </pic:nvPicPr>
                   <pic:blipFill>
-                    <a:blip r:embed="rId20"/>
+                    <a:blip r:embed="rId21"/>
                     <a:stretch>
                       <a:fillRect/>
                     </a:stretch>

</xml_diff>

<commit_message>
Add independent games, compact inventory, movement and editor improvements
</commit_message>
<xml_diff>
--- a/docs/Maze-Craze-Map-Editor-User-Guide.docx
+++ b/docs/Maze-Craze-Map-Editor-User-Guide.docx
@@ -7,7 +7,7 @@
         <w:pStyle w:val="Subtitle"/>
       </w:pPr>
       <w:r>
-        <w:t>A SEBASTIAN ADVENTURE</w:t>
+        <w:t>A FAMILY ADVENTURE</w:t>
       </w:r>
     </w:p>
     <w:p>
@@ -74,7 +74,7 @@
     </w:p>
     <w:p>
       <w:r>
-        <w:t>A complete, illustrated guide for Sebastian and fellow seventh-grade mapmakers.</w:t>
+        <w:t>A complete, illustrated guide for Sebastian, Esther, and fellow mapmakers.</w:t>
       </w:r>
     </w:p>
     <w:p>
@@ -114,7 +114,7 @@
         <w:pStyle w:val="GuideSmall"/>
       </w:pPr>
       <w:r>
-        <w:t>Website maps edition • October 2026</w:t>
+        <w:t>Game collections edition • October 2026</w:t>
       </w:r>
     </w:p>
     <w:p>
@@ -195,7 +195,7 @@
             <w:rFonts w:ascii="Calibri" w:hAnsi="Calibri"/>
             <w:sz w:val="22"/>
           </w:rPr>
-          <w:t>5</w:t>
+          <w:t>6</w:t>
         </w:r>
       </w:fldSimple>
     </w:p>
@@ -221,7 +221,7 @@
             <w:rFonts w:ascii="Calibri" w:hAnsi="Calibri"/>
             <w:sz w:val="22"/>
           </w:rPr>
-          <w:t>7</w:t>
+          <w:t>8</w:t>
         </w:r>
       </w:fldSimple>
     </w:p>
@@ -247,7 +247,7 @@
             <w:rFonts w:ascii="Calibri" w:hAnsi="Calibri"/>
             <w:sz w:val="22"/>
           </w:rPr>
-          <w:t>11</w:t>
+          <w:t>13</w:t>
         </w:r>
       </w:fldSimple>
     </w:p>
@@ -273,7 +273,7 @@
             <w:rFonts w:ascii="Calibri" w:hAnsi="Calibri"/>
             <w:sz w:val="22"/>
           </w:rPr>
-          <w:t>13</w:t>
+          <w:t>15</w:t>
         </w:r>
       </w:fldSimple>
     </w:p>
@@ -299,7 +299,7 @@
             <w:rFonts w:ascii="Calibri" w:hAnsi="Calibri"/>
             <w:sz w:val="22"/>
           </w:rPr>
-          <w:t>17</w:t>
+          <w:t>19</w:t>
         </w:r>
       </w:fldSimple>
     </w:p>
@@ -325,7 +325,7 @@
             <w:rFonts w:ascii="Calibri" w:hAnsi="Calibri"/>
             <w:sz w:val="22"/>
           </w:rPr>
-          <w:t>20</w:t>
+          <w:t>22</w:t>
         </w:r>
       </w:fldSimple>
     </w:p>
@@ -351,7 +351,7 @@
             <w:rFonts w:ascii="Calibri" w:hAnsi="Calibri"/>
             <w:sz w:val="22"/>
           </w:rPr>
-          <w:t>24</w:t>
+          <w:t>27</w:t>
         </w:r>
       </w:fldSimple>
     </w:p>
@@ -377,7 +377,7 @@
             <w:rFonts w:ascii="Calibri" w:hAnsi="Calibri"/>
             <w:sz w:val="22"/>
           </w:rPr>
-          <w:t>26</w:t>
+          <w:t>30</w:t>
         </w:r>
       </w:fldSimple>
     </w:p>
@@ -403,7 +403,7 @@
             <w:rFonts w:ascii="Calibri" w:hAnsi="Calibri"/>
             <w:sz w:val="22"/>
           </w:rPr>
-          <w:t>30</w:t>
+          <w:t>34</w:t>
         </w:r>
       </w:fldSimple>
     </w:p>
@@ -429,7 +429,7 @@
             <w:rFonts w:ascii="Calibri" w:hAnsi="Calibri"/>
             <w:sz w:val="22"/>
           </w:rPr>
-          <w:t>36</w:t>
+          <w:t>40</w:t>
         </w:r>
       </w:fldSimple>
     </w:p>
@@ -455,7 +455,7 @@
             <w:rFonts w:ascii="Calibri" w:hAnsi="Calibri"/>
             <w:sz w:val="22"/>
           </w:rPr>
-          <w:t>38</w:t>
+          <w:t>42</w:t>
         </w:r>
       </w:fldSimple>
     </w:p>
@@ -481,7 +481,7 @@
             <w:rFonts w:ascii="Calibri" w:hAnsi="Calibri"/>
             <w:sz w:val="22"/>
           </w:rPr>
-          <w:t>42</w:t>
+          <w:t>46</w:t>
         </w:r>
       </w:fldSimple>
     </w:p>
@@ -507,7 +507,7 @@
             <w:rFonts w:ascii="Calibri" w:hAnsi="Calibri"/>
             <w:sz w:val="22"/>
           </w:rPr>
-          <w:t>44</w:t>
+          <w:t>48</w:t>
         </w:r>
       </w:fldSimple>
     </w:p>
@@ -533,7 +533,7 @@
             <w:rFonts w:ascii="Calibri" w:hAnsi="Calibri"/>
             <w:sz w:val="22"/>
           </w:rPr>
-          <w:t>46</w:t>
+          <w:t>50</w:t>
         </w:r>
       </w:fldSimple>
     </w:p>
@@ -559,7 +559,7 @@
             <w:rFonts w:ascii="Calibri" w:hAnsi="Calibri"/>
             <w:sz w:val="22"/>
           </w:rPr>
-          <w:t>48</w:t>
+          <w:t>52</w:t>
         </w:r>
       </w:fldSimple>
     </w:p>
@@ -585,7 +585,7 @@
             <w:rFonts w:ascii="Calibri" w:hAnsi="Calibri"/>
             <w:sz w:val="22"/>
           </w:rPr>
-          <w:t>51</w:t>
+          <w:t>57</w:t>
         </w:r>
       </w:fldSimple>
     </w:p>
@@ -611,7 +611,7 @@
             <w:rFonts w:ascii="Calibri" w:hAnsi="Calibri"/>
             <w:sz w:val="22"/>
           </w:rPr>
-          <w:t>57</w:t>
+          <w:t>63</w:t>
         </w:r>
       </w:fldSimple>
     </w:p>
@@ -648,7 +648,7 @@
     </w:p>
     <w:p>
       <w:r>
-        <w:t>This handbook is written for Sebastian and other seventh-grade mapmakers. You do not need to write JavaScript to use the editor. You will learn a little about coordinates, careful naming, logic, and testing. Those skills let you build increasingly clever adventures without changing the game program.</w:t>
+        <w:t>This handbook is written for Sebastian, Esther, and other mapmakers, with explanations for a seventh-grade reader. You do not need to write JavaScript to use the editor. You will learn a little about coordinates, careful naming, logic, and testing. Those skills let you build increasingly clever adventures without changing the game program.</w:t>
       </w:r>
     </w:p>
     <w:p>
@@ -776,6 +776,82 @@
       </w:pPr>
       <w:r>
         <w:t>MAPMAKER’S HABIT: Keep a working copy, an exported backup, and a tested game copy. Name backups clearly, such as map-3-before-secret-tree.txt. The name you actually publish must match the URL in the main configuration.</w:t>
+      </w:r>
+    </w:p>
+    <w:p>
+      <w:pPr>
+        <w:pStyle w:val="Heading2"/>
+      </w:pPr>
+      <w:r>
+        <w:t>Playing in the compact map screen</w:t>
+      </w:r>
+    </w:p>
+    <w:p>
+      <w:pPr>
+        <w:keepNext/>
+        <w:jc w:val="center"/>
+      </w:pPr>
+      <w:r>
+        <w:drawing>
+          <wp:inline xmlns:a="http://schemas.openxmlformats.org/drawingml/2006/main" xmlns:pic="http://schemas.openxmlformats.org/drawingml/2006/picture">
+            <wp:extent cx="6080760" cy="3833764"/>
+            <wp:docPr id="2" name="Picture 2" descr="The wide map panel with game selector, Inventory and latest story"/>
+            <wp:cNvGraphicFramePr>
+              <a:graphicFrameLocks noChangeAspect="1"/>
+            </wp:cNvGraphicFramePr>
+            <a:graphic>
+              <a:graphicData uri="http://schemas.openxmlformats.org/drawingml/2006/picture">
+                <pic:pic>
+                  <pic:nvPicPr>
+                    <pic:cNvPr id="0" name="game-layout.png"/>
+                    <pic:cNvPicPr/>
+                  </pic:nvPicPr>
+                  <pic:blipFill>
+                    <a:blip r:embed="rId12"/>
+                    <a:stretch>
+                      <a:fillRect/>
+                    </a:stretch>
+                  </pic:blipFill>
+                  <pic:spPr>
+                    <a:xfrm>
+                      <a:off x="0" y="0"/>
+                      <a:ext cx="6080760" cy="3833764"/>
+                    </a:xfrm>
+                    <a:prstGeom prst="rect"/>
+                  </pic:spPr>
+                </pic:pic>
+              </a:graphicData>
+            </a:graphic>
+          </wp:inline>
+        </w:drawing>
+      </w:r>
+    </w:p>
+    <w:p>
+      <w:pPr>
+        <w:pStyle w:val="GuideCaption"/>
+      </w:pPr>
+      <w:r>
+        <w:t>The wide map panel with game selector, Inventory and latest story</w:t>
+      </w:r>
+    </w:p>
+    <w:p>
+      <w:r>
+        <w:t>The game uses one wide map panel. Its toolbar contains the game selector, view window, coordinates, and Inventory button. Four compact direction buttons stay beneath the grid. The latest story message appears underneath; each new message replaces the last, while ordinary walking leaves it visible. The old right-hand sidebar is gone.</w:t>
+      </w:r>
+    </w:p>
+    <w:p>
+      <w:r>
+        <w:t>A fresh keyboard direction moves immediately. Keep holding it: after 300 milliseconds the game moves again, then every 200 milliseconds. Releasing the key, meeting a wall, opening an interaction or bag, pausing, or leaving the browser stops the timer. Press again to continue after a popup; the game will not resume a forgotten held direction.</w:t>
+      </w:r>
+    </w:p>
+    <w:p>
+      <w:r>
+        <w:t>Click or touch a square directly above, below, left, or right of the character to attempt one step. Walls and interactions behave exactly as with keyboard movement. Clicking the player, a diagonal, or a distant square does nothing. Adjacent squares have the same subtle outline regardless of their block behavior, so secret interaction trees are not revealed. Hidden directions in an asymmetric view window remain available through the keyboard or buttons.</w:t>
+      </w:r>
+    </w:p>
+    <w:p>
+      <w:r>
+        <w:t>Tiles remain 32×32 pixels and ViewWindow still controls the visible square count. A wider panel provides space; it does not grant extra vision automatically. Large windows scroll within the panel on smaller screens.</w:t>
       </w:r>
     </w:p>
     <w:p>
@@ -2728,7 +2804,7 @@
         <w:drawing>
           <wp:inline xmlns:a="http://schemas.openxmlformats.org/drawingml/2006/main" xmlns:pic="http://schemas.openxmlformats.org/drawingml/2006/picture">
             <wp:extent cx="4773665" cy="5486400"/>
-            <wp:docPr id="2" name="Picture 2" descr="The block library and editable map"/>
+            <wp:docPr id="3" name="Picture 3" descr="The block library and editable map"/>
             <wp:cNvGraphicFramePr>
               <a:graphicFrameLocks noChangeAspect="1"/>
             </wp:cNvGraphicFramePr>
@@ -2740,7 +2816,7 @@
                     <pic:cNvPicPr/>
                   </pic:nvPicPr>
                   <pic:blipFill>
-                    <a:blip r:embed="rId12"/>
+                    <a:blip r:embed="rId13"/>
                     <a:stretch>
                       <a:fillRect/>
                     </a:stretch>
@@ -2849,8 +2925,8 @@
       <w:r>
         <w:drawing>
           <wp:inline xmlns:a="http://schemas.openxmlformats.org/drawingml/2006/main" xmlns:pic="http://schemas.openxmlformats.org/drawingml/2006/picture">
-            <wp:extent cx="6080760" cy="415152"/>
-            <wp:docPr id="3" name="Picture 3" descr="The website map picker and refresh control"/>
+            <wp:extent cx="6080760" cy="301379"/>
+            <wp:docPr id="4" name="Picture 4" descr="The website map picker and refresh control"/>
             <wp:cNvGraphicFramePr>
               <a:graphicFrameLocks noChangeAspect="1"/>
             </wp:cNvGraphicFramePr>
@@ -2862,7 +2938,7 @@
                     <pic:cNvPicPr/>
                   </pic:nvPicPr>
                   <pic:blipFill>
-                    <a:blip r:embed="rId13"/>
+                    <a:blip r:embed="rId14"/>
                     <a:stretch>
                       <a:fillRect/>
                     </a:stretch>
@@ -2870,7 +2946,7 @@
                   <pic:spPr>
                     <a:xfrm>
                       <a:off x="0" y="0"/>
-                      <a:ext cx="6080760" cy="415152"/>
+                      <a:ext cx="6080760" cy="301379"/>
                     </a:xfrm>
                     <a:prstGeom prst="rect"/>
                   </pic:spPr>
@@ -3326,7 +3402,7 @@
         <w:drawing>
           <wp:inline xmlns:a="http://schemas.openxmlformats.org/drawingml/2006/main" xmlns:pic="http://schemas.openxmlformats.org/drawingml/2006/picture">
             <wp:extent cx="6080760" cy="678578"/>
-            <wp:docPr id="4" name="Picture 4" descr="New, open, and export buttons"/>
+            <wp:docPr id="5" name="Picture 5" descr="New, open, and export buttons"/>
             <wp:cNvGraphicFramePr>
               <a:graphicFrameLocks noChangeAspect="1"/>
             </wp:cNvGraphicFramePr>
@@ -3338,7 +3414,7 @@
                     <pic:cNvPicPr/>
                   </pic:nvPicPr>
                   <pic:blipFill>
-                    <a:blip r:embed="rId14"/>
+                    <a:blip r:embed="rId15"/>
                     <a:stretch>
                       <a:fillRect/>
                     </a:stretch>
@@ -3370,6 +3446,35 @@
         <w:pStyle w:val="Heading2"/>
       </w:pPr>
       <w:r>
+        <w:t>Choosing the game you are editing</w:t>
+      </w:r>
+    </w:p>
+    <w:p>
+      <w:r>
+        <w:rPr>
+          <w:b/>
+        </w:rPr>
+        <w:t>Game to edit</w:t>
+      </w:r>
+      <w:r>
+        <w:t xml:space="preserve"> selects a map collection. Choose Esther’s Enchanted Garden to see Esther’s map directory, or Sebastian’s Workshop Trail to see Sebastian’s directory. The main game retains the existing maps under [Maps] in the master configuration. Changing games asks before replacing unexported work, then opens a fresh editing document. It does not automatically load a numbered map; select one from Open a map afterward, or create a new one.</w:t>
+      </w:r>
+    </w:p>
+    <w:p>
+      <w:r>
+        <w:t>Map 1 in Esther’s game and Map 1 in Sebastian’s game are independent. Both can define 1/4.1, but those NIDs belong to different game sessions. The map list, image catalog, and Test from Start all follow the selected game. Resume Test keeps its previous game and snapshot, even if you change the editor’s game while paused. Test from Start uses the newly selected game.</w:t>
+      </w:r>
+    </w:p>
+    <w:p>
+      <w:r>
+        <w:t>Refreshing reads the master catalog and the small game configuration files again. It does not download all map files. Website maps are loaded only when chosen. Configuration/map requests remain on the same origin, bounded by file size and timeout; all configuration values remain data.</w:t>
+      </w:r>
+    </w:p>
+    <w:p>
+      <w:pPr>
+        <w:pStyle w:val="Heading2"/>
+      </w:pPr>
+      <w:r>
         <w:t>The block library</w:t>
       </w:r>
     </w:p>
@@ -3469,7 +3574,7 @@
         <w:t>777 · Save the princess!</w:t>
       </w:r>
       <w:r>
-        <w:t xml:space="preserve"> tile can be painted like a block, but it cannot be edited or redefined. It is an immediate ending when approached in the game. You do not need a custom </w:t>
+        <w:t xml:space="preserve"> tile can be painted like a block, but it cannot be edited or redefined. It is an immediate ending when approached. A game configuration may give that ending its own title, message, and picture; the palette keeps its familiar princess label. You do not need a custom </w:t>
       </w:r>
       <w:r>
         <w:rPr>
@@ -4326,6 +4431,15 @@
         <w:rPr>
           <w:b/>
         </w:rPr>
+        <w:t>PDF user guide</w:t>
+      </w:r>
+      <w:r>
+        <w:t xml:space="preserve"> opens the complete illustrated PDF in another tab. Keep the docs folder beside editor.html so the link works, including offline when using the downloaded ZIP. </w:t>
+      </w:r>
+      <w:r>
+        <w:rPr>
+          <w:b/>
+        </w:rPr>
         <w:t>Field guide</w:t>
       </w:r>
       <w:r>
@@ -4379,7 +4493,7 @@
     </w:p>
     <w:p>
       <w:r>
-        <w:t xml:space="preserve">Choose New map, then Map settings. Set Map number to </w:t>
+        <w:t xml:space="preserve">On the hosted editor, select the main game first. Choose New map, then Map settings. Set Map number to </w:t>
       </w:r>
       <w:r>
         <w:rPr>
@@ -4580,7 +4694,7 @@
         <w:t>3/4.1</w:t>
       </w:r>
       <w:r>
-        <w:t>. If you created other blocks first, suggestions may differ; deliberately use an unused index and the NID shown in your own key form.</w:t>
+        <w:t>. If you created other blocks first, assigned numbers may differ; use the NID displayed in your own key form. Do not try to edit its read-only identifiers.</w:t>
       </w:r>
     </w:p>
     <w:p>
@@ -4620,7 +4734,7 @@
     </w:p>
     <w:p>
       <w:r>
-        <w:t xml:space="preserve">Create another block. Set Type to Interaction, name to Garden Door, NID to </w:t>
+        <w:t xml:space="preserve">Create another block. Set Type to Interaction and name to Garden Door. Confirm the assigned NID is </w:t>
       </w:r>
       <w:r>
         <w:rPr>
@@ -4631,7 +4745,7 @@
         <w:t>3/3.1</w:t>
       </w:r>
       <w:r>
-        <w:t xml:space="preserve">, and Map image path to </w:t>
+        <w:t xml:space="preserve"> in this clean tutorial, and Map image path to </w:t>
       </w:r>
       <w:r>
         <w:rPr>
@@ -4835,7 +4949,7 @@
         <w:drawing>
           <wp:inline xmlns:a="http://schemas.openxmlformats.org/drawingml/2006/main" xmlns:pic="http://schemas.openxmlformats.org/drawingml/2006/picture">
             <wp:extent cx="4229344" cy="5486399"/>
-            <wp:docPr id="5" name="Picture 5" descr="Map settings in the current editor"/>
+            <wp:docPr id="6" name="Picture 6" descr="Map settings in the current editor"/>
             <wp:cNvGraphicFramePr>
               <a:graphicFrameLocks noChangeAspect="1"/>
             </wp:cNvGraphicFramePr>
@@ -4847,7 +4961,7 @@
                     <pic:cNvPicPr/>
                   </pic:nvPicPr>
                   <pic:blipFill>
-                    <a:blip r:embed="rId15"/>
+                    <a:blip r:embed="rId16"/>
                     <a:stretch>
                       <a:fillRect/>
                     </a:stretch>
@@ -5769,7 +5883,7 @@
     </w:p>
     <w:p>
       <w:r>
-        <w:t>Create or select a block, then open its form. Some fields appear only for the relevant Type. The editor suggests a free numeric index and a matching NID; those suggestions save typing but do not know your story. Always read them before writing a rule that references the block.</w:t>
+        <w:t>Create or select a block, then open its form. Some fields appear only for the relevant Type. The editor manages the index and NID automatically. Both fields are read-only, visible, selectable, and copyable. Read them when writing a rule that refers to the block.</w:t>
       </w:r>
     </w:p>
     <w:p>
@@ -5788,7 +5902,7 @@
         <w:t>What it does:</w:t>
       </w:r>
       <w:r>
-        <w:t xml:space="preserve"> Gives the definition a local number for the map layout. </w:t>
+        <w:t xml:space="preserve"> Gives a definition its local number in the map layout. </w:t>
       </w:r>
       <w:r>
         <w:rPr>
@@ -5797,7 +5911,7 @@
         <w:t>Valid setting:</w:t>
       </w:r>
       <w:r>
-        <w:t xml:space="preserve"> A positive whole number that is unused in this map. Index 777 is reserved and cannot be defined. The form’s number is not a count or coordinate.</w:t>
+        <w:t xml:space="preserve"> A positive whole number assigned by the editor; 777 is reserved. You cannot type into this field. Imported numbers are preserved.</w:t>
       </w:r>
     </w:p>
     <w:p>
@@ -5808,7 +5922,118 @@
         <w:t>Example:</w:t>
       </w:r>
       <w:r>
-        <w:t xml:space="preserve"> A definition at index 10 becomes </w:t>
+        <w:t xml:space="preserve"> [Block.10] is placed by (8,5)10. Another map may have a different Block 10. Creating or duplicating a block receives a fresh number; deleting Block 5 does not renumber Block 6.</w:t>
+      </w:r>
+    </w:p>
+    <w:p>
+      <w:r>
+        <w:rPr>
+          <w:b/>
+        </w:rPr>
+        <w:t>Creative use:</w:t>
+      </w:r>
+      <w:r>
+        <w:t xml:space="preserve"> Give objects meaningful descriptions and let the app handle their filing numbers. Copy the index when comparing an exported row with graph paper.</w:t>
+      </w:r>
+    </w:p>
+    <w:p>
+      <w:r>
+        <w:rPr>
+          <w:b/>
+        </w:rPr>
+        <w:t>Connections:</w:t>
+      </w:r>
+      <w:r>
+        <w:t xml:space="preserve"> [EditorIDs] stores the next unused numbers. Keep it in exported files. Numbers stay reserved after deletion and undo, and exports retain those reservations across reopening. Gaps are intentional. Text / INI remains an advanced editor: manually changing an index there requires correcting its placements, and validation still checks conflicts.</w:t>
+      </w:r>
+    </w:p>
+    <w:p>
+      <w:pPr>
+        <w:pStyle w:val="Heading2"/>
+      </w:pPr>
+      <w:r>
+        <w:t>Type</w:t>
+      </w:r>
+    </w:p>
+    <w:p>
+      <w:r>
+        <w:rPr>
+          <w:b/>
+        </w:rPr>
+        <w:t>What it does:</w:t>
+      </w:r>
+      <w:r>
+        <w:t xml:space="preserve"> Selects the main behavior. </w:t>
+      </w:r>
+      <w:r>
+        <w:rPr>
+          <w:b/>
+        </w:rPr>
+        <w:t>Valid settings:</w:t>
+      </w:r>
+      <w:r>
+        <w:t xml:space="preserve"> Move, Wall, Interaction, or Inventory. The matching NID category must be 1, 2, 3, or 4 respectively.</w:t>
+      </w:r>
+    </w:p>
+    <w:p>
+      <w:r>
+        <w:rPr>
+          <w:b/>
+        </w:rPr>
+        <w:t>Example:</w:t>
+      </w:r>
+      <w:r>
+        <w:t xml:space="preserve"> A removable tree is Interaction even if its picture is exactly the ordinary Wall tree. A chest is usually Interaction; the sword inside it is Inventory.</w:t>
+      </w:r>
+    </w:p>
+    <w:p>
+      <w:r>
+        <w:rPr>
+          <w:b/>
+        </w:rPr>
+        <w:t>Creative use:</w:t>
+      </w:r>
+      <w:r>
+        <w:t xml:space="preserve"> Reusing a picture with a different Type creates secrets. A “door” picture can be Move for a permanently open doorway, or Interaction for a puzzle that blocks passage.</w:t>
+      </w:r>
+    </w:p>
+    <w:p>
+      <w:r>
+        <w:rPr>
+          <w:b/>
+        </w:rPr>
+        <w:t>Connections:</w:t>
+      </w:r>
+      <w:r>
+        <w:t xml:space="preserve"> Changing Type changes which form fields are relevant, assigns a matching-category NID, and may remove interaction choices after confirmation. A default block cannot become a Wall or Interaction while it is still the map default. Read the NID again after changing Type so references are intentional.</w:t>
+      </w:r>
+    </w:p>
+    <w:p>
+      <w:pPr>
+        <w:pStyle w:val="Heading2"/>
+      </w:pPr>
+      <w:r>
+        <w:t>Full NID</w:t>
+      </w:r>
+    </w:p>
+    <w:p>
+      <w:r>
+        <w:rPr>
+          <w:b/>
+        </w:rPr>
+        <w:t>What it does:</w:t>
+      </w:r>
+      <w:r>
+        <w:t xml:space="preserve"> Names the definition for tests, rewards, replacements, and cross-map inventory. </w:t>
+      </w:r>
+      <w:r>
+        <w:rPr>
+          <w:b/>
+        </w:rPr>
+        <w:t>Valid setting:</w:t>
+      </w:r>
+      <w:r>
+        <w:t xml:space="preserve"> </w:t>
       </w:r>
       <w:r>
         <w:rPr>
@@ -5816,10 +6041,10 @@
           <w:color w:val="214C3D"/>
           <w:sz w:val="20"/>
         </w:rPr>
-        <w:t>[Block.10]</w:t>
-      </w:r>
-      <w:r>
-        <w:t xml:space="preserve">; layout </w:t>
+        <w:t>map/category.unique</w:t>
+      </w:r>
+      <w:r>
+        <w:t xml:space="preserve">, such as </w:t>
       </w:r>
       <w:r>
         <w:rPr>
@@ -5827,10 +6052,21 @@
           <w:color w:val="214C3D"/>
           <w:sz w:val="20"/>
         </w:rPr>
-        <w:t>(8,5)10</w:t>
-      </w:r>
-      <w:r>
-        <w:t xml:space="preserve"> places it at </w:t>
+        <w:t>1/4.1</w:t>
+      </w:r>
+      <w:r>
+        <w:t>. All pieces are positive whole-number labels; use category 1–4. The originating map prefix must match this map for a local definition. Each definition needs a distinct NID.</w:t>
+      </w:r>
+    </w:p>
+    <w:p>
+      <w:r>
+        <w:rPr>
+          <w:b/>
+        </w:rPr>
+        <w:t>Example:</w:t>
+      </w:r>
+      <w:r>
+        <w:t xml:space="preserve"> </w:t>
       </w:r>
       <w:r>
         <w:rPr>
@@ -5838,121 +6074,10 @@
           <w:color w:val="214C3D"/>
           <w:sz w:val="20"/>
         </w:rPr>
-        <w:t>(8,5)</w:t>
-      </w:r>
-      <w:r>
-        <w:t>. Another map can have its own block 10 with a different meaning.</w:t>
-      </w:r>
-    </w:p>
-    <w:p>
-      <w:r>
-        <w:rPr>
-          <w:b/>
-        </w:rPr>
-        <w:t>Creative use:</w:t>
-      </w:r>
-      <w:r>
-        <w:t xml:space="preserve"> You can keep common floors and walls at low indices and group interesting objects later, but the game does not require a special numbering order.</w:t>
-      </w:r>
-    </w:p>
-    <w:p>
-      <w:r>
-        <w:rPr>
-          <w:b/>
-        </w:rPr>
-        <w:t>Connections:</w:t>
-      </w:r>
-      <w:r>
-        <w:t xml:space="preserve"> Renumbering an existing block in the editor updates its placed cells and choice-section headings in this document. NIDs do not have to equal block indices. If you change indices by hand in raw text, also update every layout reference yourself.</w:t>
-      </w:r>
-    </w:p>
-    <w:p>
-      <w:pPr>
-        <w:pStyle w:val="Heading2"/>
-      </w:pPr>
-      <w:r>
-        <w:t>Type</w:t>
-      </w:r>
-    </w:p>
-    <w:p>
-      <w:r>
-        <w:rPr>
-          <w:b/>
-        </w:rPr>
-        <w:t>What it does:</w:t>
-      </w:r>
-      <w:r>
-        <w:t xml:space="preserve"> Selects the main behavior. </w:t>
-      </w:r>
-      <w:r>
-        <w:rPr>
-          <w:b/>
-        </w:rPr>
-        <w:t>Valid settings:</w:t>
-      </w:r>
-      <w:r>
-        <w:t xml:space="preserve"> Move, Wall, Interaction, or Inventory. The matching NID category must be 1, 2, 3, or 4 respectively.</w:t>
-      </w:r>
-    </w:p>
-    <w:p>
-      <w:r>
-        <w:rPr>
-          <w:b/>
-        </w:rPr>
-        <w:t>Example:</w:t>
-      </w:r>
-      <w:r>
-        <w:t xml:space="preserve"> A removable tree is Interaction even if its picture is exactly the ordinary Wall tree. A chest is usually Interaction; the sword inside it is Inventory.</w:t>
-      </w:r>
-    </w:p>
-    <w:p>
-      <w:r>
-        <w:rPr>
-          <w:b/>
-        </w:rPr>
-        <w:t>Creative use:</w:t>
-      </w:r>
-      <w:r>
-        <w:t xml:space="preserve"> Reusing a picture with a different Type creates secrets. A “door” picture can be Move for a permanently open doorway, or Interaction for a puzzle that blocks passage.</w:t>
-      </w:r>
-    </w:p>
-    <w:p>
-      <w:r>
-        <w:rPr>
-          <w:b/>
-        </w:rPr>
-        <w:t>Connections:</w:t>
-      </w:r>
-      <w:r>
-        <w:t xml:space="preserve"> Changing Type changes which form fields are relevant, suggests a matching-category NID, and may remove interaction choices after confirmation. A default block cannot become a Wall or Interaction while it is still the map default. Read the NID again after changing Type so references are intentional.</w:t>
-      </w:r>
-    </w:p>
-    <w:p>
-      <w:pPr>
-        <w:pStyle w:val="Heading2"/>
-      </w:pPr>
-      <w:r>
-        <w:t>Full NID</w:t>
-      </w:r>
-    </w:p>
-    <w:p>
-      <w:r>
-        <w:rPr>
-          <w:b/>
-        </w:rPr>
-        <w:t>What it does:</w:t>
-      </w:r>
-      <w:r>
-        <w:t xml:space="preserve"> Names the definition for tests, rewards, replacements, and cross-map inventory. </w:t>
-      </w:r>
-      <w:r>
-        <w:rPr>
-          <w:b/>
-        </w:rPr>
-        <w:t>Valid setting:</w:t>
-      </w:r>
-      <w:r>
-        <w:t xml:space="preserve"> </w:t>
+        <w:t>1/3.3</w:t>
+      </w:r>
+      <w:r>
+        <w:t xml:space="preserve"> identifies the sample door, while </w:t>
       </w:r>
       <w:r>
         <w:rPr>
@@ -5960,10 +6085,32 @@
           <w:color w:val="214C3D"/>
           <w:sz w:val="20"/>
         </w:rPr>
-        <w:t>map/category.unique</w:t>
-      </w:r>
-      <w:r>
-        <w:t xml:space="preserve">, such as </w:t>
+        <w:t>1/4.1</w:t>
+      </w:r>
+      <w:r>
+        <w:t xml:space="preserve"> identifies its matching regular key. Their matching rule, not similar numbers, connects them.</w:t>
+      </w:r>
+    </w:p>
+    <w:p>
+      <w:r>
+        <w:rPr>
+          <w:b/>
+        </w:rPr>
+        <w:t>Creative use:</w:t>
+      </w:r>
+      <w:r>
+        <w:t xml:space="preserve"> Different key NIDs let you invent brass, silver, and master locks. Two sword NIDs can have different power or state, even if they share a picture.</w:t>
+      </w:r>
+    </w:p>
+    <w:p>
+      <w:r>
+        <w:rPr>
+          <w:b/>
+        </w:rPr>
+        <w:t>Connections:</w:t>
+      </w:r>
+      <w:r>
+        <w:t xml:space="preserve"> This field is read-only. Changing Type or the map number updates recognized NID references inside this map, including SelectionItems. Returning to the original Type before saving restores the original NID. It does not edit another map that accepts the old item, or rewrite a name tag mentioned in ordinary message text. Always check the other files when changing a shared item identity. Never shorten a reference to just </w:t>
       </w:r>
       <w:r>
         <w:rPr>
@@ -5971,10 +6118,18 @@
           <w:color w:val="214C3D"/>
           <w:sz w:val="20"/>
         </w:rPr>
-        <w:t>1/4.1</w:t>
-      </w:r>
-      <w:r>
-        <w:t>. All pieces are positive whole-number labels; use category 1–4. The originating map prefix must match this map for a local definition. Each definition needs a distinct NID.</w:t>
+        <w:t>4.1</w:t>
+      </w:r>
+      <w:r>
+        <w:t>.</w:t>
+      </w:r>
+    </w:p>
+    <w:p>
+      <w:pPr>
+        <w:pStyle w:val="Heading2"/>
+      </w:pPr>
+      <w:r>
+        <w:t>Name / description — Description</w:t>
       </w:r>
     </w:p>
     <w:p>
@@ -5982,10 +6137,52 @@
         <w:rPr>
           <w:b/>
         </w:rPr>
-        <w:t>Example:</w:t>
-      </w:r>
-      <w:r>
-        <w:t xml:space="preserve"> </w:t>
+        <w:t>What it does:</w:t>
+      </w:r>
+      <w:r>
+        <w:t xml:space="preserve"> Gives the block or item a readable name. </w:t>
+      </w:r>
+      <w:r>
+        <w:rPr>
+          <w:b/>
+        </w:rPr>
+        <w:t>Valid setting:</w:t>
+      </w:r>
+      <w:r>
+        <w:t xml:space="preserve"> Nonempty plain text, up to 160 characters in the form.</w:t>
+      </w:r>
+    </w:p>
+    <w:p>
+      <w:r>
+        <w:rPr>
+          <w:b/>
+        </w:rPr>
+        <w:t>Examples:</w:t>
+      </w:r>
+      <w:r>
+        <w:t xml:space="preserve"> Trail Boots, Standard Door, Sparkling Chest, or The Pig of the North Path. Be clear enough that the player can recognize items in a selection list.</w:t>
+      </w:r>
+    </w:p>
+    <w:p>
+      <w:r>
+        <w:rPr>
+          <w:b/>
+        </w:rPr>
+        <w:t>Creative use:</w:t>
+      </w:r>
+      <w:r>
+        <w:t xml:space="preserve"> Names can give clues without explaining the entire answer. “Hollow Tree” hints more than “Tree”; use “Tree” if you want the clue to appear only after an interaction attempt.</w:t>
+      </w:r>
+    </w:p>
+    <w:p>
+      <w:r>
+        <w:rPr>
+          <w:b/>
+        </w:rPr>
+        <w:t>Connections:</w:t>
+      </w:r>
+      <w:r>
+        <w:t xml:space="preserve"> The game uses this name for titles, inventory labels, and message placeholders such as </w:t>
       </w:r>
       <w:r>
         <w:rPr>
@@ -5993,10 +6190,10 @@
           <w:color w:val="214C3D"/>
           <w:sz w:val="20"/>
         </w:rPr>
-        <w:t>1/3.3</w:t>
-      </w:r>
-      <w:r>
-        <w:t xml:space="preserve"> identifies the sample door, while </w:t>
+        <w:t>{Target.Name}</w:t>
+      </w:r>
+      <w:r>
+        <w:t xml:space="preserve"> and </w:t>
       </w:r>
       <w:r>
         <w:rPr>
@@ -6004,10 +6201,18 @@
           <w:color w:val="214C3D"/>
           <w:sz w:val="20"/>
         </w:rPr>
-        <w:t>1/4.1</w:t>
-      </w:r>
-      <w:r>
-        <w:t xml:space="preserve"> identifies its matching regular key. Their matching rule, not similar numbers, connects them.</w:t>
+        <w:t>{SelectedItem.Name}</w:t>
+      </w:r>
+      <w:r>
+        <w:t>. Changing a name does not change the NID or the block’s rules. The name is not a function name or a command.</w:t>
+      </w:r>
+    </w:p>
+    <w:p>
+      <w:pPr>
+        <w:pStyle w:val="Heading2"/>
+      </w:pPr>
+      <w:r>
+        <w:t>Map image path — MapImage</w:t>
       </w:r>
     </w:p>
     <w:p>
@@ -6015,21 +6220,19 @@
         <w:rPr>
           <w:b/>
         </w:rPr>
-        <w:t>Creative use:</w:t>
-      </w:r>
-      <w:r>
-        <w:t xml:space="preserve"> Different key NIDs let you invent brass, silver, and master locks. Two sword NIDs can have different power or state, even if they share a picture.</w:t>
-      </w:r>
-    </w:p>
-    <w:p>
+        <w:t>What it does:</w:t>
+      </w:r>
+      <w:r>
+        <w:t xml:space="preserve"> Chooses the picture displayed for the block’s cell. </w:t>
+      </w:r>
       <w:r>
         <w:rPr>
           <w:b/>
         </w:rPr>
-        <w:t>Connections:</w:t>
-      </w:r>
-      <w:r>
-        <w:t xml:space="preserve"> Renaming through the editor updates recognized NID references inside this map. It does not edit another map that accepts the old item, or rewrite a name tag mentioned in ordinary message text. Always check the other files when changing a shared item identity. Never shorten a reference to just </w:t>
+        <w:t>Valid setting:</w:t>
+      </w:r>
+      <w:r>
+        <w:t xml:space="preserve"> A relative picture path, @Name image catalog alias, or HTTP(S) URL; use HTTPS for public hosting. This field is required. Script, data, and local </w:t>
       </w:r>
       <w:r>
         <w:rPr>
@@ -6037,18 +6240,10 @@
           <w:color w:val="214C3D"/>
           <w:sz w:val="20"/>
         </w:rPr>
-        <w:t>4.1</w:t>
-      </w:r>
-      <w:r>
-        <w:t>.</w:t>
-      </w:r>
-    </w:p>
-    <w:p>
-      <w:pPr>
-        <w:pStyle w:val="Heading2"/>
-      </w:pPr>
-      <w:r>
-        <w:t>Name / description — Description</w:t>
+        <w:t>file:</w:t>
+      </w:r>
+      <w:r>
+        <w:t xml:space="preserve"> URLs are not exportable picture paths.</w:t>
       </w:r>
     </w:p>
     <w:p>
@@ -6056,52 +6251,10 @@
         <w:rPr>
           <w:b/>
         </w:rPr>
-        <w:t>What it does:</w:t>
-      </w:r>
-      <w:r>
-        <w:t xml:space="preserve"> Gives the block or item a readable name. </w:t>
-      </w:r>
-      <w:r>
-        <w:rPr>
-          <w:b/>
-        </w:rPr>
-        <w:t>Valid setting:</w:t>
-      </w:r>
-      <w:r>
-        <w:t xml:space="preserve"> Nonempty plain text, up to 160 characters in the form.</w:t>
-      </w:r>
-    </w:p>
-    <w:p>
-      <w:r>
-        <w:rPr>
-          <w:b/>
-        </w:rPr>
         <w:t>Examples:</w:t>
       </w:r>
       <w:r>
-        <w:t xml:space="preserve"> Trail Boots, Standard Door, Sparkling Chest, or The Pig of the North Path. Be clear enough that the player can recognize items in a selection list.</w:t>
-      </w:r>
-    </w:p>
-    <w:p>
-      <w:r>
-        <w:rPr>
-          <w:b/>
-        </w:rPr>
-        <w:t>Creative use:</w:t>
-      </w:r>
-      <w:r>
-        <w:t xml:space="preserve"> Names can give clues without explaining the entire answer. “Hollow Tree” hints more than “Tree”; use “Tree” if you want the clue to appear only after an interaction attempt.</w:t>
-      </w:r>
-    </w:p>
-    <w:p>
-      <w:r>
-        <w:rPr>
-          <w:b/>
-        </w:rPr>
-        <w:t>Connections:</w:t>
-      </w:r>
-      <w:r>
-        <w:t xml:space="preserve"> The game uses this name for titles, inventory labels, and message placeholders such as </w:t>
+        <w:t xml:space="preserve"> </w:t>
       </w:r>
       <w:r>
         <w:rPr>
@@ -6109,10 +6262,10 @@
           <w:color w:val="214C3D"/>
           <w:sz w:val="20"/>
         </w:rPr>
-        <w:t>{Target.Name}</w:t>
-      </w:r>
-      <w:r>
-        <w:t xml:space="preserve"> and </w:t>
+        <w:t>../assets/tree.png</w:t>
+      </w:r>
+      <w:r>
+        <w:t xml:space="preserve"> from a map in the maps folder, or </w:t>
       </w:r>
       <w:r>
         <w:rPr>
@@ -6120,10 +6273,32 @@
           <w:color w:val="214C3D"/>
           <w:sz w:val="20"/>
         </w:rPr>
-        <w:t>{SelectedItem.Name}</w:t>
-      </w:r>
-      <w:r>
-        <w:t>. Changing a name does not change the NID or the block’s rules. The name is not a function name or a command.</w:t>
+        <w:t>https://your-site.example/uploads/tree.png</w:t>
+      </w:r>
+      <w:r>
+        <w:t xml:space="preserve"> after uploading a picture.</w:t>
+      </w:r>
+    </w:p>
+    <w:p>
+      <w:r>
+        <w:rPr>
+          <w:b/>
+        </w:rPr>
+        <w:t>Creative use:</w:t>
+      </w:r>
+      <w:r>
+        <w:t xml:space="preserve"> Change art to turn a forest puzzle into an ice-cave puzzle without changing the rule system. An interaction tree can deliberately share its image with a Wall tree.</w:t>
+      </w:r>
+    </w:p>
+    <w:p>
+      <w:r>
+        <w:rPr>
+          <w:b/>
+        </w:rPr>
+        <w:t>Connections:</w:t>
+      </w:r>
+      <w:r>
+        <w:t xml:space="preserve"> The game resolves relative paths from the map file’s URL, not the editor’s location or the WordPress page. Standard cells display at 32×32 pixels. An editor preview does not prove a picture has been uploaded. Keep the actual image file separate and publish it at the path you wrote.</w:t>
       </w:r>
     </w:p>
     <w:p>
@@ -6131,7 +6306,7 @@
         <w:pStyle w:val="Heading2"/>
       </w:pPr>
       <w:r>
-        <w:t>Map image path — MapImage</w:t>
+        <w:t>Popup image path — InteractionImage</w:t>
       </w:r>
     </w:p>
     <w:p>
@@ -6142,7 +6317,7 @@
         <w:t>What it does:</w:t>
       </w:r>
       <w:r>
-        <w:t xml:space="preserve"> Chooses the picture displayed for the block’s cell. </w:t>
+        <w:t xml:space="preserve"> Chooses the larger picture in an interaction or pickup popup. </w:t>
       </w:r>
       <w:r>
         <w:rPr>
@@ -6151,7 +6326,18 @@
         <w:t>Valid setting:</w:t>
       </w:r>
       <w:r>
-        <w:t xml:space="preserve"> A relative picture path or HTTP(S) URL; use HTTPS for public hosting. This field is required. Script, data, and local </w:t>
+        <w:t xml:space="preserve"> A picture path/URL like MapImage, or blank to reuse MapImage.</w:t>
+      </w:r>
+    </w:p>
+    <w:p>
+      <w:r>
+        <w:rPr>
+          <w:b/>
+        </w:rPr>
+        <w:t>Example:</w:t>
+      </w:r>
+      <w:r>
+        <w:t xml:space="preserve"> Keep </w:t>
       </w:r>
       <w:r>
         <w:rPr>
@@ -6159,21 +6345,10 @@
           <w:color w:val="214C3D"/>
           <w:sz w:val="20"/>
         </w:rPr>
-        <w:t>file:</w:t>
-      </w:r>
-      <w:r>
-        <w:t xml:space="preserve"> URLs are not exportable picture paths.</w:t>
-      </w:r>
-    </w:p>
-    <w:p>
-      <w:r>
-        <w:rPr>
-          <w:b/>
-        </w:rPr>
-        <w:t>Examples:</w:t>
-      </w:r>
-      <w:r>
-        <w:t xml:space="preserve"> </w:t>
+        <w:t>../assets/pig.png</w:t>
+      </w:r>
+      <w:r>
+        <w:t xml:space="preserve"> for the tile but use </w:t>
       </w:r>
       <w:r>
         <w:rPr>
@@ -6181,10 +6356,193 @@
           <w:color w:val="214C3D"/>
           <w:sz w:val="20"/>
         </w:rPr>
-        <w:t>../assets/tree.png</w:t>
-      </w:r>
-      <w:r>
-        <w:t xml:space="preserve"> from a map in the maps folder, or </w:t>
+        <w:t>../assets/pig-portrait.png</w:t>
+      </w:r>
+      <w:r>
+        <w:t xml:space="preserve"> for a more expressive popup. A blank field is perfectly fine for the first draft.</w:t>
+      </w:r>
+    </w:p>
+    <w:p>
+      <w:r>
+        <w:rPr>
+          <w:b/>
+        </w:rPr>
+        <w:t>Creative use:</w:t>
+      </w:r>
+      <w:r>
+        <w:t xml:space="preserve"> A small chest tile can open into a detailed treasure drawing, or a mysterious wall symbol can have a readable close-up.</w:t>
+      </w:r>
+    </w:p>
+    <w:p>
+      <w:r>
+        <w:rPr>
+          <w:b/>
+        </w:rPr>
+        <w:t>Connections:</w:t>
+      </w:r>
+      <w:r>
+        <w:t xml:space="preserve"> This is still a separate image file; it is not embedded in map export. It does not change the block’s Type or rules. The editor’s local preview tools focus on palette/canvas map images; they are not a complete popup-art playtest. Check the actual game popup after publishing the image.</w:t>
+      </w:r>
+    </w:p>
+    <w:p>
+      <w:pPr>
+        <w:pStyle w:val="Heading2"/>
+      </w:pPr>
+      <w:r>
+        <w:t>Popup message — Message</w:t>
+      </w:r>
+    </w:p>
+    <w:p>
+      <w:r>
+        <w:rPr>
+          <w:b/>
+        </w:rPr>
+        <w:t>What it does:</w:t>
+      </w:r>
+      <w:r>
+        <w:t xml:space="preserve"> Describes what the player notices before choosing an action. </w:t>
+      </w:r>
+      <w:r>
+        <w:rPr>
+          <w:b/>
+        </w:rPr>
+        <w:t>Valid setting:</w:t>
+      </w:r>
+      <w:r>
+        <w:t xml:space="preserve"> Optional plain text. The form accepts wrapped typing and turns entered line breaks into spaces when saving; the specification stores one physical line per value.</w:t>
+      </w:r>
+    </w:p>
+    <w:p>
+      <w:r>
+        <w:rPr>
+          <w:b/>
+        </w:rPr>
+        <w:t>Example:</w:t>
+      </w:r>
+      <w:r>
+        <w:t xml:space="preserve"> “A wooden door blocks the trail. A brass keyhole waits below its handle.” This describes the situation; the later PASS/FAIL message explains the result.</w:t>
+      </w:r>
+    </w:p>
+    <w:p>
+      <w:r>
+        <w:rPr>
+          <w:b/>
+        </w:rPr>
+        <w:t>Creative use:</w:t>
+      </w:r>
+      <w:r>
+        <w:t xml:space="preserve"> Teach through clues: “Carrying boots is only half the job” hints that the player must wear them. A character can speak with humor, like an old text adventure.</w:t>
+      </w:r>
+    </w:p>
+    <w:p>
+      <w:r>
+        <w:rPr>
+          <w:b/>
+        </w:rPr>
+        <w:t>Connections:</w:t>
+      </w:r>
+      <w:r>
+        <w:t xml:space="preserve"> This field does not run tests or substitute outcome placeholders in the initial description. Use the exact supported placeholders in an outcome Message instead. HTML tags do not style it; they appear as text. Cancel text and choice labels are separate fields.</w:t>
+      </w:r>
+    </w:p>
+    <w:p>
+      <w:pPr>
+        <w:pStyle w:val="Heading2"/>
+      </w:pPr>
+      <w:r>
+        <w:t>Cancel text — CancelActionText</w:t>
+      </w:r>
+    </w:p>
+    <w:p>
+      <w:r>
+        <w:rPr>
+          <w:b/>
+        </w:rPr>
+        <w:t>What it does:</w:t>
+      </w:r>
+      <w:r>
+        <w:t xml:space="preserve"> Labels the interaction’s safe way to leave. </w:t>
+      </w:r>
+      <w:r>
+        <w:rPr>
+          <w:b/>
+        </w:rPr>
+        <w:t>Valid setting:</w:t>
+      </w:r>
+      <w:r>
+        <w:t xml:space="preserve"> Optional plain text; blank defaults to Leave.</w:t>
+      </w:r>
+    </w:p>
+    <w:p>
+      <w:r>
+        <w:rPr>
+          <w:b/>
+        </w:rPr>
+        <w:t>Examples:</w:t>
+      </w:r>
+      <w:r>
+        <w:t xml:space="preserve"> Back away quietly, Leave the chest alone, or Think about it. The label can fit the character or mood.</w:t>
+      </w:r>
+    </w:p>
+    <w:p>
+      <w:r>
+        <w:rPr>
+          <w:b/>
+        </w:rPr>
+        <w:t>Creative use:</w:t>
+      </w:r>
+      <w:r>
+        <w:t xml:space="preserve"> A funny cancel line adds personality without changing the puzzle. “Politely retreat” fits a proud pig; “Keep my eyebrows” fits an uncertain bomb experiment.</w:t>
+      </w:r>
+    </w:p>
+    <w:p>
+      <w:r>
+        <w:rPr>
+          <w:b/>
+        </w:rPr>
+        <w:t>Connections:</w:t>
+      </w:r>
+      <w:r>
+        <w:t xml:space="preserve"> Cancel is automatically provided for normal Interactions and does not run PASS or FAIL outcomes. It does not consume an item or enter the cell. Do not create an automatic-PASS choice called Run away and assume it is cancel; a normal choice still applies its outcomes and default replacement.</w:t>
+      </w:r>
+    </w:p>
+    <w:p>
+      <w:pPr>
+        <w:pStyle w:val="Heading2"/>
+      </w:pPr>
+      <w:r>
+        <w:t>Required power — RequiredPower</w:t>
+      </w:r>
+    </w:p>
+    <w:p>
+      <w:r>
+        <w:rPr>
+          <w:b/>
+        </w:rPr>
+        <w:t>What it does:</w:t>
+      </w:r>
+      <w:r>
+        <w:t xml:space="preserve"> Stores a nonnegative whole-number strength on an Interaction. </w:t>
+      </w:r>
+      <w:r>
+        <w:rPr>
+          <w:b/>
+        </w:rPr>
+        <w:t>Valid setting:</w:t>
+      </w:r>
+      <w:r>
+        <w:t xml:space="preserve"> 0 or a larger whole number; blank defaults to 0.</w:t>
+      </w:r>
+    </w:p>
+    <w:p>
+      <w:r>
+        <w:rPr>
+          <w:b/>
+        </w:rPr>
+        <w:t>Example:</w:t>
+      </w:r>
+      <w:r>
+        <w:t xml:space="preserve"> A pig has Required power 6. An Attack choice tests </w:t>
       </w:r>
       <w:r>
         <w:rPr>
@@ -6192,283 +6550,6 @@
           <w:color w:val="214C3D"/>
           <w:sz w:val="20"/>
         </w:rPr>
-        <w:t>https://your-site.example/uploads/tree.png</w:t>
-      </w:r>
-      <w:r>
-        <w:t xml:space="preserve"> after uploading a picture.</w:t>
-      </w:r>
-    </w:p>
-    <w:p>
-      <w:r>
-        <w:rPr>
-          <w:b/>
-        </w:rPr>
-        <w:t>Creative use:</w:t>
-      </w:r>
-      <w:r>
-        <w:t xml:space="preserve"> Change art to turn a forest puzzle into an ice-cave puzzle without changing the rule system. An interaction tree can deliberately share its image with a Wall tree.</w:t>
-      </w:r>
-    </w:p>
-    <w:p>
-      <w:r>
-        <w:rPr>
-          <w:b/>
-        </w:rPr>
-        <w:t>Connections:</w:t>
-      </w:r>
-      <w:r>
-        <w:t xml:space="preserve"> The game resolves relative paths from the map file’s URL, not the editor’s location or the WordPress page. Standard cells display at 32×32 pixels. An editor preview does not prove a picture has been uploaded. Keep the actual image file separate and publish it at the path you wrote.</w:t>
-      </w:r>
-    </w:p>
-    <w:p>
-      <w:pPr>
-        <w:pStyle w:val="Heading2"/>
-      </w:pPr>
-      <w:r>
-        <w:t>Popup image path — InteractionImage</w:t>
-      </w:r>
-    </w:p>
-    <w:p>
-      <w:r>
-        <w:rPr>
-          <w:b/>
-        </w:rPr>
-        <w:t>What it does:</w:t>
-      </w:r>
-      <w:r>
-        <w:t xml:space="preserve"> Chooses the larger picture in an interaction or pickup popup. </w:t>
-      </w:r>
-      <w:r>
-        <w:rPr>
-          <w:b/>
-        </w:rPr>
-        <w:t>Valid setting:</w:t>
-      </w:r>
-      <w:r>
-        <w:t xml:space="preserve"> A picture path/URL like MapImage, or blank to reuse MapImage.</w:t>
-      </w:r>
-    </w:p>
-    <w:p>
-      <w:r>
-        <w:rPr>
-          <w:b/>
-        </w:rPr>
-        <w:t>Example:</w:t>
-      </w:r>
-      <w:r>
-        <w:t xml:space="preserve"> Keep </w:t>
-      </w:r>
-      <w:r>
-        <w:rPr>
-          <w:rFonts w:ascii="Consolas" w:hAnsi="Consolas"/>
-          <w:color w:val="214C3D"/>
-          <w:sz w:val="20"/>
-        </w:rPr>
-        <w:t>../assets/pig.png</w:t>
-      </w:r>
-      <w:r>
-        <w:t xml:space="preserve"> for the tile but use </w:t>
-      </w:r>
-      <w:r>
-        <w:rPr>
-          <w:rFonts w:ascii="Consolas" w:hAnsi="Consolas"/>
-          <w:color w:val="214C3D"/>
-          <w:sz w:val="20"/>
-        </w:rPr>
-        <w:t>../assets/pig-portrait.png</w:t>
-      </w:r>
-      <w:r>
-        <w:t xml:space="preserve"> for a more expressive popup. A blank field is perfectly fine for the first draft.</w:t>
-      </w:r>
-    </w:p>
-    <w:p>
-      <w:r>
-        <w:rPr>
-          <w:b/>
-        </w:rPr>
-        <w:t>Creative use:</w:t>
-      </w:r>
-      <w:r>
-        <w:t xml:space="preserve"> A small chest tile can open into a detailed treasure drawing, or a mysterious wall symbol can have a readable close-up.</w:t>
-      </w:r>
-    </w:p>
-    <w:p>
-      <w:r>
-        <w:rPr>
-          <w:b/>
-        </w:rPr>
-        <w:t>Connections:</w:t>
-      </w:r>
-      <w:r>
-        <w:t xml:space="preserve"> This is still a separate image file; it is not embedded in map export. It does not change the block’s Type or rules. The editor’s local preview tools focus on palette/canvas map images; they are not a complete popup-art playtest. Check the actual game popup after publishing the image.</w:t>
-      </w:r>
-    </w:p>
-    <w:p>
-      <w:pPr>
-        <w:pStyle w:val="Heading2"/>
-      </w:pPr>
-      <w:r>
-        <w:t>Popup message — Message</w:t>
-      </w:r>
-    </w:p>
-    <w:p>
-      <w:r>
-        <w:rPr>
-          <w:b/>
-        </w:rPr>
-        <w:t>What it does:</w:t>
-      </w:r>
-      <w:r>
-        <w:t xml:space="preserve"> Describes what the player notices before choosing an action. </w:t>
-      </w:r>
-      <w:r>
-        <w:rPr>
-          <w:b/>
-        </w:rPr>
-        <w:t>Valid setting:</w:t>
-      </w:r>
-      <w:r>
-        <w:t xml:space="preserve"> Optional plain text. The form accepts wrapped typing and turns entered line breaks into spaces when saving; the specification stores one physical line per value.</w:t>
-      </w:r>
-    </w:p>
-    <w:p>
-      <w:r>
-        <w:rPr>
-          <w:b/>
-        </w:rPr>
-        <w:t>Example:</w:t>
-      </w:r>
-      <w:r>
-        <w:t xml:space="preserve"> “A wooden door blocks the trail. A brass keyhole waits below its handle.” This describes the situation; the later PASS/FAIL message explains the result.</w:t>
-      </w:r>
-    </w:p>
-    <w:p>
-      <w:r>
-        <w:rPr>
-          <w:b/>
-        </w:rPr>
-        <w:t>Creative use:</w:t>
-      </w:r>
-      <w:r>
-        <w:t xml:space="preserve"> Teach through clues: “Carrying boots is only half the job” hints that the player must wear them. A character can speak with humor, like an old text adventure.</w:t>
-      </w:r>
-    </w:p>
-    <w:p>
-      <w:r>
-        <w:rPr>
-          <w:b/>
-        </w:rPr>
-        <w:t>Connections:</w:t>
-      </w:r>
-      <w:r>
-        <w:t xml:space="preserve"> This field does not run tests or substitute outcome placeholders in the initial description. Use the exact supported placeholders in an outcome Message instead. HTML tags do not style it; they appear as text. Cancel text and choice labels are separate fields.</w:t>
-      </w:r>
-    </w:p>
-    <w:p>
-      <w:pPr>
-        <w:pStyle w:val="Heading2"/>
-      </w:pPr>
-      <w:r>
-        <w:t>Cancel text — CancelActionText</w:t>
-      </w:r>
-    </w:p>
-    <w:p>
-      <w:r>
-        <w:rPr>
-          <w:b/>
-        </w:rPr>
-        <w:t>What it does:</w:t>
-      </w:r>
-      <w:r>
-        <w:t xml:space="preserve"> Labels the interaction’s safe way to leave. </w:t>
-      </w:r>
-      <w:r>
-        <w:rPr>
-          <w:b/>
-        </w:rPr>
-        <w:t>Valid setting:</w:t>
-      </w:r>
-      <w:r>
-        <w:t xml:space="preserve"> Optional plain text; blank defaults to Leave.</w:t>
-      </w:r>
-    </w:p>
-    <w:p>
-      <w:r>
-        <w:rPr>
-          <w:b/>
-        </w:rPr>
-        <w:t>Examples:</w:t>
-      </w:r>
-      <w:r>
-        <w:t xml:space="preserve"> Back away quietly, Leave the chest alone, or Think about it. The label can fit the character or mood.</w:t>
-      </w:r>
-    </w:p>
-    <w:p>
-      <w:r>
-        <w:rPr>
-          <w:b/>
-        </w:rPr>
-        <w:t>Creative use:</w:t>
-      </w:r>
-      <w:r>
-        <w:t xml:space="preserve"> A funny cancel line adds personality without changing the puzzle. “Politely retreat” fits a proud pig; “Keep my eyebrows” fits an uncertain bomb experiment.</w:t>
-      </w:r>
-    </w:p>
-    <w:p>
-      <w:r>
-        <w:rPr>
-          <w:b/>
-        </w:rPr>
-        <w:t>Connections:</w:t>
-      </w:r>
-      <w:r>
-        <w:t xml:space="preserve"> Cancel is automatically provided for normal Interactions and does not run PASS or FAIL outcomes. It does not consume an item or enter the cell. Do not create an automatic-PASS choice called Run away and assume it is cancel; a normal choice still applies its outcomes and default replacement.</w:t>
-      </w:r>
-    </w:p>
-    <w:p>
-      <w:pPr>
-        <w:pStyle w:val="Heading2"/>
-      </w:pPr>
-      <w:r>
-        <w:t>Required power — RequiredPower</w:t>
-      </w:r>
-    </w:p>
-    <w:p>
-      <w:r>
-        <w:rPr>
-          <w:b/>
-        </w:rPr>
-        <w:t>What it does:</w:t>
-      </w:r>
-      <w:r>
-        <w:t xml:space="preserve"> Stores a nonnegative whole-number strength on an Interaction. </w:t>
-      </w:r>
-      <w:r>
-        <w:rPr>
-          <w:b/>
-        </w:rPr>
-        <w:t>Valid setting:</w:t>
-      </w:r>
-      <w:r>
-        <w:t xml:space="preserve"> 0 or a larger whole number; blank defaults to 0.</w:t>
-      </w:r>
-    </w:p>
-    <w:p>
-      <w:r>
-        <w:rPr>
-          <w:b/>
-        </w:rPr>
-        <w:t>Example:</w:t>
-      </w:r>
-      <w:r>
-        <w:t xml:space="preserve"> A pig has Required power 6. An Attack choice tests </w:t>
-      </w:r>
-      <w:r>
-        <w:rPr>
-          <w:rFonts w:ascii="Consolas" w:hAnsi="Consolas"/>
-          <w:color w:val="214C3D"/>
-          <w:sz w:val="20"/>
-        </w:rPr>
         <w:t>SelectedItem.Power | GreaterThan | Target.RequiredPower</w:t>
       </w:r>
       <w:r>
@@ -6520,8 +6601,8 @@
       <w:r>
         <w:drawing>
           <wp:inline xmlns:a="http://schemas.openxmlformats.org/drawingml/2006/main" xmlns:pic="http://schemas.openxmlformats.org/drawingml/2006/picture">
-            <wp:extent cx="6080760" cy="3598424"/>
-            <wp:docPr id="6" name="Picture 6" descr="Wearable inventory fields"/>
+            <wp:extent cx="6080760" cy="4828123"/>
+            <wp:docPr id="7" name="Picture 7" descr="Wearable inventory fields"/>
             <wp:cNvGraphicFramePr>
               <a:graphicFrameLocks noChangeAspect="1"/>
             </wp:cNvGraphicFramePr>
@@ -6533,7 +6614,7 @@
                     <pic:cNvPicPr/>
                   </pic:nvPicPr>
                   <pic:blipFill>
-                    <a:blip r:embed="rId16"/>
+                    <a:blip r:embed="rId17"/>
                     <a:stretch>
                       <a:fillRect/>
                     </a:stretch>
@@ -6541,7 +6622,7 @@
                   <pic:spPr>
                     <a:xfrm>
                       <a:off x="0" y="0"/>
-                      <a:ext cx="6080760" cy="3598424"/>
+                      <a:ext cx="6080760" cy="4828123"/>
                     </a:xfrm>
                     <a:prstGeom prst="rect"/>
                   </pic:spPr>
@@ -8057,17 +8138,71 @@
     </w:p>
     <w:p>
       <w:pPr>
-        <w:pStyle w:val="Heading1"/>
-      </w:pPr>
-      <w:bookmarkStart w:id="8" w:name="chapter_8"/>
-      <w:r>
-        <w:t>8. Every choice field and control</w:t>
-      </w:r>
-      <w:bookmarkEnd w:id="8"/>
-    </w:p>
-    <w:p>
-      <w:r>
-        <w:t>An Interaction needs at least one choice. Each choice gets its own action, tests, and two possible outcomes. The game displays the block’s title, description and picture, then offers these choices and the separate cancel button.</w:t>
+        <w:pStyle w:val="Heading2"/>
+      </w:pPr>
+      <w:r>
+        <w:t>Item group — ItemGroup</w:t>
+      </w:r>
+    </w:p>
+    <w:p>
+      <w:r>
+        <w:rPr>
+          <w:b/>
+        </w:rPr>
+        <w:t>What it does:</w:t>
+      </w:r>
+      <w:r>
+        <w:t xml:space="preserve"> Gives an Inventory definition a simple classification that interaction choices can use to shorten their lists. </w:t>
+      </w:r>
+      <w:r>
+        <w:rPr>
+          <w:b/>
+        </w:rPr>
+        <w:t>Valid setting:</w:t>
+      </w:r>
+      <w:r>
+        <w:t xml:space="preserve"> Optional single label starting with a letter, followed by letters, digits, underscores, or hyphens; at most 64 characters. Labels are case-sensitive.</w:t>
+      </w:r>
+    </w:p>
+    <w:p>
+      <w:r>
+        <w:rPr>
+          <w:b/>
+        </w:rPr>
+        <w:t>Examples:</w:t>
+      </w:r>
+      <w:r>
+        <w:t xml:space="preserve"> Key, Coin, Potion, Garden_Key. Give both the standard key and master key ItemGroup: Key. A door choice can then use SelectionGroup: Key.</w:t>
+      </w:r>
+    </w:p>
+    <w:p>
+      <w:r>
+        <w:rPr>
+          <w:b/>
+        </w:rPr>
+        <w:t>Creative use:</w:t>
+      </w:r>
+      <w:r>
+        <w:t xml:space="preserve"> A merchant can offer to trade only Coins; a fountain can offer to use only Potions. This controls which items appear, while tests still decide whether the selected object works.</w:t>
+      </w:r>
+    </w:p>
+    <w:p>
+      <w:r>
+        <w:rPr>
+          <w:b/>
+        </w:rPr>
+        <w:t>Connections:</w:t>
+      </w:r>
+      <w:r>
+        <w:t xml:space="preserve"> An item has one group. A group is not its ItemKind, power, state, or NID. UseInventory still offers only regular Items, and Attack only currently wielded Weapons. Group labels do not bypass those action restrictions.</w:t>
+      </w:r>
+    </w:p>
+    <w:p>
+      <w:pPr>
+        <w:pStyle w:val="Heading2"/>
+      </w:pPr>
+      <w:r>
+        <w:t>The compact bag: groups, counts, equipment, and discarding</w:t>
       </w:r>
     </w:p>
     <w:p>
@@ -8078,8 +8213,91 @@
       <w:r>
         <w:drawing>
           <wp:inline xmlns:a="http://schemas.openxmlformats.org/drawingml/2006/main" xmlns:pic="http://schemas.openxmlformats.org/drawingml/2006/picture">
-            <wp:extent cx="6080760" cy="953452"/>
-            <wp:docPr id="7" name="Picture 7" descr="The action and choice fields"/>
+            <wp:extent cx="6080760" cy="4290314"/>
+            <wp:docPr id="8" name="Picture 8" descr="A compact inventory stack with a discard action"/>
+            <wp:cNvGraphicFramePr>
+              <a:graphicFrameLocks noChangeAspect="1"/>
+            </wp:cNvGraphicFramePr>
+            <a:graphic>
+              <a:graphicData uri="http://schemas.openxmlformats.org/drawingml/2006/picture">
+                <pic:pic>
+                  <pic:nvPicPr>
+                    <pic:cNvPr id="0" name="inventory-bag.png"/>
+                    <pic:cNvPicPr/>
+                  </pic:nvPicPr>
+                  <pic:blipFill>
+                    <a:blip r:embed="rId18"/>
+                    <a:stretch>
+                      <a:fillRect/>
+                    </a:stretch>
+                  </pic:blipFill>
+                  <pic:spPr>
+                    <a:xfrm>
+                      <a:off x="0" y="0"/>
+                      <a:ext cx="6080760" cy="4290314"/>
+                    </a:xfrm>
+                    <a:prstGeom prst="rect"/>
+                  </pic:spPr>
+                </pic:pic>
+              </a:graphicData>
+            </a:graphic>
+          </wp:inline>
+        </w:drawing>
+      </w:r>
+    </w:p>
+    <w:p>
+      <w:pPr>
+        <w:pStyle w:val="GuideCaption"/>
+      </w:pPr>
+      <w:r>
+        <w:t>A compact inventory stack with a discard action</w:t>
+      </w:r>
+    </w:p>
+    <w:p>
+      <w:r>
+        <w:t>Inventory opens from the map toolbar. The bag shows an Equipped summary and collapsible source-map groups. Inside them, one expandable row represents each full NID. Inventory: 8 means eight owned copies, including equipped ones. A single copy has no quantity suffix. Equipped copies receive an equipped indicator.</w:t>
+      </w:r>
+    </w:p>
+    <w:p>
+      <w:r>
+        <w:t>Expand a row for state-specific details and Wear, Wield, Put away, or Discard one. Copies remain separate in memory. A Working and Cursed version may share a row, but their expanded actions and interaction selection distinguish those conditions. A two-handed weapon remains one owned copy, not two.</w:t>
+      </w:r>
+    </w:p>
+    <w:p>
+      <w:r>
+        <w:t>Discard one asks for confirmation naming the object. Canceling keeps everything. Confirming removes one unequipped copy permanently for that run; it does not paint a new object on the map or restore the pickup cell. Put an equipped item away before discarding it. Discarding a needed last key can make a puzzle impossible, so designers should test that consequence or provide a spare-item chest. Restarting a game starts fresh; reentering a map keeps the current run’s changes.</w:t>
+      </w:r>
+    </w:p>
+    <w:p>
+      <w:r>
+        <w:t>The bag scrolls within a bounded window, with its Close button kept at the top. Collapsing a map group hides its rows without removing anything. Counts still match Inventory.Quantity tests; display stacking never combines equipment slots or changes puzzle results.</w:t>
+      </w:r>
+    </w:p>
+    <w:p>
+      <w:pPr>
+        <w:pStyle w:val="Heading1"/>
+      </w:pPr>
+      <w:bookmarkStart w:id="8" w:name="chapter_8"/>
+      <w:r>
+        <w:t>8. Every choice field and control</w:t>
+      </w:r>
+      <w:bookmarkEnd w:id="8"/>
+    </w:p>
+    <w:p>
+      <w:r>
+        <w:t>An Interaction needs at least one choice. Each choice gets its own action, tests, and two possible outcomes. The game displays the block’s title, description and picture, then offers these choices and the separate cancel button.</w:t>
+      </w:r>
+    </w:p>
+    <w:p>
+      <w:pPr>
+        <w:keepNext/>
+        <w:jc w:val="center"/>
+      </w:pPr>
+      <w:r>
+        <w:drawing>
+          <wp:inline xmlns:a="http://schemas.openxmlformats.org/drawingml/2006/main" xmlns:pic="http://schemas.openxmlformats.org/drawingml/2006/picture">
+            <wp:extent cx="6080760" cy="1993582"/>
+            <wp:docPr id="9" name="Picture 9" descr="The action and choice fields"/>
             <wp:cNvGraphicFramePr>
               <a:graphicFrameLocks noChangeAspect="1"/>
             </wp:cNvGraphicFramePr>
@@ -8091,7 +8309,7 @@
                     <pic:cNvPicPr/>
                   </pic:nvPicPr>
                   <pic:blipFill>
-                    <a:blip r:embed="rId17"/>
+                    <a:blip r:embed="rId19"/>
                     <a:stretch>
                       <a:fillRect/>
                     </a:stretch>
@@ -8099,7 +8317,7 @@
                   <pic:spPr>
                     <a:xfrm>
                       <a:off x="0" y="0"/>
-                      <a:ext cx="6080760" cy="953452"/>
+                      <a:ext cx="6080760" cy="1993582"/>
                     </a:xfrm>
                     <a:prstGeom prst="rect"/>
                   </pic:spPr>
@@ -8414,6 +8632,156 @@
     </w:p>
     <w:p>
       <w:pPr>
+        <w:pStyle w:val="Heading2"/>
+      </w:pPr>
+      <w:r>
+        <w:t>Offer these inventory NIDs — SelectionItems</w:t>
+      </w:r>
+    </w:p>
+    <w:p>
+      <w:r>
+        <w:rPr>
+          <w:b/>
+        </w:rPr>
+        <w:t>What it does:</w:t>
+      </w:r>
+      <w:r>
+        <w:t xml:space="preserve"> Optionally limits the second-step selection for one choice to listed, owned full NIDs. </w:t>
+      </w:r>
+      <w:r>
+        <w:rPr>
+          <w:b/>
+        </w:rPr>
+        <w:t>Valid setting:</w:t>
+      </w:r>
+      <w:r>
+        <w:t xml:space="preserve"> A pipe-separated list of full NIDs; blank uses the action’s normal eligible items. Each referenced definition must exist in this game, even when it originates on another map.</w:t>
+      </w:r>
+    </w:p>
+    <w:p>
+      <w:r>
+        <w:rPr>
+          <w:b/>
+        </w:rPr>
+        <w:t>Example:</w:t>
+      </w:r>
+      <w:r>
+        <w:t xml:space="preserve"> SelectionItems: 1/4.1 | 1/4.4 offers standard and master keys. A separate SelectedItem.ID Equal 1/4.1 test accepts only the standard key. The master key can still be a wrong guess. Identical copies with the same condition display once with a quantity; choosing the stack selects one actual copy.</w:t>
+      </w:r>
+    </w:p>
+    <w:p>
+      <w:r>
+        <w:rPr>
+          <w:b/>
+        </w:rPr>
+        <w:t>Creative use:</w:t>
+      </w:r>
+      <w:r>
+        <w:t xml:space="preserve"> Remove bombs, coins, and potions from a door’s selection list while retaining the puzzle of which key fits. Listing only the correct key gives a more guided puzzle.</w:t>
+      </w:r>
+    </w:p>
+    <w:p>
+      <w:r>
+        <w:rPr>
+          <w:b/>
+        </w:rPr>
+        <w:t>Connections:</w:t>
+      </w:r>
+      <w:r>
+        <w:t xml:space="preserve"> This is a choice field, not a whole-block field. Another choice on the same object may offer a different list. The engine enforces the filter as well as the interface. Filtering does not grant PASS, spend an item, change a cell, or replace the choice’s tests. UseInventory cannot offer Weapons/Wearables; Attack cannot offer an unwielded weapon.</w:t>
+      </w:r>
+    </w:p>
+    <w:p>
+      <w:pPr>
+        <w:pStyle w:val="Heading2"/>
+      </w:pPr>
+      <w:r>
+        <w:t>Offer item group — SelectionGroup</w:t>
+      </w:r>
+    </w:p>
+    <w:p>
+      <w:r>
+        <w:rPr>
+          <w:b/>
+        </w:rPr>
+        <w:t>Valid setting:</w:t>
+      </w:r>
+      <w:r>
+        <w:t xml:space="preserve"> Optional ItemGroup label, using the same spelling and case as the Inventory definitions. </w:t>
+      </w:r>
+      <w:r>
+        <w:rPr>
+          <w:b/>
+        </w:rPr>
+        <w:t>Example:</w:t>
+      </w:r>
+      <w:r>
+        <w:t xml:space="preserve"> Key offers every owned, action-eligible Key item. Blank applies no group filter.</w:t>
+      </w:r>
+    </w:p>
+    <w:p>
+      <w:r>
+        <w:rPr>
+          <w:b/>
+        </w:rPr>
+        <w:t>Creative use:</w:t>
+      </w:r>
+      <w:r>
+        <w:t xml:space="preserve"> Add another kind of key later without updating every door’s candidate list. If SelectionItems and SelectionGroup are both filled, an item must satisfy both filters. They are an intersection, not alternatives.</w:t>
+      </w:r>
+    </w:p>
+    <w:p>
+      <w:r>
+        <w:rPr>
+          <w:b/>
+        </w:rPr>
+        <w:t>Connections:</w:t>
+      </w:r>
+      <w:r>
+        <w:t xml:space="preserve"> Merely finding the right group does not prove success. Keep the relevant tests for the exact key, working state, weapon power, worn boots, or puzzle variables.</w:t>
+      </w:r>
+    </w:p>
+    <w:p>
+      <w:pPr>
+        <w:pStyle w:val="Heading2"/>
+      </w:pPr>
+      <w:r>
+        <w:t>Message when no matching items are owned — NoSelectionMessage</w:t>
+      </w:r>
+    </w:p>
+    <w:p>
+      <w:r>
+        <w:rPr>
+          <w:b/>
+        </w:rPr>
+        <w:t>Valid setting:</w:t>
+      </w:r>
+      <w:r>
+        <w:t xml:space="preserve"> Optional plain text. </w:t>
+      </w:r>
+      <w:r>
+        <w:rPr>
+          <w:b/>
+        </w:rPr>
+        <w:t>Example:</w:t>
+      </w:r>
+      <w:r>
+        <w:t xml:space="preserve"> You have no keys to try here. Blank uses the game’s standard item/weapon guidance.</w:t>
+      </w:r>
+    </w:p>
+    <w:p>
+      <w:r>
+        <w:rPr>
+          <w:b/>
+        </w:rPr>
+        <w:t>Creative use:</w:t>
+      </w:r>
+      <w:r>
+        <w:t xml:space="preserve"> Hint where a player should explore next. An empty selection keeps the interaction open with its Leave choice. It runs neither PASS nor FAIL, so it never applies a failure penalty merely because the bag has no suitable object.</w:t>
+      </w:r>
+    </w:p>
+    <w:p>
+      <w:pPr>
         <w:pStyle w:val="Heading1"/>
       </w:pPr>
       <w:bookmarkStart w:id="9" w:name="chapter_9"/>
@@ -8445,7 +8813,7 @@
         <w:drawing>
           <wp:inline xmlns:a="http://schemas.openxmlformats.org/drawingml/2006/main" xmlns:pic="http://schemas.openxmlformats.org/drawingml/2006/picture">
             <wp:extent cx="6080760" cy="1066800"/>
-            <wp:docPr id="8" name="Picture 8" descr="Two real sword tests from the pig puzzle"/>
+            <wp:docPr id="10" name="Picture 10" descr="Two real sword tests from the pig puzzle"/>
             <wp:cNvGraphicFramePr>
               <a:graphicFrameLocks noChangeAspect="1"/>
             </wp:cNvGraphicFramePr>
@@ -8457,7 +8825,7 @@
                     <pic:cNvPicPr/>
                   </pic:nvPicPr>
                   <pic:blipFill>
-                    <a:blip r:embed="rId18"/>
+                    <a:blip r:embed="rId20"/>
                     <a:stretch>
                       <a:fillRect/>
                     </a:stretch>
@@ -9883,7 +10251,7 @@
         <w:drawing>
           <wp:inline xmlns:a="http://schemas.openxmlformats.org/drawingml/2006/main" xmlns:pic="http://schemas.openxmlformats.org/drawingml/2006/picture">
             <wp:extent cx="5641033" cy="5486399"/>
-            <wp:docPr id="9" name="Picture 9" descr="Both outcome forms include explicit item costs"/>
+            <wp:docPr id="11" name="Picture 11" descr="Both outcome forms include explicit item costs"/>
             <wp:cNvGraphicFramePr>
               <a:graphicFrameLocks noChangeAspect="1"/>
             </wp:cNvGraphicFramePr>
@@ -9895,7 +10263,7 @@
                     <pic:cNvPicPr/>
                   </pic:nvPicPr>
                   <pic:blipFill>
-                    <a:blip r:embed="rId19"/>
+                    <a:blip r:embed="rId21"/>
                     <a:stretch>
                       <a:fillRect/>
                     </a:stretch>
@@ -13040,7 +13408,7 @@
     </w:p>
     <w:p>
       <w:r>
-        <w:t xml:space="preserve">Both maps need entries in main-config.txt. Keep their start coordinates valid. You can also use a same-map </w:t>
+        <w:t xml:space="preserve">Both maps need entries in the same selected game configuration (main-config.txt for the legacy main collection). Keep their start coordinates valid. You can also use a same-map </w:t>
       </w:r>
       <w:r>
         <w:rPr>
@@ -13129,7 +13497,7 @@
     </w:p>
     <w:p>
       <w:r>
-        <w:t>For the built-in ending, paint palette block 777 at the goal. It immediately passes its supplied interaction and shows the princess message/graphic, ending movement. It has no editable ordinary NID and needs no block definition.</w:t>
+        <w:t>For the built-in ending, paint palette block 777 at the goal. It immediately passes its supplied interaction and shows the selected game’s ending title/message/picture, ending movement. Without customization it retains the princess ending. It has no editable ordinary NID and needs no block definition.</w:t>
       </w:r>
     </w:p>
     <w:p>
@@ -13155,8 +13523,8 @@
       <w:r>
         <w:drawing>
           <wp:inline xmlns:a="http://schemas.openxmlformats.org/drawingml/2006/main" xmlns:pic="http://schemas.openxmlformats.org/drawingml/2006/picture">
-            <wp:extent cx="6080760" cy="1275270"/>
-            <wp:docPr id="10" name="Picture 10" descr="Image preview controls"/>
+            <wp:extent cx="6080760" cy="1330717"/>
+            <wp:docPr id="12" name="Picture 12" descr="Image preview controls"/>
             <wp:cNvGraphicFramePr>
               <a:graphicFrameLocks noChangeAspect="1"/>
             </wp:cNvGraphicFramePr>
@@ -13168,7 +13536,7 @@
                     <pic:cNvPicPr/>
                   </pic:nvPicPr>
                   <pic:blipFill>
-                    <a:blip r:embed="rId20"/>
+                    <a:blip r:embed="rId22"/>
                     <a:stretch>
                       <a:fillRect/>
                     </a:stretch>
@@ -13176,7 +13544,7 @@
                   <pic:spPr>
                     <a:xfrm>
                       <a:off x="0" y="0"/>
-                      <a:ext cx="6080760" cy="1275270"/>
+                      <a:ext cx="6080760" cy="1330717"/>
                     </a:xfrm>
                     <a:prstGeom prst="rect"/>
                   </pic:spPr>
@@ -13257,7 +13625,7 @@
     </w:p>
     <w:p>
       <w:r>
-        <w:t>This checkbox is off by default. With it off, opening an unfamiliar map does not automatically request its arbitrary remote image hosts. Built-in and chosen local previews still work.</w:t>
+        <w:t>This checkbox is off by default. With it off, opening an unfamiliar map does not automatically request its arbitrary remote image hosts. Built-in and chosen local previews still work, and registered same-origin catalog images may preview directly.</w:t>
       </w:r>
     </w:p>
     <w:p>
@@ -13313,7 +13681,7 @@
         <w:t>https://your-site.example/assets/crystal.png</w:t>
       </w:r>
       <w:r>
-        <w:t>. A full HTTPS image URL does not need a base. When hosted without a custom base, the editor normally assumes a maps directory beside itself; offline custom files are better previewed through the local picker.</w:t>
+        <w:t>. A full HTTPS image URL does not need a base. When hosted without a custom base, a website map uses its actual URL, a new/local map uses the selected game folder, and the legacy main game uses the maps directory; offline custom files are better previewed through the local picker.</w:t>
       </w:r>
     </w:p>
     <w:p>
@@ -13484,7 +13852,7 @@
     </w:p>
     <w:p>
       <w:r>
-        <w:t>Renaming a saved NID or index through the form updates recognized references in this document. It cannot update other maps, main-config.txt, or URLs you already published. Keep a short reference notebook for cross-map objects, such as “Map 2’s gate accepts map 1 master key 1/4.4.”</w:t>
+        <w:t>The index and NID are read-only in forms. Changing Type or map number updates recognized local references, including SelectionItems, but cannot update other map files, configuration files, or URLs already published. Advanced Text / INI edits require you to correct those relationships yourself. Keep a short reference notebook for cross-map objects, such as “Map 2’s gate accepts map 1 master key 1/4.4.”</w:t>
       </w:r>
     </w:p>
     <w:p>
@@ -13886,7 +14254,7 @@
     </w:p>
     <w:p>
       <w:r>
-        <w:t>The game page loads its JavaScript. The JavaScript loads the main configuration. That file lists map numbers and map URLs. A map lists block definitions and image paths. Choices refer to full NIDs, variables, and transport destinations. Each part needs the next part to be available.</w:t>
+        <w:t>The game page loads its JavaScript and master configuration. The master registers games and can also retain the legacy main map directory. Each selected game configuration lists its map numbers and map URLs. A map lists block definitions and image paths. Choices refer to full NIDs, variables, and transport destinations. Each part needs the next part to be available.</w:t>
       </w:r>
     </w:p>
     <w:tbl>
@@ -14615,12 +14983,1028 @@
         <w:pStyle w:val="Heading2"/>
       </w:pPr>
       <w:r>
+        <w:t>Independent games and their configuration files</w:t>
+      </w:r>
+    </w:p>
+    <w:p>
+      <w:r>
+        <w:t>A game is a collection of maps with its own title, starting map, variables, artwork, and ending. The master main-config.txt registers games; each child game-config.txt lists its own maps. The included collections are the main Bramblewood adventure, Sebastian’s Workshop Trail, and Esther’s Enchanted Garden. The two new examples each have two connected maps. Their keys deliberately use the same map/NID numbers to demonstrate independent worlds.</w:t>
+      </w:r>
+    </w:p>
+    <w:p>
+      <w:r>
+        <w:t>Existing master files that contain only [Maps] keep working as the main game. Adding [Games] does not require moving those maps. A Game.main registration explicitly replaces that legacy collection with the referenced configuration, so use it only when deliberately migrating the main game.</w:t>
+      </w:r>
+    </w:p>
+    <w:p>
+      <w:pPr>
+        <w:pStyle w:val="GuideCode"/>
+        <w:keepNext/>
+        <w:shd w:fill="F0F3ED"/>
+      </w:pPr>
+      <w:r>
+        <w:t>[Game]</w:t>
+      </w:r>
+    </w:p>
+    <w:p>
+      <w:pPr>
+        <w:pStyle w:val="GuideCode"/>
+        <w:keepNext/>
+        <w:shd w:fill="F0F3ED"/>
+      </w:pPr>
+      <w:r>
+        <w:t>StartGame: esther</w:t>
+      </w:r>
+    </w:p>
+    <w:p>
+      <w:pPr>
+        <w:pStyle w:val="GuideCode"/>
+        <w:keepNext/>
+        <w:shd w:fill="F0F3ED"/>
+      </w:pPr>
+      <w:r>
+        <w:t>StartMap: 1</w:t>
+      </w:r>
+    </w:p>
+    <w:p>
+      <w:pPr>
+        <w:pStyle w:val="GuideCode"/>
+        <w:keepNext/>
+        <w:shd w:fill="F0F3ED"/>
+      </w:pPr>
+    </w:p>
+    <w:p>
+      <w:pPr>
+        <w:pStyle w:val="GuideCode"/>
+        <w:keepNext/>
+        <w:shd w:fill="F0F3ED"/>
+      </w:pPr>
+      <w:r>
+        <w:t>[Games]</w:t>
+      </w:r>
+    </w:p>
+    <w:p>
+      <w:pPr>
+        <w:pStyle w:val="GuideCode"/>
+        <w:keepNext/>
+        <w:shd w:fill="F0F3ED"/>
+      </w:pPr>
+      <w:r>
+        <w:t>Game.esther: maps/esther/game-config.txt</w:t>
+      </w:r>
+    </w:p>
+    <w:p>
+      <w:pPr>
+        <w:pStyle w:val="GuideCode"/>
+        <w:keepNext w:val="0"/>
+        <w:shd w:fill="F0F3ED"/>
+      </w:pPr>
+      <w:r>
+        <w:t>Game.sebastian: maps/sebastian/game-config.txt</w:t>
+      </w:r>
+    </w:p>
+    <w:p>
+      <w:pPr>
+        <w:spacing w:after="20"/>
+      </w:pPr>
+    </w:p>
+    <w:p>
+      <w:r>
+        <w:t>StartGame is a stable label beginning with a letter and containing letters, digits, underscores, or hyphens. Main is case-sensitive: the implicit legacy ID is main in lowercase. StartMap in the master is an optional override for the initial default launch. Omit it to use the default game’s own start. Selecting another game or restarting it uses that game’s own StartMap. Changing the selected game confirms a fresh run, keeps the nickname, and resets inventory, clothing, weapons, states, player variables, map variables, and changed cells across all visited maps.</w:t>
+      </w:r>
+    </w:p>
+    <w:p>
+      <w:r>
+        <w:t>A child configuration might contain:</w:t>
+      </w:r>
+    </w:p>
+    <w:p>
+      <w:pPr>
+        <w:pStyle w:val="GuideCode"/>
+        <w:keepNext/>
+        <w:shd w:fill="F0F3ED"/>
+      </w:pPr>
+      <w:r>
+        <w:t>[Game]</w:t>
+      </w:r>
+    </w:p>
+    <w:p>
+      <w:pPr>
+        <w:pStyle w:val="GuideCode"/>
+        <w:keepNext/>
+        <w:shd w:fill="F0F3ED"/>
+      </w:pPr>
+      <w:r>
+        <w:t>Title: Esther's Enchanted Garden</w:t>
+      </w:r>
+    </w:p>
+    <w:p>
+      <w:pPr>
+        <w:pStyle w:val="GuideCode"/>
+        <w:keepNext/>
+        <w:shd w:fill="F0F3ED"/>
+      </w:pPr>
+      <w:r>
+        <w:t>Author: Esther</w:t>
+      </w:r>
+    </w:p>
+    <w:p>
+      <w:pPr>
+        <w:pStyle w:val="GuideCode"/>
+        <w:keepNext/>
+        <w:shd w:fill="F0F3ED"/>
+      </w:pPr>
+      <w:r>
+        <w:t>StartMap: 1</w:t>
+      </w:r>
+    </w:p>
+    <w:p>
+      <w:pPr>
+        <w:pStyle w:val="GuideCode"/>
+        <w:keepNext/>
+        <w:shd w:fill="F0F3ED"/>
+      </w:pPr>
+      <w:r>
+        <w:t>WelcomeMessage: Find the garden key and restore the colors.</w:t>
+      </w:r>
+    </w:p>
+    <w:p>
+      <w:pPr>
+        <w:pStyle w:val="GuideCode"/>
+        <w:keepNext/>
+        <w:shd w:fill="F0F3ED"/>
+      </w:pPr>
+      <w:r>
+        <w:t>VictoryTitle: You restored the garden!</w:t>
+      </w:r>
+    </w:p>
+    <w:p>
+      <w:pPr>
+        <w:pStyle w:val="GuideCode"/>
+        <w:keepNext/>
+        <w:shd w:fill="F0F3ED"/>
+      </w:pPr>
+      <w:r>
+        <w:t>VictoryMessage: Well done, {Player.Name}! The flowers bloom again.</w:t>
+      </w:r>
+    </w:p>
+    <w:p>
+      <w:pPr>
+        <w:pStyle w:val="GuideCode"/>
+        <w:keepNext/>
+        <w:shd w:fill="F0F3ED"/>
+      </w:pPr>
+    </w:p>
+    <w:p>
+      <w:pPr>
+        <w:pStyle w:val="GuideCode"/>
+        <w:keepNext/>
+        <w:shd w:fill="F0F3ED"/>
+      </w:pPr>
+      <w:r>
+        <w:t>[Maps]</w:t>
+      </w:r>
+    </w:p>
+    <w:p>
+      <w:pPr>
+        <w:pStyle w:val="GuideCode"/>
+        <w:keepNext/>
+        <w:shd w:fill="F0F3ED"/>
+      </w:pPr>
+      <w:r>
+        <w:t>Map.1: map-1.txt</w:t>
+      </w:r>
+    </w:p>
+    <w:p>
+      <w:pPr>
+        <w:pStyle w:val="GuideCode"/>
+        <w:keepNext w:val="0"/>
+        <w:shd w:fill="F0F3ED"/>
+      </w:pPr>
+      <w:r>
+        <w:t>Map.2: map-2.txt</w:t>
+      </w:r>
+    </w:p>
+    <w:p>
+      <w:pPr>
+        <w:spacing w:after="20"/>
+      </w:pPr>
+    </w:p>
+    <w:p>
+      <w:r>
+        <w:t>Child Map.N paths resolve relative to that game-config.txt. A child must list maps, not another [Games] catalog. Both games can have Map 1 and NID 1/4.1. Transports such as (2) refer to Map 2 in the current game. There are no cross-game transports or shared inventory in this edition. Returning to another map within one run retains changes; switching collections creates a fresh run.</w:t>
+      </w:r>
+    </w:p>
+    <w:p>
+      <w:r>
+        <w:t>Master Images, ImageCatalog, Style, and PlayerVariables provide defaults. A child may override individual entries in those sections. Child maps are their own directory rather than an inherited list. Child Title, Author, WelcomeMessage, VictoryTitle, VictoryMessage, StartMap, and RequestTimeoutMs are its own game settings. If omitted, the title is Maze Craze, author/introduction/custom ending are blank, StartMap is required and must name one of its maps, and timeout is 10000 milliseconds. Missing custom ending text uses the original princess ending.</w:t>
+      </w:r>
+    </w:p>
+    <w:tbl>
+      <w:tblPr>
+        <w:tblW w:type="auto" w:w="0"/>
+        <w:jc w:val="center"/>
+        <w:tblLayout w:type="fixed"/>
+        <w:tblLook w:firstColumn="1" w:firstRow="1" w:lastColumn="0" w:lastRow="0" w:noHBand="0" w:noVBand="1" w:val="04A0"/>
+      </w:tblPr>
+      <w:tblGrid>
+        <w:gridCol w:w="2160"/>
+        <w:gridCol w:w="4320"/>
+        <w:gridCol w:w="3456"/>
+      </w:tblGrid>
+      <w:tr>
+        <w:trPr>
+          <w:cantSplit/>
+          <w:tblHeader/>
+        </w:trPr>
+        <w:tc>
+          <w:tcPr>
+            <w:tcW w:type="dxa" w:w="2160"/>
+            <w:vAlign w:val="top"/>
+            <w:shd w:fill="214C3D"/>
+            <w:tcMar>
+              <w:top w:w="90" w:type="dxa"/>
+              <w:left w:w="90" w:type="dxa"/>
+              <w:bottom w:w="90" w:type="dxa"/>
+              <w:right w:w="90" w:type="dxa"/>
+            </w:tcMar>
+          </w:tcPr>
+          <w:p>
+            <w:pPr>
+              <w:keepNext/>
+              <w:spacing w:before="80" w:after="100" w:line="259" w:lineRule="auto"/>
+            </w:pPr>
+            <w:r>
+              <w:rPr>
+                <w:b/>
+                <w:color w:val="FFFFFF"/>
+                <w:sz w:val="19"/>
+              </w:rPr>
+              <w:t>Section / field</w:t>
+            </w:r>
+          </w:p>
+        </w:tc>
+        <w:tc>
+          <w:tcPr>
+            <w:tcW w:type="dxa" w:w="4320"/>
+            <w:vAlign w:val="top"/>
+            <w:shd w:fill="214C3D"/>
+            <w:tcMar>
+              <w:top w:w="90" w:type="dxa"/>
+              <w:left w:w="90" w:type="dxa"/>
+              <w:bottom w:w="90" w:type="dxa"/>
+              <w:right w:w="90" w:type="dxa"/>
+            </w:tcMar>
+          </w:tcPr>
+          <w:p>
+            <w:pPr>
+              <w:keepNext/>
+              <w:spacing w:before="80" w:after="100" w:line="259" w:lineRule="auto"/>
+            </w:pPr>
+            <w:r>
+              <w:rPr>
+                <w:b/>
+                <w:color w:val="FFFFFF"/>
+                <w:sz w:val="19"/>
+              </w:rPr>
+              <w:t>Valid setting and relationship</w:t>
+            </w:r>
+          </w:p>
+        </w:tc>
+        <w:tc>
+          <w:tcPr>
+            <w:tcW w:type="dxa" w:w="3456"/>
+            <w:vAlign w:val="top"/>
+            <w:shd w:fill="214C3D"/>
+            <w:tcMar>
+              <w:top w:w="90" w:type="dxa"/>
+              <w:left w:w="90" w:type="dxa"/>
+              <w:bottom w:w="90" w:type="dxa"/>
+              <w:right w:w="90" w:type="dxa"/>
+            </w:tcMar>
+          </w:tcPr>
+          <w:p>
+            <w:pPr>
+              <w:keepNext/>
+              <w:spacing w:before="80" w:after="100" w:line="259" w:lineRule="auto"/>
+            </w:pPr>
+            <w:r>
+              <w:rPr>
+                <w:b/>
+                <w:color w:val="FFFFFF"/>
+                <w:sz w:val="19"/>
+              </w:rPr>
+              <w:t>Allowed examples</w:t>
+            </w:r>
+          </w:p>
+        </w:tc>
+      </w:tr>
+      <w:tr>
+        <w:trPr>
+          <w:cantSplit/>
+        </w:trPr>
+        <w:tc>
+          <w:tcPr>
+            <w:tcW w:type="dxa" w:w="2160"/>
+            <w:vAlign w:val="top"/>
+            <w:shd w:fill="EEF4E9"/>
+            <w:tcMar>
+              <w:top w:w="90" w:type="dxa"/>
+              <w:left w:w="90" w:type="dxa"/>
+              <w:bottom w:w="90" w:type="dxa"/>
+              <w:right w:w="90" w:type="dxa"/>
+            </w:tcMar>
+          </w:tcPr>
+          <w:p>
+            <w:pPr>
+              <w:spacing w:before="80" w:after="100" w:line="259" w:lineRule="auto"/>
+            </w:pPr>
+            <w:r>
+              <w:rPr>
+                <w:sz w:val="19"/>
+              </w:rPr>
+              <w:t>Game / StartGame</w:t>
+            </w:r>
+          </w:p>
+        </w:tc>
+        <w:tc>
+          <w:tcPr>
+            <w:tcW w:type="dxa" w:w="4320"/>
+            <w:vAlign w:val="top"/>
+            <w:shd w:fill="EEF4E9"/>
+            <w:tcMar>
+              <w:top w:w="90" w:type="dxa"/>
+              <w:left w:w="90" w:type="dxa"/>
+              <w:bottom w:w="90" w:type="dxa"/>
+              <w:right w:w="90" w:type="dxa"/>
+            </w:tcMar>
+          </w:tcPr>
+          <w:p>
+            <w:pPr>
+              <w:spacing w:before="80" w:after="100" w:line="259" w:lineRule="auto"/>
+            </w:pPr>
+            <w:r>
+              <w:rPr>
+                <w:sz w:val="19"/>
+              </w:rPr>
+              <w:t>Master’s initial registered game ID</w:t>
+            </w:r>
+          </w:p>
+        </w:tc>
+        <w:tc>
+          <w:tcPr>
+            <w:tcW w:type="dxa" w:w="3456"/>
+            <w:vAlign w:val="top"/>
+            <w:shd w:fill="EEF4E9"/>
+            <w:tcMar>
+              <w:top w:w="90" w:type="dxa"/>
+              <w:left w:w="90" w:type="dxa"/>
+              <w:bottom w:w="90" w:type="dxa"/>
+              <w:right w:w="90" w:type="dxa"/>
+            </w:tcMar>
+          </w:tcPr>
+          <w:p>
+            <w:pPr>
+              <w:spacing w:before="80" w:after="100" w:line="259" w:lineRule="auto"/>
+            </w:pPr>
+            <w:r>
+              <w:rPr>
+                <w:sz w:val="19"/>
+              </w:rPr>
+              <w:t>esther</w:t>
+            </w:r>
+          </w:p>
+        </w:tc>
+      </w:tr>
+      <w:tr>
+        <w:trPr>
+          <w:cantSplit/>
+        </w:trPr>
+        <w:tc>
+          <w:tcPr>
+            <w:tcW w:type="dxa" w:w="2160"/>
+            <w:vAlign w:val="top"/>
+            <w:shd w:fill="F8FAF5"/>
+            <w:tcMar>
+              <w:top w:w="90" w:type="dxa"/>
+              <w:left w:w="90" w:type="dxa"/>
+              <w:bottom w:w="90" w:type="dxa"/>
+              <w:right w:w="90" w:type="dxa"/>
+            </w:tcMar>
+          </w:tcPr>
+          <w:p>
+            <w:pPr>
+              <w:spacing w:before="80" w:after="100" w:line="259" w:lineRule="auto"/>
+            </w:pPr>
+            <w:r>
+              <w:rPr>
+                <w:sz w:val="19"/>
+              </w:rPr>
+              <w:t>Games / Game.ID</w:t>
+            </w:r>
+          </w:p>
+        </w:tc>
+        <w:tc>
+          <w:tcPr>
+            <w:tcW w:type="dxa" w:w="4320"/>
+            <w:vAlign w:val="top"/>
+            <w:shd w:fill="F8FAF5"/>
+            <w:tcMar>
+              <w:top w:w="90" w:type="dxa"/>
+              <w:left w:w="90" w:type="dxa"/>
+              <w:bottom w:w="90" w:type="dxa"/>
+              <w:right w:w="90" w:type="dxa"/>
+            </w:tcMar>
+          </w:tcPr>
+          <w:p>
+            <w:pPr>
+              <w:spacing w:before="80" w:after="100" w:line="259" w:lineRule="auto"/>
+            </w:pPr>
+            <w:r>
+              <w:rPr>
+                <w:sz w:val="19"/>
+              </w:rPr>
+              <w:t>Same-origin child configuration URL</w:t>
+            </w:r>
+          </w:p>
+        </w:tc>
+        <w:tc>
+          <w:tcPr>
+            <w:tcW w:type="dxa" w:w="3456"/>
+            <w:vAlign w:val="top"/>
+            <w:shd w:fill="F8FAF5"/>
+            <w:tcMar>
+              <w:top w:w="90" w:type="dxa"/>
+              <w:left w:w="90" w:type="dxa"/>
+              <w:bottom w:w="90" w:type="dxa"/>
+              <w:right w:w="90" w:type="dxa"/>
+            </w:tcMar>
+          </w:tcPr>
+          <w:p>
+            <w:pPr>
+              <w:spacing w:before="80" w:after="100" w:line="259" w:lineRule="auto"/>
+            </w:pPr>
+            <w:r>
+              <w:rPr>
+                <w:sz w:val="19"/>
+              </w:rPr>
+              <w:t>Game.esther: maps/esther/game-config.txt</w:t>
+            </w:r>
+          </w:p>
+        </w:tc>
+      </w:tr>
+      <w:tr>
+        <w:trPr>
+          <w:cantSplit/>
+        </w:trPr>
+        <w:tc>
+          <w:tcPr>
+            <w:tcW w:type="dxa" w:w="2160"/>
+            <w:vAlign w:val="top"/>
+            <w:shd w:fill="EEF4E9"/>
+            <w:tcMar>
+              <w:top w:w="90" w:type="dxa"/>
+              <w:left w:w="90" w:type="dxa"/>
+              <w:bottom w:w="90" w:type="dxa"/>
+              <w:right w:w="90" w:type="dxa"/>
+            </w:tcMar>
+          </w:tcPr>
+          <w:p>
+            <w:pPr>
+              <w:spacing w:before="80" w:after="100" w:line="259" w:lineRule="auto"/>
+            </w:pPr>
+            <w:r>
+              <w:rPr>
+                <w:sz w:val="19"/>
+              </w:rPr>
+              <w:t>Game / Author</w:t>
+            </w:r>
+          </w:p>
+        </w:tc>
+        <w:tc>
+          <w:tcPr>
+            <w:tcW w:type="dxa" w:w="4320"/>
+            <w:vAlign w:val="top"/>
+            <w:shd w:fill="EEF4E9"/>
+            <w:tcMar>
+              <w:top w:w="90" w:type="dxa"/>
+              <w:left w:w="90" w:type="dxa"/>
+              <w:bottom w:w="90" w:type="dxa"/>
+              <w:right w:w="90" w:type="dxa"/>
+            </w:tcMar>
+          </w:tcPr>
+          <w:p>
+            <w:pPr>
+              <w:spacing w:before="80" w:after="100" w:line="259" w:lineRule="auto"/>
+            </w:pPr>
+            <w:r>
+              <w:rPr>
+                <w:sz w:val="19"/>
+              </w:rPr>
+              <w:t>Optional plain attribution</w:t>
+            </w:r>
+          </w:p>
+        </w:tc>
+        <w:tc>
+          <w:tcPr>
+            <w:tcW w:type="dxa" w:w="3456"/>
+            <w:vAlign w:val="top"/>
+            <w:shd w:fill="EEF4E9"/>
+            <w:tcMar>
+              <w:top w:w="90" w:type="dxa"/>
+              <w:left w:w="90" w:type="dxa"/>
+              <w:bottom w:w="90" w:type="dxa"/>
+              <w:right w:w="90" w:type="dxa"/>
+            </w:tcMar>
+          </w:tcPr>
+          <w:p>
+            <w:pPr>
+              <w:spacing w:before="80" w:after="100" w:line="259" w:lineRule="auto"/>
+            </w:pPr>
+            <w:r>
+              <w:rPr>
+                <w:sz w:val="19"/>
+              </w:rPr>
+              <w:t>Esther</w:t>
+            </w:r>
+          </w:p>
+        </w:tc>
+      </w:tr>
+      <w:tr>
+        <w:trPr>
+          <w:cantSplit/>
+        </w:trPr>
+        <w:tc>
+          <w:tcPr>
+            <w:tcW w:type="dxa" w:w="2160"/>
+            <w:vAlign w:val="top"/>
+            <w:shd w:fill="F8FAF5"/>
+            <w:tcMar>
+              <w:top w:w="90" w:type="dxa"/>
+              <w:left w:w="90" w:type="dxa"/>
+              <w:bottom w:w="90" w:type="dxa"/>
+              <w:right w:w="90" w:type="dxa"/>
+            </w:tcMar>
+          </w:tcPr>
+          <w:p>
+            <w:pPr>
+              <w:spacing w:before="80" w:after="100" w:line="259" w:lineRule="auto"/>
+            </w:pPr>
+            <w:r>
+              <w:rPr>
+                <w:sz w:val="19"/>
+              </w:rPr>
+              <w:t>Game / WelcomeMessage</w:t>
+            </w:r>
+          </w:p>
+        </w:tc>
+        <w:tc>
+          <w:tcPr>
+            <w:tcW w:type="dxa" w:w="4320"/>
+            <w:vAlign w:val="top"/>
+            <w:shd w:fill="F8FAF5"/>
+            <w:tcMar>
+              <w:top w:w="90" w:type="dxa"/>
+              <w:left w:w="90" w:type="dxa"/>
+              <w:bottom w:w="90" w:type="dxa"/>
+              <w:right w:w="90" w:type="dxa"/>
+            </w:tcMar>
+          </w:tcPr>
+          <w:p>
+            <w:pPr>
+              <w:spacing w:before="80" w:after="100" w:line="259" w:lineRule="auto"/>
+            </w:pPr>
+            <w:r>
+              <w:rPr>
+                <w:sz w:val="19"/>
+              </w:rPr>
+              <w:t>Optional plain opening story</w:t>
+            </w:r>
+          </w:p>
+        </w:tc>
+        <w:tc>
+          <w:tcPr>
+            <w:tcW w:type="dxa" w:w="3456"/>
+            <w:vAlign w:val="top"/>
+            <w:shd w:fill="F8FAF5"/>
+            <w:tcMar>
+              <w:top w:w="90" w:type="dxa"/>
+              <w:left w:w="90" w:type="dxa"/>
+              <w:bottom w:w="90" w:type="dxa"/>
+              <w:right w:w="90" w:type="dxa"/>
+            </w:tcMar>
+          </w:tcPr>
+          <w:p>
+            <w:pPr>
+              <w:spacing w:before="80" w:after="100" w:line="259" w:lineRule="auto"/>
+            </w:pPr>
+            <w:r>
+              <w:rPr>
+                <w:sz w:val="19"/>
+              </w:rPr>
+              <w:t>Find the garden key.</w:t>
+            </w:r>
+          </w:p>
+        </w:tc>
+      </w:tr>
+      <w:tr>
+        <w:trPr>
+          <w:cantSplit/>
+        </w:trPr>
+        <w:tc>
+          <w:tcPr>
+            <w:tcW w:type="dxa" w:w="2160"/>
+            <w:vAlign w:val="top"/>
+            <w:shd w:fill="EEF4E9"/>
+            <w:tcMar>
+              <w:top w:w="90" w:type="dxa"/>
+              <w:left w:w="90" w:type="dxa"/>
+              <w:bottom w:w="90" w:type="dxa"/>
+              <w:right w:w="90" w:type="dxa"/>
+            </w:tcMar>
+          </w:tcPr>
+          <w:p>
+            <w:pPr>
+              <w:spacing w:before="80" w:after="100" w:line="259" w:lineRule="auto"/>
+            </w:pPr>
+            <w:r>
+              <w:rPr>
+                <w:sz w:val="19"/>
+              </w:rPr>
+              <w:t>Game / VictoryTitle</w:t>
+            </w:r>
+          </w:p>
+        </w:tc>
+        <w:tc>
+          <w:tcPr>
+            <w:tcW w:type="dxa" w:w="4320"/>
+            <w:vAlign w:val="top"/>
+            <w:shd w:fill="EEF4E9"/>
+            <w:tcMar>
+              <w:top w:w="90" w:type="dxa"/>
+              <w:left w:w="90" w:type="dxa"/>
+              <w:bottom w:w="90" w:type="dxa"/>
+              <w:right w:w="90" w:type="dxa"/>
+            </w:tcMar>
+          </w:tcPr>
+          <w:p>
+            <w:pPr>
+              <w:spacing w:before="80" w:after="100" w:line="259" w:lineRule="auto"/>
+            </w:pPr>
+            <w:r>
+              <w:rPr>
+                <w:sz w:val="19"/>
+              </w:rPr>
+              <w:t>Optional title for ending block 777</w:t>
+            </w:r>
+          </w:p>
+        </w:tc>
+        <w:tc>
+          <w:tcPr>
+            <w:tcW w:type="dxa" w:w="3456"/>
+            <w:vAlign w:val="top"/>
+            <w:shd w:fill="EEF4E9"/>
+            <w:tcMar>
+              <w:top w:w="90" w:type="dxa"/>
+              <w:left w:w="90" w:type="dxa"/>
+              <w:bottom w:w="90" w:type="dxa"/>
+              <w:right w:w="90" w:type="dxa"/>
+            </w:tcMar>
+          </w:tcPr>
+          <w:p>
+            <w:pPr>
+              <w:spacing w:before="80" w:after="100" w:line="259" w:lineRule="auto"/>
+            </w:pPr>
+            <w:r>
+              <w:rPr>
+                <w:sz w:val="19"/>
+              </w:rPr>
+              <w:t>You restored the garden!</w:t>
+            </w:r>
+          </w:p>
+        </w:tc>
+      </w:tr>
+      <w:tr>
+        <w:trPr>
+          <w:cantSplit/>
+        </w:trPr>
+        <w:tc>
+          <w:tcPr>
+            <w:tcW w:type="dxa" w:w="2160"/>
+            <w:vAlign w:val="top"/>
+            <w:shd w:fill="F8FAF5"/>
+            <w:tcMar>
+              <w:top w:w="90" w:type="dxa"/>
+              <w:left w:w="90" w:type="dxa"/>
+              <w:bottom w:w="90" w:type="dxa"/>
+              <w:right w:w="90" w:type="dxa"/>
+            </w:tcMar>
+          </w:tcPr>
+          <w:p>
+            <w:pPr>
+              <w:spacing w:before="80" w:after="100" w:line="259" w:lineRule="auto"/>
+            </w:pPr>
+            <w:r>
+              <w:rPr>
+                <w:sz w:val="19"/>
+              </w:rPr>
+              <w:t>Game / VictoryMessage</w:t>
+            </w:r>
+          </w:p>
+        </w:tc>
+        <w:tc>
+          <w:tcPr>
+            <w:tcW w:type="dxa" w:w="4320"/>
+            <w:vAlign w:val="top"/>
+            <w:shd w:fill="F8FAF5"/>
+            <w:tcMar>
+              <w:top w:w="90" w:type="dxa"/>
+              <w:left w:w="90" w:type="dxa"/>
+              <w:bottom w:w="90" w:type="dxa"/>
+              <w:right w:w="90" w:type="dxa"/>
+            </w:tcMar>
+          </w:tcPr>
+          <w:p>
+            <w:pPr>
+              <w:spacing w:before="80" w:after="100" w:line="259" w:lineRule="auto"/>
+            </w:pPr>
+            <w:r>
+              <w:rPr>
+                <w:sz w:val="19"/>
+              </w:rPr>
+              <w:t>Optional ending text with outcome placeholders</w:t>
+            </w:r>
+          </w:p>
+        </w:tc>
+        <w:tc>
+          <w:tcPr>
+            <w:tcW w:type="dxa" w:w="3456"/>
+            <w:vAlign w:val="top"/>
+            <w:shd w:fill="F8FAF5"/>
+            <w:tcMar>
+              <w:top w:w="90" w:type="dxa"/>
+              <w:left w:w="90" w:type="dxa"/>
+              <w:bottom w:w="90" w:type="dxa"/>
+              <w:right w:w="90" w:type="dxa"/>
+            </w:tcMar>
+          </w:tcPr>
+          <w:p>
+            <w:pPr>
+              <w:spacing w:before="80" w:after="100" w:line="259" w:lineRule="auto"/>
+            </w:pPr>
+            <w:r>
+              <w:rPr>
+                <w:sz w:val="19"/>
+              </w:rPr>
+              <w:t>Well done, {Player.Name}!</w:t>
+            </w:r>
+          </w:p>
+        </w:tc>
+      </w:tr>
+      <w:tr>
+        <w:trPr>
+          <w:cantSplit/>
+        </w:trPr>
+        <w:tc>
+          <w:tcPr>
+            <w:tcW w:type="dxa" w:w="2160"/>
+            <w:vAlign w:val="top"/>
+            <w:shd w:fill="EEF4E9"/>
+            <w:tcMar>
+              <w:top w:w="90" w:type="dxa"/>
+              <w:left w:w="90" w:type="dxa"/>
+              <w:bottom w:w="90" w:type="dxa"/>
+              <w:right w:w="90" w:type="dxa"/>
+            </w:tcMar>
+          </w:tcPr>
+          <w:p>
+            <w:pPr>
+              <w:spacing w:before="80" w:after="100" w:line="259" w:lineRule="auto"/>
+            </w:pPr>
+            <w:r>
+              <w:rPr>
+                <w:sz w:val="19"/>
+              </w:rPr>
+              <w:t>Images / Princess</w:t>
+            </w:r>
+          </w:p>
+        </w:tc>
+        <w:tc>
+          <w:tcPr>
+            <w:tcW w:type="dxa" w:w="4320"/>
+            <w:vAlign w:val="top"/>
+            <w:shd w:fill="EEF4E9"/>
+            <w:tcMar>
+              <w:top w:w="90" w:type="dxa"/>
+              <w:left w:w="90" w:type="dxa"/>
+              <w:bottom w:w="90" w:type="dxa"/>
+              <w:right w:w="90" w:type="dxa"/>
+            </w:tcMar>
+          </w:tcPr>
+          <w:p>
+            <w:pPr>
+              <w:spacing w:before="80" w:after="100" w:line="259" w:lineRule="auto"/>
+            </w:pPr>
+            <w:r>
+              <w:rPr>
+                <w:sz w:val="19"/>
+              </w:rPr>
+              <w:t>Ending picture, including custom game endings</w:t>
+            </w:r>
+          </w:p>
+        </w:tc>
+        <w:tc>
+          <w:tcPr>
+            <w:tcW w:type="dxa" w:w="3456"/>
+            <w:vAlign w:val="top"/>
+            <w:shd w:fill="EEF4E9"/>
+            <w:tcMar>
+              <w:top w:w="90" w:type="dxa"/>
+              <w:left w:w="90" w:type="dxa"/>
+              <w:bottom w:w="90" w:type="dxa"/>
+              <w:right w:w="90" w:type="dxa"/>
+            </w:tcMar>
+          </w:tcPr>
+          <w:p>
+            <w:pPr>
+              <w:spacing w:before="80" w:after="100" w:line="259" w:lineRule="auto"/>
+            </w:pPr>
+            <w:r>
+              <w:rPr>
+                <w:sz w:val="19"/>
+              </w:rPr>
+              <w:t>../../assets/chest.png</w:t>
+            </w:r>
+          </w:p>
+        </w:tc>
+      </w:tr>
+      <w:tr>
+        <w:trPr>
+          <w:cantSplit/>
+        </w:trPr>
+        <w:tc>
+          <w:tcPr>
+            <w:tcW w:type="dxa" w:w="2160"/>
+            <w:vAlign w:val="top"/>
+            <w:shd w:fill="F8FAF5"/>
+            <w:tcMar>
+              <w:top w:w="90" w:type="dxa"/>
+              <w:left w:w="90" w:type="dxa"/>
+              <w:bottom w:w="90" w:type="dxa"/>
+              <w:right w:w="90" w:type="dxa"/>
+            </w:tcMar>
+          </w:tcPr>
+          <w:p>
+            <w:pPr>
+              <w:spacing w:before="80" w:after="100" w:line="259" w:lineRule="auto"/>
+            </w:pPr>
+            <w:r>
+              <w:rPr>
+                <w:sz w:val="19"/>
+              </w:rPr>
+              <w:t>ImageCatalog / Name</w:t>
+            </w:r>
+          </w:p>
+        </w:tc>
+        <w:tc>
+          <w:tcPr>
+            <w:tcW w:type="dxa" w:w="4320"/>
+            <w:vAlign w:val="top"/>
+            <w:shd w:fill="F8FAF5"/>
+            <w:tcMar>
+              <w:top w:w="90" w:type="dxa"/>
+              <w:left w:w="90" w:type="dxa"/>
+              <w:bottom w:w="90" w:type="dxa"/>
+              <w:right w:w="90" w:type="dxa"/>
+            </w:tcMar>
+          </w:tcPr>
+          <w:p>
+            <w:pPr>
+              <w:spacing w:before="80" w:after="100" w:line="259" w:lineRule="auto"/>
+            </w:pPr>
+            <w:r>
+              <w:rPr>
+                <w:sz w:val="19"/>
+              </w:rPr>
+              <w:t>Catalog image URL relative to its owning config</w:t>
+            </w:r>
+          </w:p>
+        </w:tc>
+        <w:tc>
+          <w:tcPr>
+            <w:tcW w:type="dxa" w:w="3456"/>
+            <w:vAlign w:val="top"/>
+            <w:shd w:fill="F8FAF5"/>
+            <w:tcMar>
+              <w:top w:w="90" w:type="dxa"/>
+              <w:left w:w="90" w:type="dxa"/>
+              <w:bottom w:w="90" w:type="dxa"/>
+              <w:right w:w="90" w:type="dxa"/>
+            </w:tcMar>
+          </w:tcPr>
+          <w:p>
+            <w:pPr>
+              <w:spacing w:before="80" w:after="100" w:line="259" w:lineRule="auto"/>
+            </w:pPr>
+            <w:r>
+              <w:rPr>
+                <w:sz w:val="19"/>
+              </w:rPr>
+              <w:t>Tree: ../../assets/tree.png</w:t>
+            </w:r>
+          </w:p>
+        </w:tc>
+      </w:tr>
+    </w:tbl>
+    <w:p>
+      <w:pPr>
+        <w:spacing w:after="20"/>
+      </w:pPr>
+    </w:p>
+    <w:p>
+      <w:r>
+        <w:t>Block 777 remains reserved and automatic. Its title/message can now come from the selected game; its picture still uses Images / Princess for compatibility. Choose that picture appropriately for a garden, treasure, or workshop ending. Ordinary authored outcomes with EndGame: Yes use the custom victory title as well, but retain their authored result message.</w:t>
+      </w:r>
+    </w:p>
+    <w:p>
+      <w:pPr>
+        <w:pStyle w:val="Heading2"/>
+      </w:pPr>
+      <w:r>
+        <w:t>Image catalog and the editor’s image suggestions</w:t>
+      </w:r>
+    </w:p>
+    <w:p>
+      <w:r>
+        <w:t>Add named images under [ImageCatalog] in the master or a child game configuration. Names follow the configuration field spelling rules: start with a letter, then letters, digits, underscores, or periods. Treat capitalization as significant. Paths resolve against the configuration that defines them. Child entries with the same key override the master.</w:t>
+      </w:r>
+    </w:p>
+    <w:p>
+      <w:pPr>
+        <w:pStyle w:val="GuideCode"/>
+        <w:keepNext/>
+        <w:shd w:fill="F0F3ED"/>
+      </w:pPr>
+      <w:r>
+        <w:t>[ImageCatalog]</w:t>
+      </w:r>
+    </w:p>
+    <w:p>
+      <w:pPr>
+        <w:pStyle w:val="GuideCode"/>
+        <w:keepNext/>
+        <w:shd w:fill="F0F3ED"/>
+      </w:pPr>
+      <w:r>
+        <w:t>Tree: assets/tree.png</w:t>
+      </w:r>
+    </w:p>
+    <w:p>
+      <w:pPr>
+        <w:pStyle w:val="GuideCode"/>
+        <w:keepNext w:val="0"/>
+        <w:shd w:fill="F0F3ED"/>
+      </w:pPr>
+      <w:r>
+        <w:t>GoldCoin: assets/gold-coin.png</w:t>
+      </w:r>
+    </w:p>
+    <w:p>
+      <w:pPr>
+        <w:spacing w:after="20"/>
+      </w:pPr>
+    </w:p>
+    <w:p>
+      <w:r>
+        <w:t>A block may use MapImage: @Tree or InteractionImage: @GoldCoin. The @ means look up that exact catalog name in the current game. An unknown name is an authoring error; it is not a JavaScript expression. Relative and absolute HTTP(S) image paths remain supported, so older maps do not need conversion.</w:t>
+      </w:r>
+    </w:p>
+    <w:p>
+      <w:r>
+        <w:t>The editor suggestions combine bundled filenames, paths already used in the open map, and the selected game’s catalog. Catalog entries offer both @Name and their resolved URL. Refresh map list rereads configuration/catalog changes after SFTP. Adding a picture to a server folder alone does not enumerate it: add its catalog entry too. Export stores the chosen path or alias; it does not embed picture data.</w:t>
+      </w:r>
+    </w:p>
+    <w:p>
+      <w:r>
+        <w:t>Same-origin catalog previews may load directly because the author explicitly registered them. Local preview pictures still override matching filenames. Other URL previews stay opt-in through Allow image requests; enabling that uses the actual URL even when a bundled filename matches. Website-map relative previews use that map’s real URL. A local/new map uses the selected game’s folder, or maps/ for the legacy main game, unless the preview base is explicitly provided.</w:t>
+      </w:r>
+    </w:p>
+    <w:p>
+      <w:r>
+        <w:t>For maps under maps/esther/, ../../assets/tree.png reaches the shared root art. Using @Tree avoids rewriting a map when the catalog is updated. The catalog file itself still needs the correct relative or absolute URL. New map Test from Start uses map-N.txt in that game configuration’s folder as its fallback image base; published map entries use their actual registered URLs.</w:t>
+      </w:r>
+    </w:p>
+    <w:p>
+      <w:pPr>
+        <w:pStyle w:val="Heading2"/>
+      </w:pPr>
+      <w:r>
         <w:t>Every main-config field you may need to coordinate</w:t>
       </w:r>
     </w:p>
     <w:p>
       <w:r>
-        <w:t>The editor does not edit main-config.txt. These settings are documented here so you know which other file must change. Use a plain-text editor, retain the section headings, and preserve unrelated entries.</w:t>
+        <w:t>The editor does not edit main-config.txt or game-config.txt. These settings are documented here so you know which other file must change. Use a plain-text editor, retain the section headings, and preserve unrelated entries.</w:t>
       </w:r>
     </w:p>
     <w:tbl>
@@ -15664,7 +17048,7 @@
     </w:p>
     <w:p>
       <w:r>
-        <w:t>PlayerVariables declarations create values every map can read or set through the Player scope. A map setting with the same name in [Variables] is a different value. Choose Map or Player intentionally when writing a test or setter.</w:t>
+        <w:t>PlayerVariables declarations create values every map in the selected game can read or set through the Player scope. A map setting with the same name in [Variables] is a different value. Choose Map or Player intentionally when writing a test or setter.</w:t>
       </w:r>
     </w:p>
     <w:p>
@@ -15677,7 +17061,7 @@
     </w:p>
     <w:p>
       <w:r>
-        <w:t>A relative Map.N URL is resolved from main-config.txt. A relative MapImage/InteractionImage URL is resolved from the map file. A local image preview base in the editor does not change either one.</w:t>
+        <w:t>A relative Map.N URL is resolved from the configuration containing it: main-config.txt for the legacy main collection, or the selected game-config.txt for a child collection. A relative MapImage/InteractionImage URL is resolved from the map file. A local image preview base in the editor does not change either one.</w:t>
       </w:r>
     </w:p>
     <w:p>
@@ -15796,8 +17180,8 @@
       <w:r>
         <w:drawing>
           <wp:inline xmlns:a="http://schemas.openxmlformats.org/drawingml/2006/main" xmlns:pic="http://schemas.openxmlformats.org/drawingml/2006/picture">
-            <wp:extent cx="6072571" cy="5486399"/>
-            <wp:docPr id="11" name="Picture 11" descr="A playtest running inside Map Studio"/>
+            <wp:extent cx="5146850" cy="5486399"/>
+            <wp:docPr id="13" name="Picture 13" descr="A playtest running inside Map Studio"/>
             <wp:cNvGraphicFramePr>
               <a:graphicFrameLocks noChangeAspect="1"/>
             </wp:cNvGraphicFramePr>
@@ -15809,7 +17193,7 @@
                     <pic:cNvPicPr/>
                   </pic:nvPicPr>
                   <pic:blipFill>
-                    <a:blip r:embed="rId21"/>
+                    <a:blip r:embed="rId23"/>
                     <a:stretch>
                       <a:fillRect/>
                     </a:stretch>
@@ -15817,7 +17201,7 @@
                   <pic:spPr>
                     <a:xfrm>
                       <a:off x="0" y="0"/>
-                      <a:ext cx="6072571" cy="5486399"/>
+                      <a:ext cx="5146850" cy="5486399"/>
                     </a:xfrm>
                     <a:prstGeom prst="rect"/>
                   </pic:spPr>
@@ -16295,12 +17679,12 @@
     </w:p>
     <w:p>
       <w:r>
-        <w:t>The edited map may have a new number that is not yet listed in main-config.txt. It can still start in Test from Start. Other maps reached by transport and foreign-map item definitions must be listed in the master file; the game loads their published files. An unsaved Map 2 open in another editor tab is not shared with this run. On a fresh test, all visited maps begin fresh again.</w:t>
-      </w:r>
-    </w:p>
-    <w:p>
-      <w:r>
-        <w:t>Master styles, player avatar, princess picture, and starting player variables still come from main-config.txt. If the edited map already has a Map.N directory entry, its URL is the base for relative block image paths. Otherwise the base is maps/map-N.txt beside the game, even though no such file is fetched for the edited map. Thus ../assets/tree.png points to the normal shared artwork folder. Absolute HTTP(S) image URLs use their own addresses. New custom artwork must be on the server to appear in the game. Choosing a local image preview or changing the editor’s preview base does not send that artwork to the game.</w:t>
+        <w:t>The edited map may have a new number that is not yet listed in its selected game configuration. It can still start in Test from Start. Other maps reached by transport and foreign-map item definitions must be listed in the selected game’s directory; the game loads their published files. An unsaved Map 2 open in another editor tab is not shared with this run. On a fresh test, all visited maps begin fresh again.</w:t>
+      </w:r>
+    </w:p>
+    <w:p>
+      <w:r>
+        <w:t>Styles, player artwork, ending artwork, the image catalog, and player-variable defaults come from the selected game and its inherited master defaults. If the edited map already has a Map.N directory entry, its URL is the base for relative block image paths. Otherwise the base is map-N.txt in the selected game configuration’s folder (maps/map-N.txt for the legacy main game), even though that nonexistent map file is not fetched. Thus ../assets/tree.png points to the normal shared artwork folder. Absolute HTTP(S) image URLs use their own addresses. New custom artwork must be on the server to appear in the game. Choosing a local image preview or changing the editor’s preview base does not send that artwork to the game.</w:t>
       </w:r>
     </w:p>
     <w:p>

</xml_diff>